<commit_message>
Added references to introduction and initiate the related works section (still working)
</commit_message>
<xml_diff>
--- a/Challenge 3/Challenge3-report.docx
+++ b/Challenge 3/Challenge3-report.docx
@@ -1,6 +1,6 @@
 
 <file path=word/document.xml><?xml version="1.0" encoding="utf-8"?>
-<w:document xmlns:cx="http://schemas.microsoft.com/office/drawing/2014/chartex" xmlns:cx1="http://schemas.microsoft.com/office/drawing/2015/9/8/chartex" xmlns:cx2="http://schemas.microsoft.com/office/drawing/2015/10/21/chartex" xmlns:cx3="http://schemas.microsoft.com/office/drawing/2016/5/9/chartex" xmlns:cx4="http://schemas.microsoft.com/office/drawing/2016/5/10/chartex" xmlns:cx5="http://schemas.microsoft.com/office/drawing/2016/5/11/chartex" xmlns:cx6="http://schemas.microsoft.com/office/drawing/2016/5/12/chartex" xmlns:cx7="http://schemas.microsoft.com/office/drawing/2016/5/13/chartex" xmlns:cx8="http://schemas.microsoft.com/office/drawing/2016/5/14/chartex" xmlns:mc="http://schemas.openxmlformats.org/markup-compatibility/2006" xmlns:aink="http://schemas.microsoft.com/office/drawing/2016/ink" xmlns:am3d="http://schemas.microsoft.com/office/drawing/2017/model3d" xmlns:o="urn:schemas-microsoft-com:office:office" xmlns:oel="http://schemas.microsoft.com/office/2019/extlst" xmlns:r="http://purl.oclc.org/ooxml/officeDocument/relationships" xmlns:m="http://purl.oclc.org/ooxml/officeDocument/math" xmlns:v="urn:schemas-microsoft-com:vml" xmlns:wp14="http://schemas.microsoft.com/office/word/2010/wordprocessingDrawing" xmlns:wp="http://purl.oclc.org/ooxml/drawingml/wordprocessingDrawing" xmlns:w10="urn:schemas-microsoft-com:office:word" xmlns:w="http://purl.oclc.org/ooxml/wordprocessingml/main" xmlns:w14="http://schemas.microsoft.com/office/word/2010/wordml" xmlns:w15="http://schemas.microsoft.com/office/word/2012/wordml" xmlns:w16cex="http://schemas.microsoft.com/office/word/2018/wordml/cex" xmlns:w16cid="http://schemas.microsoft.com/office/word/2016/wordml/cid" xmlns:w16="http://schemas.microsoft.com/office/word/2018/wordml" xmlns:w16du="http://schemas.microsoft.com/office/word/2023/wordml/word16du" xmlns:w16sdtdh="http://schemas.microsoft.com/office/word/2020/wordml/sdtdatahash" xmlns:w16sdtfl="http://schemas.microsoft.com/office/word/2024/wordml/sdtformatlock" xmlns:w16se="http://schemas.microsoft.com/office/word/2015/wordml/symex" xmlns:wpi="http://schemas.microsoft.com/office/word/2010/wordprocessingInk" xmlns:wne="http://schemas.microsoft.com/office/word/2006/wordml" mc:Ignorable="w14 w15 w16se w16cid w16 w16cex w16sdtdh w16sdtfl w16du wne wp14" w:conformance="strict">
+<w:document xmlns:cx="http://schemas.microsoft.com/office/drawing/2014/chartex" xmlns:cx1="http://schemas.microsoft.com/office/drawing/2015/9/8/chartex" xmlns:cx2="http://schemas.microsoft.com/office/drawing/2015/10/21/chartex" xmlns:cx3="http://schemas.microsoft.com/office/drawing/2016/5/9/chartex" xmlns:cx4="http://schemas.microsoft.com/office/drawing/2016/5/10/chartex" xmlns:cx5="http://schemas.microsoft.com/office/drawing/2016/5/11/chartex" xmlns:cx6="http://schemas.microsoft.com/office/drawing/2016/5/12/chartex" xmlns:cx7="http://schemas.microsoft.com/office/drawing/2016/5/13/chartex" xmlns:cx8="http://schemas.microsoft.com/office/drawing/2016/5/14/chartex" xmlns:mc="http://schemas.openxmlformats.org/markup-compatibility/2006" xmlns:aink="http://schemas.microsoft.com/office/drawing/2016/ink" xmlns:am3d="http://schemas.microsoft.com/office/drawing/2017/model3d" xmlns:o="urn:schemas-microsoft-com:office:office" xmlns:oel="http://schemas.microsoft.com/office/2019/extlst" xmlns:r="http://purl.oclc.org/ooxml/officeDocument/relationships" xmlns:m="http://purl.oclc.org/ooxml/officeDocument/math" xmlns:v="urn:schemas-microsoft-com:vml" xmlns:wp14="http://schemas.microsoft.com/office/word/2010/wordprocessingDrawing" xmlns:wp="http://purl.oclc.org/ooxml/drawingml/wordprocessingDrawing" xmlns:w10="urn:schemas-microsoft-com:office:word" xmlns:w="http://purl.oclc.org/ooxml/wordprocessingml/main" xmlns:w14="http://schemas.microsoft.com/office/word/2010/wordml" xmlns:w15="http://schemas.microsoft.com/office/word/2012/wordml" xmlns:w16cex="http://schemas.microsoft.com/office/word/2018/wordml/cex" xmlns:w16cid="http://schemas.microsoft.com/office/word/2016/wordml/cid" xmlns:w16="http://schemas.microsoft.com/office/word/2018/wordml" xmlns:w16du="http://schemas.microsoft.com/office/word/2023/wordml/word16du" xmlns:w16sdtdh="http://schemas.microsoft.com/office/word/2020/wordml/sdtdatahash" xmlns:w16sdtfl="http://schemas.microsoft.com/office/word/2024/wordml/sdtformatlock" xmlns:w16se="http://schemas.microsoft.com/office/word/2015/wordml/symex" xmlns:wpi="http://schemas.microsoft.com/office/word/2010/wordprocessingInk" xmlns:wne="http://schemas.microsoft.com/office/word/2006/wordml" w:conformance="strict" mc:Ignorable="w14 w15 w16se w16cid w16 w16cex w16sdtdh w16sdtfl w16du wne wp14">
   <w:body>
     <w:p>
       <w:pPr>
@@ -85,10 +85,12 @@
           <w:szCs w:val="16"/>
         </w:rPr>
         <w:sectPr>
-          <w:footerReference w:type="first" r:id="rId8"/>
-          <w:pgSz w:w="595.30pt" w:h="841.90pt" w:code="9"/>
+          <w:headerReference w:type="default" r:id="rId8"/>
+          <w:footerReference w:type="default" r:id="rId9"/>
+          <w:footerReference w:type="first" r:id="rId10"/>
+          <w:pgSz w:w="595.3pt" w:h="841.9pt" w:orient="portrait" w:code="9"/>
           <w:pgMar w:top="27pt" w:right="44.65pt" w:bottom="72pt" w:left="44.65pt" w:header="36pt" w:footer="36pt" w:gutter="0pt"/>
-          <w:cols w:space="36pt"/>
+          <w:cols w:space="720"/>
           <w:titlePg/>
           <w:docGrid w:linePitch="360"/>
         </w:sectPr>
@@ -312,6 +314,12 @@
           <w:szCs w:val="18"/>
         </w:rPr>
         <w:br/>
+      </w:r>
+      <w:r>
+        <w:rPr>
+          <w:sz w:val="18"/>
+          <w:szCs w:val="18"/>
+        </w:rPr>
         <w:t xml:space="preserve">line 3: </w:t>
       </w:r>
       <w:r>
@@ -359,6 +367,12 @@
           <w:szCs w:val="18"/>
         </w:rPr>
         <w:br/>
+      </w:r>
+      <w:r>
+        <w:rPr>
+          <w:sz w:val="18"/>
+          <w:szCs w:val="18"/>
+        </w:rPr>
         <w:t>line 5: email address</w:t>
       </w:r>
       <w:r>
@@ -417,6 +431,12 @@
           <w:szCs w:val="18"/>
         </w:rPr>
         <w:br/>
+      </w:r>
+      <w:r>
+        <w:rPr>
+          <w:sz w:val="18"/>
+          <w:szCs w:val="18"/>
+        </w:rPr>
         <w:t xml:space="preserve">line 2: </w:t>
       </w:r>
       <w:r>
@@ -466,6 +486,12 @@
           <w:szCs w:val="18"/>
         </w:rPr>
         <w:br/>
+      </w:r>
+      <w:r>
+        <w:rPr>
+          <w:sz w:val="18"/>
+          <w:szCs w:val="18"/>
+        </w:rPr>
         <w:t xml:space="preserve">line 3: </w:t>
       </w:r>
       <w:r>
@@ -513,6 +539,12 @@
           <w:szCs w:val="18"/>
         </w:rPr>
         <w:br/>
+      </w:r>
+      <w:r>
+        <w:rPr>
+          <w:sz w:val="18"/>
+          <w:szCs w:val="18"/>
+        </w:rPr>
         <w:t>line 5: email address</w:t>
       </w:r>
       <w:r>
@@ -574,6 +606,12 @@
           <w:szCs w:val="18"/>
         </w:rPr>
         <w:br/>
+      </w:r>
+      <w:r>
+        <w:rPr>
+          <w:sz w:val="18"/>
+          <w:szCs w:val="18"/>
+        </w:rPr>
         <w:t xml:space="preserve">line 2: </w:t>
       </w:r>
       <w:r>
@@ -623,6 +661,12 @@
           <w:szCs w:val="18"/>
         </w:rPr>
         <w:br/>
+      </w:r>
+      <w:r>
+        <w:rPr>
+          <w:sz w:val="18"/>
+          <w:szCs w:val="18"/>
+        </w:rPr>
         <w:t xml:space="preserve">line 3: </w:t>
       </w:r>
       <w:r>
@@ -686,6 +730,12 @@
           <w:szCs w:val="18"/>
         </w:rPr>
         <w:br/>
+      </w:r>
+      <w:r>
+        <w:rPr>
+          <w:sz w:val="18"/>
+          <w:szCs w:val="18"/>
+        </w:rPr>
         <w:t>line 5: email address</w:t>
       </w:r>
       <w:r>
@@ -744,6 +794,12 @@
           <w:szCs w:val="18"/>
         </w:rPr>
         <w:br/>
+      </w:r>
+      <w:r>
+        <w:rPr>
+          <w:sz w:val="18"/>
+          <w:szCs w:val="18"/>
+        </w:rPr>
         <w:t xml:space="preserve">line 2: </w:t>
       </w:r>
       <w:r>
@@ -793,6 +849,12 @@
           <w:szCs w:val="18"/>
         </w:rPr>
         <w:br/>
+      </w:r>
+      <w:r>
+        <w:rPr>
+          <w:sz w:val="18"/>
+          <w:szCs w:val="18"/>
+        </w:rPr>
         <w:t xml:space="preserve">line 3: </w:t>
       </w:r>
       <w:r>
@@ -840,6 +902,12 @@
           <w:szCs w:val="18"/>
         </w:rPr>
         <w:br/>
+      </w:r>
+      <w:r>
+        <w:rPr>
+          <w:sz w:val="18"/>
+          <w:szCs w:val="18"/>
+        </w:rPr>
         <w:t>line 5: email address</w:t>
       </w:r>
       <w:r>
@@ -890,6 +958,12 @@
           <w:szCs w:val="18"/>
         </w:rPr>
         <w:br/>
+      </w:r>
+      <w:r>
+        <w:rPr>
+          <w:sz w:val="18"/>
+          <w:szCs w:val="18"/>
+        </w:rPr>
         <w:t xml:space="preserve">line 2: </w:t>
       </w:r>
       <w:r>
@@ -939,6 +1013,12 @@
           <w:szCs w:val="18"/>
         </w:rPr>
         <w:br/>
+      </w:r>
+      <w:r>
+        <w:rPr>
+          <w:sz w:val="18"/>
+          <w:szCs w:val="18"/>
+        </w:rPr>
         <w:t xml:space="preserve">line 3: </w:t>
       </w:r>
       <w:r>
@@ -986,6 +1066,12 @@
           <w:szCs w:val="18"/>
         </w:rPr>
         <w:br/>
+      </w:r>
+      <w:r>
+        <w:rPr>
+          <w:sz w:val="18"/>
+          <w:szCs w:val="18"/>
+        </w:rPr>
         <w:t>line 5: email address</w:t>
       </w:r>
       <w:r>
@@ -1002,10 +1088,12 @@
     <w:p>
       <w:pPr>
         <w:sectPr>
+          <w:headerReference w:type="default" r:id="rId11"/>
+          <w:footerReference w:type="default" r:id="rId12"/>
           <w:type w:val="continuous"/>
-          <w:pgSz w:w="595.30pt" w:h="841.90pt" w:code="9"/>
-          <w:pgMar w:top="22.50pt" w:right="44.65pt" w:bottom="72pt" w:left="44.65pt" w:header="36pt" w:footer="36pt" w:gutter="0pt"/>
-          <w:cols w:num="3" w:space="36pt"/>
+          <w:pgSz w:w="595.3pt" w:h="841.9pt" w:orient="portrait" w:code="9"/>
+          <w:pgMar w:top="22.5pt" w:right="44.65pt" w:bottom="72pt" w:left="44.65pt" w:header="36pt" w:footer="36pt" w:gutter="0pt"/>
+          <w:cols w:space="720" w:num="3"/>
           <w:docGrid w:linePitch="360"/>
         </w:sectPr>
       </w:pPr>
@@ -1013,10 +1101,12 @@
     <w:p>
       <w:pPr>
         <w:sectPr>
+          <w:headerReference w:type="default" r:id="rId13"/>
+          <w:footerReference w:type="default" r:id="rId14"/>
           <w:type w:val="continuous"/>
-          <w:pgSz w:w="595.30pt" w:h="841.90pt" w:code="9"/>
-          <w:pgMar w:top="22.50pt" w:right="44.65pt" w:bottom="72pt" w:left="44.65pt" w:header="36pt" w:footer="36pt" w:gutter="0pt"/>
-          <w:cols w:num="3" w:space="36pt"/>
+          <w:pgSz w:w="595.3pt" w:h="841.9pt" w:orient="portrait" w:code="9"/>
+          <w:pgMar w:top="22.5pt" w:right="44.65pt" w:bottom="72pt" w:left="44.65pt" w:header="36pt" w:footer="36pt" w:gutter="0pt"/>
+          <w:cols w:space="720" w:num="3"/>
           <w:docGrid w:linePitch="360"/>
         </w:sectPr>
       </w:pPr>
@@ -1028,412 +1118,901 @@
       <w:pPr>
         <w:pStyle w:val="Abstract"/>
         <w:rPr>
-          <w:i/>
+          <w:i w:val="1"/>
+          <w:iCs w:val="1"/>
+        </w:rPr>
+      </w:pPr>
+      <w:r>
+        <w:rPr>
+          <w:i w:val="1"/>
+          <w:iCs w:val="1"/>
+        </w:rPr>
+        <w:t>Abstract</w:t>
+      </w:r>
+      <w:r>
+        <w:rPr/>
+        <w:t>—</w:t>
+      </w:r>
+      <w:r>
+        <w:rPr/>
+        <w:t>This electronic document is a “live” template and already defines the components of your paper [title, text, heads, etc.] in its style sheet</w:t>
+      </w:r>
+      <w:r>
+        <w:rPr/>
+        <w:t xml:space="preserve">. </w:t>
+      </w:r>
+      <w:r>
+        <w:rPr/>
+        <w:t xml:space="preserve"> </w:t>
+      </w:r>
+      <w:r>
+        <w:rPr>
+          <w:i w:val="1"/>
+          <w:iCs w:val="1"/>
+        </w:rPr>
+        <w:t>*</w:t>
+      </w:r>
+      <w:r>
+        <w:rPr>
+          <w:i w:val="1"/>
+          <w:iCs w:val="1"/>
+        </w:rPr>
+        <w:t>CRITICAL</w:t>
+      </w:r>
+      <w:r>
+        <w:rPr>
+          <w:i w:val="1"/>
+          <w:iCs w:val="1"/>
+        </w:rPr>
+        <w:t>: Do</w:t>
+      </w:r>
+      <w:r>
+        <w:rPr>
+          <w:rFonts w:eastAsia="Times New Roman"/>
+          <w:i w:val="1"/>
+          <w:iCs w:val="1"/>
+        </w:rPr>
+        <w:t xml:space="preserve"> </w:t>
+      </w:r>
+      <w:r>
+        <w:rPr>
+          <w:i w:val="1"/>
+          <w:iCs w:val="1"/>
+        </w:rPr>
+        <w:t>Not</w:t>
+      </w:r>
+      <w:r>
+        <w:rPr>
+          <w:rFonts w:eastAsia="Times New Roman"/>
+          <w:i w:val="1"/>
+          <w:iCs w:val="1"/>
+        </w:rPr>
+        <w:t xml:space="preserve"> </w:t>
+      </w:r>
+      <w:r>
+        <w:rPr>
+          <w:i w:val="1"/>
+          <w:iCs w:val="1"/>
+        </w:rPr>
+        <w:t>Use</w:t>
+      </w:r>
+      <w:r>
+        <w:rPr>
+          <w:rFonts w:eastAsia="Times New Roman"/>
+          <w:i w:val="1"/>
+          <w:iCs w:val="1"/>
+        </w:rPr>
+        <w:t xml:space="preserve"> </w:t>
+      </w:r>
+      <w:r>
+        <w:rPr>
+          <w:i w:val="1"/>
+          <w:iCs w:val="1"/>
+        </w:rPr>
+        <w:t>Symbols,</w:t>
+      </w:r>
+      <w:r>
+        <w:rPr>
+          <w:rFonts w:eastAsia="Times New Roman"/>
+          <w:i w:val="1"/>
+          <w:iCs w:val="1"/>
+        </w:rPr>
+        <w:t xml:space="preserve"> </w:t>
+      </w:r>
+      <w:r>
+        <w:rPr>
+          <w:i w:val="1"/>
+          <w:iCs w:val="1"/>
+        </w:rPr>
+        <w:t>Special</w:t>
+      </w:r>
+      <w:r>
+        <w:rPr>
+          <w:rFonts w:eastAsia="Times New Roman"/>
+          <w:i w:val="1"/>
+          <w:iCs w:val="1"/>
+        </w:rPr>
+        <w:t xml:space="preserve"> </w:t>
+      </w:r>
+      <w:r>
+        <w:rPr>
+          <w:i w:val="1"/>
+          <w:iCs w:val="1"/>
+        </w:rPr>
+        <w:t>Characters,</w:t>
+      </w:r>
+      <w:r>
+        <w:rPr>
+          <w:rFonts w:eastAsia="Times New Roman"/>
+          <w:i w:val="1"/>
+          <w:iCs w:val="1"/>
+        </w:rPr>
+        <w:t xml:space="preserve"> </w:t>
+      </w:r>
+      <w:r>
+        <w:rPr>
+          <w:rFonts w:eastAsia="Times New Roman"/>
+          <w:i w:val="1"/>
+          <w:iCs w:val="1"/>
+        </w:rPr>
+        <w:t xml:space="preserve">Footnotes, </w:t>
+      </w:r>
+      <w:r>
+        <w:rPr>
+          <w:i w:val="1"/>
+          <w:iCs w:val="1"/>
+        </w:rPr>
+        <w:t>or</w:t>
+      </w:r>
+      <w:r>
+        <w:rPr>
+          <w:rFonts w:eastAsia="Times New Roman"/>
+          <w:i w:val="1"/>
+          <w:iCs w:val="1"/>
+        </w:rPr>
+        <w:t xml:space="preserve"> </w:t>
+      </w:r>
+      <w:r>
+        <w:rPr>
+          <w:i w:val="1"/>
+          <w:iCs w:val="1"/>
+        </w:rPr>
+        <w:t>Math</w:t>
+      </w:r>
+      <w:r>
+        <w:rPr>
+          <w:rFonts w:eastAsia="Times New Roman"/>
+          <w:i w:val="1"/>
+          <w:iCs w:val="1"/>
+        </w:rPr>
+        <w:t xml:space="preserve"> </w:t>
+      </w:r>
+      <w:r>
+        <w:rPr>
+          <w:i w:val="1"/>
+          <w:iCs w:val="1"/>
+        </w:rPr>
+        <w:t>in</w:t>
+      </w:r>
+      <w:r>
+        <w:rPr>
+          <w:rFonts w:eastAsia="Times New Roman"/>
+          <w:i w:val="1"/>
+          <w:iCs w:val="1"/>
+        </w:rPr>
+        <w:t xml:space="preserve"> Paper </w:t>
+      </w:r>
+      <w:r>
+        <w:rPr>
+          <w:i w:val="1"/>
+          <w:iCs w:val="1"/>
+        </w:rPr>
+        <w:t>Title</w:t>
+      </w:r>
+      <w:r>
+        <w:rPr>
+          <w:rFonts w:eastAsia="Times New Roman"/>
+          <w:i w:val="1"/>
+          <w:iCs w:val="1"/>
+        </w:rPr>
+        <w:t xml:space="preserve"> o</w:t>
+      </w:r>
+      <w:r>
+        <w:rPr>
+          <w:i w:val="1"/>
+          <w:iCs w:val="1"/>
+        </w:rPr>
+        <w:t>r</w:t>
+      </w:r>
+      <w:r>
+        <w:rPr>
+          <w:rFonts w:eastAsia="Times New Roman"/>
+          <w:i w:val="1"/>
+          <w:iCs w:val="1"/>
+        </w:rPr>
+        <w:t xml:space="preserve"> </w:t>
+      </w:r>
+      <w:r>
+        <w:rPr>
+          <w:i w:val="1"/>
+          <w:iCs w:val="1"/>
+        </w:rPr>
+        <w:t>Abstract</w:t>
+      </w:r>
+      <w:r>
+        <w:rPr/>
+        <w:t xml:space="preserve">. </w:t>
+      </w:r>
+      <w:r>
+        <w:rPr/>
+        <w:t>(</w:t>
+      </w:r>
+      <w:r>
+        <w:rPr>
+          <w:b w:val="0"/>
+          <w:bCs w:val="0"/>
+          <w:i w:val="1"/>
+          <w:iCs w:val="1"/>
+        </w:rPr>
+        <w:t>Abstract</w:t>
+      </w:r>
+      <w:r>
+        <w:rPr/>
+        <w:t>)</w:t>
+      </w:r>
+    </w:p>
+    <w:p>
+      <w:pPr>
+        <w:pStyle w:val="Keywords"/>
+      </w:pPr>
+      <w:r>
+        <w:t>Keywords—</w:t>
+      </w:r>
+      <w:r>
+        <w:t>component</w:t>
+      </w:r>
+      <w:r>
+        <w:t>,</w:t>
+      </w:r>
+      <w:r>
+        <w:t xml:space="preserve"> formatting</w:t>
+      </w:r>
+      <w:r>
+        <w:t>,</w:t>
+      </w:r>
+      <w:r>
+        <w:t xml:space="preserve"> style</w:t>
+      </w:r>
+      <w:r>
+        <w:t>,</w:t>
+      </w:r>
+      <w:r>
+        <w:t xml:space="preserve"> styling</w:t>
+      </w:r>
+      <w:r>
+        <w:t>,</w:t>
+      </w:r>
+      <w:r>
+        <w:t xml:space="preserve"> insert (</w:t>
+      </w:r>
+      <w:r>
+        <w:rPr>
+          <w:b w:val="0"/>
+        </w:rPr>
+        <w:t>key words</w:t>
+      </w:r>
+      <w:r>
+        <w:t>)</w:t>
+      </w:r>
+    </w:p>
+    <w:p>
+      <w:pPr>
+        <w:pStyle w:val="Heading1"/>
+        <w:rPr/>
+      </w:pPr>
+      <w:r>
+        <w:rPr/>
+        <w:t>Introduction</w:t>
+      </w:r>
+    </w:p>
+    <w:p>
+      <w:pPr>
+        <w:pStyle w:val="BodyText"/>
+        <w:rPr>
+          <w:lang w:val="en-US"/>
+        </w:rPr>
+      </w:pPr>
+      <w:r>
+        <w:rPr>
+          <w:lang w:val="en-US"/>
+        </w:rPr>
+        <w:t xml:space="preserve">The convergence of digital and physical security has </w:t>
+      </w:r>
+      <w:r>
+        <w:rPr>
+          <w:lang w:val="en-US"/>
+        </w:rPr>
+        <w:t>emerged</w:t>
+      </w:r>
+      <w:r>
+        <w:rPr>
+          <w:lang w:val="en-US"/>
+        </w:rPr>
+        <w:t xml:space="preserve"> as a critical challenge in the design of modern protection systems. Traditional security architectures typically treat network intrusion detection and physical access control as independent domains. However, contemporary threats increasingly span both layers, where adversaries may exploit software vulnerabilities to gain initial access and </w:t>
+      </w:r>
+      <w:r>
+        <w:rPr>
+          <w:lang w:val="en-US"/>
+        </w:rPr>
+        <w:t>subsequently</w:t>
+      </w:r>
+      <w:r>
+        <w:rPr>
+          <w:lang w:val="en-US"/>
+        </w:rPr>
+        <w:t xml:space="preserve"> manipulate physical systems such as surveillance infrastructure or access control mechanisms. Addressing this paradigm requires integrated cyber-physical surveillance systems capable of jointly </w:t>
+      </w:r>
+      <w:r>
+        <w:rPr>
+          <w:lang w:val="en-US"/>
+        </w:rPr>
+        <w:t>monitoring</w:t>
+      </w:r>
+      <w:r>
+        <w:rPr>
+          <w:lang w:val="en-US"/>
+        </w:rPr>
+        <w:t xml:space="preserve"> digital host behavior and physical presence within protected environments.</w:t>
+      </w:r>
+    </w:p>
+    <w:p>
+      <w:pPr>
+        <w:pStyle w:val="BodyText"/>
+      </w:pPr>
+      <w:r>
+        <w:rPr>
+          <w:lang w:val="en-US"/>
+        </w:rPr>
+        <w:t xml:space="preserve">This work presents the design, implementation, and evaluation of a unified cyber-physical surveillance system composed of two complementary modules. The first focuses on the digital domain by performing anomaly detection over Windows endpoint logs, aiming to </w:t>
+      </w:r>
+      <w:r>
+        <w:rPr>
+          <w:lang w:val="en-US"/>
+        </w:rPr>
+        <w:t>identify</w:t>
+      </w:r>
+      <w:r>
+        <w:rPr>
+          <w:lang w:val="en-US"/>
+        </w:rPr>
+        <w:t xml:space="preserve"> suspicious or malicious activity within </w:t>
+      </w:r>
+      <w:r>
+        <w:rPr>
+          <w:lang w:val="en-US"/>
+        </w:rPr>
+        <w:t>monitored</w:t>
+      </w:r>
+      <w:r>
+        <w:rPr>
+          <w:lang w:val="en-US"/>
+        </w:rPr>
+        <w:t xml:space="preserve"> systems. The second </w:t>
+      </w:r>
+      <w:r>
+        <w:rPr>
+          <w:lang w:val="en-US"/>
+        </w:rPr>
+        <w:t>operates</w:t>
+      </w:r>
+      <w:r>
+        <w:rPr>
+          <w:lang w:val="en-US"/>
+        </w:rPr>
+        <w:t xml:space="preserve"> in the physical domain through a face recognition pipeline that </w:t>
+      </w:r>
+      <w:r>
+        <w:rPr>
+          <w:lang w:val="en-US"/>
+        </w:rPr>
+        <w:t>identifies</w:t>
+      </w:r>
+      <w:r>
+        <w:rPr>
+          <w:lang w:val="en-US"/>
+        </w:rPr>
+        <w:t xml:space="preserve"> individuals captured by cameras and verifies their authorization status. While these modules </w:t>
+      </w:r>
+      <w:r>
+        <w:rPr>
+          <w:lang w:val="en-US"/>
+        </w:rPr>
+        <w:t>operate</w:t>
+      </w:r>
+      <w:r>
+        <w:rPr>
+          <w:lang w:val="en-US"/>
+        </w:rPr>
+        <w:t xml:space="preserve"> independently, they share a common </w:t>
+      </w:r>
+      <w:r>
+        <w:rPr>
+          <w:lang w:val="en-US"/>
+        </w:rPr>
+        <w:t>objective</w:t>
+      </w:r>
+      <w:r>
+        <w:rPr>
+          <w:lang w:val="en-US"/>
+        </w:rPr>
+        <w:t xml:space="preserve"> of </w:t>
+      </w:r>
+      <w:r>
+        <w:rPr>
+          <w:lang w:val="en-US"/>
+        </w:rPr>
+        <w:t>providing</w:t>
+      </w:r>
+      <w:r>
+        <w:rPr>
+          <w:lang w:val="en-US"/>
+        </w:rPr>
+        <w:t xml:space="preserve"> a holistic view of threats across both cyber and physical dimensions.</w:t>
+      </w:r>
+    </w:p>
+    <w:p>
+      <w:pPr>
+        <w:pStyle w:val="BodyText"/>
+      </w:pPr>
+      <w:r>
+        <w:rPr>
+          <w:lang w:val="en-US"/>
+        </w:rPr>
+        <w:t xml:space="preserve">The digital </w:t>
+      </w:r>
+      <w:r>
+        <w:rPr>
+          <w:lang w:val="en-US"/>
+        </w:rPr>
+        <w:t>component</w:t>
+      </w:r>
+      <w:r>
+        <w:rPr>
+          <w:lang w:val="en-US"/>
+        </w:rPr>
+        <w:t xml:space="preserve"> of this system builds upon recent advances in log-based anomaly detection for Windows environments. Windows telemetry sources such as Event Tracing for Windows (ETW) and Sysmon provide high-fidelity behavioral data, including process creation, network connections, file operations, and registry modifications [9]. These logs form the foundation for many modern detection systems, as </w:t>
+      </w:r>
+      <w:r>
+        <w:rPr>
+          <w:lang w:val="en-US"/>
+        </w:rPr>
+        <w:t>demonstrated</w:t>
+      </w:r>
+      <w:r>
+        <w:rPr>
+          <w:lang w:val="en-US"/>
+        </w:rPr>
+        <w:t xml:space="preserve"> in recent datasets and tools such as LMD-2023 and </w:t>
+      </w:r>
+      <w:r>
+        <w:rPr>
+          <w:lang w:val="en-US"/>
+        </w:rPr>
+        <w:t>AAU_MalData</w:t>
+      </w:r>
+      <w:r>
+        <w:rPr>
+          <w:lang w:val="en-US"/>
+        </w:rPr>
+        <w:t xml:space="preserve"> [1], [7]. However, the volume and complexity of such data pose a significant challenge, as a single host may generate millions of events per day, most of which correspond to benign activity.</w:t>
+      </w:r>
+    </w:p>
+    <w:p>
+      <w:pPr>
+        <w:pStyle w:val="BodyText"/>
+      </w:pPr>
+      <w:r>
+        <w:rPr>
+          <w:lang w:val="en-US"/>
+        </w:rPr>
+        <w:t xml:space="preserve">To address this challenge, prior work has extensively explored machine learning (ML) and deep learning (DL) techniques for anomaly detection. Classical approaches typically rely on structured feature extraction followed by models such as Isolation Forest, Support Vector Machines, or tree-based ensembles. Notably, studies have shown that well-engineered features combined with ensemble methods (e.g., Extra Trees) can achieve near </w:t>
+      </w:r>
+      <w:r>
+        <w:rPr>
+          <w:lang w:val="en-US"/>
+        </w:rPr>
+        <w:t>state-of-the-art</w:t>
+      </w:r>
+      <w:r>
+        <w:rPr>
+          <w:lang w:val="en-US"/>
+        </w:rPr>
+        <w:t xml:space="preserve"> performance, with reported F1 scores above 0.99 in lateral movement detection tasks [1], [2]. In parallel, sequence-based models such as LSTM and CNN–LSTM hybrids have been proposed to capture temporal dependencies in event streams, achieving similarly high performance in ransomware detection scenarios [4], [5].</w:t>
+      </w:r>
+    </w:p>
+    <w:p>
+      <w:pPr>
+        <w:pStyle w:val="BodyText"/>
+      </w:pPr>
+      <w:r>
+        <w:rPr>
+          <w:lang w:val="en-US"/>
+        </w:rPr>
+        <w:t xml:space="preserve">Despite these advances, several limitations </w:t>
+      </w:r>
+      <w:r>
+        <w:rPr>
+          <w:lang w:val="en-US"/>
+        </w:rPr>
+        <w:t>remain</w:t>
+      </w:r>
+      <w:r>
+        <w:rPr>
+          <w:lang w:val="en-US"/>
+        </w:rPr>
+        <w:t>. First, anomaly detection models are inherently statistical and lack semantic interpretability, producing scores that do not directly explain the underlying behavior or map to known attack techniques. Second, most studies rely on controlled datasets, with limited evaluation of concept drift, where normal system behavior evolves over time and degrades model performance [5]. Third, the cost of false positives and the operational burden on analysts are rarely quantified, despite being critical factors in real-world deployments [13]. Additionally, data scarcity and limited availability of public datasets continue to hinder reproducibility and generalization across environments [18].</w:t>
+      </w:r>
+    </w:p>
+    <w:p>
+      <w:pPr>
+        <w:pStyle w:val="BodyText"/>
+      </w:pPr>
+      <w:r>
+        <w:rPr>
+          <w:lang w:val="en-US"/>
+        </w:rPr>
+        <w:t xml:space="preserve">Recent research has begun to explore the use of Large Language Models (LLMs) for cybersecurity tasks, </w:t>
+      </w:r>
+      <w:r>
+        <w:rPr>
+          <w:lang w:val="en-US"/>
+        </w:rPr>
+        <w:t>leveraging</w:t>
+      </w:r>
+      <w:r>
+        <w:rPr>
+          <w:lang w:val="en-US"/>
+        </w:rPr>
+        <w:t xml:space="preserve"> their ability to reason over structured textual data and generate human-readable explanations. Unlike traditional models, LLMs can analyze sequences of events, relate them to known attack patterns such as those defined in the MITRE ATT&amp;CK framework [14], and provide contextualized interpretations of suspicious behavior. However, LLMs are also prone to hallucinations, generating plausible but unsupported claims, which introduces risks in security-critical applications.</w:t>
+      </w:r>
+    </w:p>
+    <w:p>
+      <w:pPr>
+        <w:pStyle w:val="BodyText"/>
+      </w:pPr>
+      <w:r>
+        <w:rPr>
+          <w:lang w:val="en-US"/>
+        </w:rPr>
+        <w:t xml:space="preserve">To mitigate these limitations, this work adopts a Dual LLM architecture in which one model performs initial anomaly assessment while a second model acts as a judge, </w:t>
+      </w:r>
+      <w:r>
+        <w:rPr>
+          <w:lang w:val="en-US"/>
+        </w:rPr>
+        <w:t>validating</w:t>
+      </w:r>
+      <w:r>
+        <w:rPr>
+          <w:lang w:val="en-US"/>
+        </w:rPr>
+        <w:t xml:space="preserve"> the reasoning against observed evidence. This approach aligns with </w:t>
+      </w:r>
+      <w:r>
+        <w:rPr>
+          <w:lang w:val="en-US"/>
+        </w:rPr>
+        <w:t>recent trends</w:t>
+      </w:r>
+      <w:r>
+        <w:rPr>
+          <w:lang w:val="en-US"/>
+        </w:rPr>
+        <w:t xml:space="preserve"> in LLM-as-a-judge frameworks, which improve reliability through cross-validation of model outputs [17]. The system integrates this architecture with classical anomaly detection models, forming a hybrid pipeline that combines statistical detection with semantic reasoning.</w:t>
+      </w:r>
+    </w:p>
+    <w:p>
+      <w:pPr>
+        <w:pStyle w:val="BodyText"/>
+      </w:pPr>
+      <w:r>
+        <w:rPr>
+          <w:lang w:val="en-US"/>
+        </w:rPr>
+        <w:t xml:space="preserve">The proposed system is evaluated using a diverse set of public datasets, including lateral movement (LMD-2023), ransomware detection datasets, and ETW-based traces, complemented by baseline logs collected under normal operating conditions. Evaluation considers both traditional metrics, such as F1-score and false-positive rate, and LLM-specific dimensions, including explanation quality, </w:t>
+      </w:r>
+      <w:r>
+        <w:rPr>
+          <w:lang w:val="en-US"/>
+        </w:rPr>
+        <w:t>evidence</w:t>
+      </w:r>
+      <w:r>
+        <w:rPr>
+          <w:lang w:val="en-US"/>
+        </w:rPr>
+        <w:t xml:space="preserve"> grounding, and hallucination rate.</w:t>
+      </w:r>
+    </w:p>
+    <w:p>
+      <w:pPr>
+        <w:pStyle w:val="BodyText"/>
+      </w:pPr>
+      <w:r>
+        <w:rPr/>
+        <w:t xml:space="preserve"> </w:t>
+      </w:r>
+    </w:p>
+    <w:p>
+      <w:pPr>
+        <w:pStyle w:val="Heading1"/>
+        <w:suppressLineNumbers w:val="0"/>
+        <w:bidi w:val="0"/>
+        <w:spacing w:before="8pt" w:beforeAutospacing="0" w:after="4pt" w:afterAutospacing="0" w:line="12.95pt" w:lineRule="auto"/>
+        <w:ind w:start="0pt" w:end="0pt"/>
+        <w:jc w:val="center"/>
+        <w:rPr/>
+      </w:pPr>
+      <w:r>
+        <w:rPr/>
+        <w:t>Related Work</w:t>
+      </w:r>
+    </w:p>
+    <w:p>
+      <w:pPr>
+        <w:pStyle w:val="BodyText"/>
+        <w:rPr>
+          <w:lang w:val="en-US"/>
+        </w:rPr>
+      </w:pPr>
+      <w:r>
+        <w:rPr>
+          <w:lang w:val="en-US"/>
+        </w:rPr>
+        <w:t xml:space="preserve">The detection of advanced cyber threats, lateral movement, and ransomware operations has undergone a profound and multifaceted methodological evolution over the past half-decade. As sophisticated adversaries increasingly </w:t>
+      </w:r>
+      <w:r>
+        <w:rPr>
+          <w:lang w:val="en-US"/>
+        </w:rPr>
+        <w:t>leverage</w:t>
+      </w:r>
+      <w:r>
+        <w:rPr>
+          <w:lang w:val="en-US"/>
+        </w:rPr>
+        <w:t xml:space="preserve"> "living-off-the-land" (</w:t>
+      </w:r>
+      <w:r>
+        <w:rPr>
+          <w:lang w:val="en-US"/>
+        </w:rPr>
+        <w:t>LotL</w:t>
+      </w:r>
+      <w:r>
+        <w:rPr>
+          <w:lang w:val="en-US"/>
+        </w:rPr>
+        <w:t xml:space="preserve">) techniques, fileless execution, and dynamically encrypted payloads, traditional signature-based intrusion detection systems and static heuristic engines have been </w:t>
+      </w:r>
+      <w:r>
+        <w:rPr>
+          <w:lang w:val="en-US"/>
+        </w:rPr>
+        <w:t>rendered</w:t>
+      </w:r>
+      <w:r>
+        <w:rPr>
+          <w:lang w:val="en-US"/>
+        </w:rPr>
+        <w:t xml:space="preserve"> </w:t>
+      </w:r>
+      <w:r>
+        <w:rPr>
+          <w:lang w:val="en-US"/>
+        </w:rPr>
+        <w:t>largely obsolete</w:t>
+      </w:r>
+      <w:r>
+        <w:rPr>
+          <w:lang w:val="en-US"/>
+        </w:rPr>
+        <w:t xml:space="preserve">. In response, the academic, industrial, and cyber-defense research communities have pursued increasingly complex behavioral modeling paradigms, transitioning from localized statistical analyses to highly contextualized, semantically </w:t>
+      </w:r>
+      <w:bookmarkStart w:name="_Int_FRZdFP4c" w:id="273861561"/>
+      <w:r>
+        <w:rPr>
+          <w:lang w:val="en-US"/>
+        </w:rPr>
+        <w:t>aware</w:t>
+      </w:r>
+      <w:bookmarkEnd w:id="273861561"/>
+      <w:r>
+        <w:rPr>
+          <w:lang w:val="en-US"/>
+        </w:rPr>
+        <w:t xml:space="preserve"> reasoning engines.</w:t>
+      </w:r>
+    </w:p>
+    <w:p>
+      <w:pPr>
+        <w:pStyle w:val="BodyText"/>
+        <w:rPr>
+          <w:lang w:val="en-US"/>
+        </w:rPr>
+      </w:pPr>
+      <w:r>
+        <w:rPr>
+          <w:lang w:val="en-US"/>
+        </w:rPr>
+        <w:t xml:space="preserve">This section provides an exhaustive, chronologically, and thematically structured examination of the literature that underpins modern cybersecurity anomaly detection. </w:t>
+      </w:r>
+      <w:r>
+        <w:rPr>
+          <w:lang w:val="en-US"/>
+        </w:rPr>
+        <w:t>(on work)</w:t>
+      </w:r>
+    </w:p>
+    <w:p>
+      <w:pPr>
+        <w:pStyle w:val="Heading2"/>
+      </w:pPr>
+      <w:r>
+        <w:t xml:space="preserve">Selecting a </w:t>
+      </w:r>
+      <w:r>
+        <w:t>Template</w:t>
+      </w:r>
+      <w:r>
+        <w:t xml:space="preserve"> (Heading 2)</w:t>
+      </w:r>
+    </w:p>
+    <w:p>
+      <w:pPr>
+        <w:pStyle w:val="BodyText"/>
+      </w:pPr>
+      <w:r>
+        <w:t>First</w:t>
+      </w:r>
+    </w:p>
+    <w:p>
+      <w:pPr>
+        <w:pStyle w:val="Heading2"/>
+      </w:pPr>
+      <w:r>
+        <w:t>Maintaining the Integrity of the Specifications</w:t>
+      </w:r>
+    </w:p>
+    <w:p>
+      <w:pPr>
+        <w:pStyle w:val="BodyText"/>
+      </w:pPr>
+      <w:r>
+        <w:t>The</w:t>
+      </w:r>
+    </w:p>
+    <w:p>
+      <w:pPr>
+        <w:pStyle w:val="Heading1"/>
+      </w:pPr>
+      <w:r>
+        <w:t xml:space="preserve">Prepare Your Paper </w:t>
+      </w:r>
+      <w:r>
+        <w:t>Before</w:t>
+      </w:r>
+      <w:r>
+        <w:t xml:space="preserve"> Styling</w:t>
+      </w:r>
+    </w:p>
+    <w:p>
+      <w:pPr>
+        <w:pStyle w:val="BodyText"/>
+        <w:rPr>
+          <w:lang w:val="en-US"/>
+        </w:rPr>
+      </w:pPr>
+      <w:r>
+        <w:t>Before</w:t>
+      </w:r>
+    </w:p>
+    <w:p>
+      <w:pPr>
+        <w:pStyle w:val="BodyText"/>
+      </w:pPr>
+      <w:r>
+        <w:t>Paragraph</w:t>
+      </w:r>
+    </w:p>
+    <w:p>
+      <w:pPr>
+        <w:pStyle w:val="Heading2"/>
+      </w:pPr>
+      <w:r>
+        <w:t>Abbreviations</w:t>
+      </w:r>
+      <w:r>
+        <w:t xml:space="preserve"> and Acronyms</w:t>
+      </w:r>
+    </w:p>
+    <w:p>
+      <w:pPr>
+        <w:pStyle w:val="BodyText"/>
+      </w:pPr>
+      <w:r>
+        <w:t xml:space="preserve">Define </w:t>
+      </w:r>
+    </w:p>
+    <w:p>
+      <w:pPr>
+        <w:pStyle w:val="Heading2"/>
+      </w:pPr>
+      <w:r>
+        <w:t>Units</w:t>
+      </w:r>
+    </w:p>
+    <w:p>
+      <w:pPr>
+        <w:pStyle w:val="bulletlist"/>
+      </w:pPr>
+      <w:r>
+        <w:t xml:space="preserve">Use </w:t>
+      </w:r>
+    </w:p>
+    <w:p>
+      <w:pPr>
+        <w:pStyle w:val="bulletlist"/>
+      </w:pPr>
+      <w:r>
+        <w:t xml:space="preserve">Avoid </w:t>
+      </w:r>
+    </w:p>
+    <w:p>
+      <w:pPr>
+        <w:pStyle w:val="bulletlist"/>
+      </w:pPr>
+      <w:r>
+        <w:t xml:space="preserve">Do </w:t>
+      </w:r>
+    </w:p>
+    <w:p>
+      <w:pPr>
+        <w:pStyle w:val="sponsors"/>
+        <w:framePr w:wrap="auto" w:hAnchor="page" w:vAnchor="page" w:x="45.90pt" w:y="756.05pt"/>
+        <w:ind w:firstLine="14.45pt"/>
+      </w:pPr>
+      <w:r>
+        <w:t>Identif</w:t>
+      </w:r>
+      <w:r>
+        <w:t xml:space="preserve">y applicable </w:t>
+      </w:r>
+      <w:r>
+        <w:t>funding agency</w:t>
+      </w:r>
+      <w:r>
+        <w:t xml:space="preserve"> here. </w:t>
+      </w:r>
+      <w:r>
+        <w:rPr>
           <w:iCs/>
         </w:rPr>
-      </w:pPr>
-      <w:r>
-        <w:rPr>
-          <w:i/>
+        <w:t>If none, delete this text box</w:t>
+      </w:r>
+      <w:r>
+        <w:rPr>
           <w:iCs/>
         </w:rPr>
-        <w:t>Abstract</w:t>
-      </w:r>
-      <w:r>
-        <w:t>—</w:t>
-      </w:r>
-      <w:r>
-        <w:t xml:space="preserve">This electronic document is a “live” template and already defines the components of your paper [title, text, heads, etc.] in its style sheet. </w:t>
-      </w:r>
-      <w:r>
-        <w:t xml:space="preserve"> </w:t>
-      </w:r>
-      <w:r>
-        <w:rPr>
-          <w:i/>
-        </w:rPr>
-        <w:t>*</w:t>
-      </w:r>
-      <w:r>
-        <w:rPr>
-          <w:i/>
-        </w:rPr>
-        <w:t>CRITICAL:  Do</w:t>
-      </w:r>
-      <w:r>
-        <w:rPr>
-          <w:rFonts w:eastAsia="Times New Roman"/>
-          <w:i/>
-        </w:rPr>
-        <w:t xml:space="preserve"> </w:t>
-      </w:r>
-      <w:r>
-        <w:rPr>
-          <w:i/>
-        </w:rPr>
-        <w:t>Not</w:t>
-      </w:r>
-      <w:r>
-        <w:rPr>
-          <w:rFonts w:eastAsia="Times New Roman"/>
-          <w:i/>
-        </w:rPr>
-        <w:t xml:space="preserve"> </w:t>
-      </w:r>
-      <w:r>
-        <w:rPr>
-          <w:i/>
-        </w:rPr>
-        <w:t>Use</w:t>
-      </w:r>
-      <w:r>
-        <w:rPr>
-          <w:rFonts w:eastAsia="Times New Roman"/>
-          <w:i/>
-        </w:rPr>
-        <w:t xml:space="preserve"> </w:t>
-      </w:r>
-      <w:r>
-        <w:rPr>
-          <w:i/>
-        </w:rPr>
-        <w:t>Symbols,</w:t>
-      </w:r>
-      <w:r>
-        <w:rPr>
-          <w:rFonts w:eastAsia="Times New Roman"/>
-          <w:i/>
-        </w:rPr>
-        <w:t xml:space="preserve"> </w:t>
-      </w:r>
-      <w:r>
-        <w:rPr>
-          <w:i/>
-        </w:rPr>
-        <w:t>Special</w:t>
-      </w:r>
-      <w:r>
-        <w:rPr>
-          <w:rFonts w:eastAsia="Times New Roman"/>
-          <w:i/>
-        </w:rPr>
-        <w:t xml:space="preserve"> </w:t>
-      </w:r>
-      <w:r>
-        <w:rPr>
-          <w:i/>
-        </w:rPr>
-        <w:t>Characters,</w:t>
-      </w:r>
-      <w:r>
-        <w:rPr>
-          <w:rFonts w:eastAsia="Times New Roman"/>
-          <w:i/>
-        </w:rPr>
-        <w:t xml:space="preserve"> </w:t>
-      </w:r>
-      <w:r>
-        <w:rPr>
-          <w:rFonts w:eastAsia="Times New Roman"/>
-          <w:i/>
-        </w:rPr>
-        <w:t xml:space="preserve">Footnotes, </w:t>
-      </w:r>
-      <w:r>
-        <w:rPr>
-          <w:i/>
-        </w:rPr>
-        <w:t>or</w:t>
-      </w:r>
-      <w:r>
-        <w:rPr>
-          <w:rFonts w:eastAsia="Times New Roman"/>
-          <w:i/>
-        </w:rPr>
-        <w:t xml:space="preserve"> </w:t>
-      </w:r>
-      <w:r>
-        <w:rPr>
-          <w:i/>
-        </w:rPr>
-        <w:t>Math</w:t>
-      </w:r>
-      <w:r>
-        <w:rPr>
-          <w:rFonts w:eastAsia="Times New Roman"/>
-          <w:i/>
-        </w:rPr>
-        <w:t xml:space="preserve"> </w:t>
-      </w:r>
-      <w:r>
-        <w:rPr>
-          <w:i/>
-        </w:rPr>
-        <w:t>in</w:t>
-      </w:r>
-      <w:r>
-        <w:rPr>
-          <w:rFonts w:eastAsia="Times New Roman"/>
-          <w:i/>
-        </w:rPr>
-        <w:t xml:space="preserve"> Paper </w:t>
-      </w:r>
-      <w:r>
-        <w:rPr>
-          <w:i/>
-        </w:rPr>
-        <w:t>Title</w:t>
-      </w:r>
-      <w:r>
-        <w:rPr>
-          <w:rFonts w:eastAsia="Times New Roman"/>
-          <w:i/>
-        </w:rPr>
-        <w:t xml:space="preserve"> o</w:t>
-      </w:r>
-      <w:r>
-        <w:rPr>
-          <w:i/>
-        </w:rPr>
-        <w:t>r</w:t>
-      </w:r>
-      <w:r>
-        <w:rPr>
-          <w:rFonts w:eastAsia="Times New Roman"/>
-          <w:i/>
-        </w:rPr>
-        <w:t xml:space="preserve"> </w:t>
-      </w:r>
-      <w:r>
-        <w:rPr>
-          <w:i/>
-        </w:rPr>
-        <w:t>Abstract</w:t>
-      </w:r>
-      <w:r>
-        <w:t xml:space="preserve">. </w:t>
-      </w:r>
-      <w:r>
-        <w:rPr>
-          <w:iCs/>
-        </w:rPr>
-        <w:t>(</w:t>
-      </w:r>
-      <w:r>
-        <w:rPr>
-          <w:b w:val="0"/>
-          <w:i/>
-          <w:iCs/>
-        </w:rPr>
-        <w:t>Abstract</w:t>
-      </w:r>
-      <w:r>
-        <w:rPr>
-          <w:iCs/>
-        </w:rPr>
-        <w:t>)</w:t>
-      </w:r>
-    </w:p>
-    <w:p>
-      <w:pPr>
-        <w:pStyle w:val="Keywords"/>
-      </w:pPr>
-      <w:r>
-        <w:t>Keywords—</w:t>
-      </w:r>
-      <w:r>
-        <w:t>component</w:t>
-      </w:r>
-      <w:r>
-        <w:t>,</w:t>
-      </w:r>
-      <w:r>
-        <w:t xml:space="preserve"> formatting</w:t>
-      </w:r>
-      <w:r>
-        <w:t>,</w:t>
-      </w:r>
-      <w:r>
-        <w:t xml:space="preserve"> style</w:t>
-      </w:r>
-      <w:r>
-        <w:t>,</w:t>
-      </w:r>
-      <w:r>
-        <w:t xml:space="preserve"> styling</w:t>
-      </w:r>
-      <w:r>
-        <w:t>,</w:t>
-      </w:r>
-      <w:r>
-        <w:t xml:space="preserve"> insert (</w:t>
-      </w:r>
-      <w:r>
-        <w:rPr>
-          <w:b w:val="0"/>
-        </w:rPr>
-        <w:t>key words</w:t>
-      </w:r>
-      <w:r>
-        <w:t>)</w:t>
-      </w:r>
-    </w:p>
-    <w:p>
-      <w:pPr>
-        <w:pStyle w:val="Heading1"/>
-      </w:pPr>
-      <w:r>
-        <w:t>Introduction</w:t>
-      </w:r>
-    </w:p>
-    <w:p>
-      <w:pPr>
-        <w:pStyle w:val="BodyText"/>
-      </w:pPr>
-      <w:r>
-        <w:t>The convergence of digital and physical security has become a defining challenge in the design of modern protective systems. Whereas traditional security architectures treated network-level intrusion detection and physical access control as separate domains, contemporary threats increasingly span both planes: an adversary may exploit a software vulnerability to gain a foothold on an internal network and subsequently use that access to disable physical access controls, manipulate surveillance infrastructure, or exfiltrate data tied to physical operations. Addressing this convergence requires integrated cyber-physical surveillance systems capable of monitoring both the digital behavior of hosts on a network and the physical presence of individuals within a protected environment.</w:t>
-      </w:r>
-      <w:r>
-        <w:t xml:space="preserve"> </w:t>
-      </w:r>
-      <w:r>
-        <w:t>This paper documents the design, implementation, and evaluation of a cyber-physical surveillance system developed as a master's project, integrating two complementary modules into a unified security architecture. The first module addresses the digital layer performing automated anomaly detection on Windows endpoint logs, with the goal of identifying suspicious or malicious activity on the hosts of a monitored digital infrastructure. The second module addresses the physical layer by implementing a face recognition pipeline that identifies individuals captured by cameras and verifies whether they belong to a recognized group of authorized personnel, flagging those who cannot be matched as unauthorized and triggering an appropriate response. Although each module operates independently, they share a common security objective and together provide a unified view of threats across both the digital and physical dimensions of the protected environment.</w:t>
-      </w:r>
-    </w:p>
-    <w:p>
-      <w:pPr>
-        <w:pStyle w:val="BodyText"/>
-      </w:pPr>
-      <w:r>
-        <w:t xml:space="preserve">Regarding the first component, we investigate and compare two fundamentally different paradigms for log-based anomaly detection. The first is a classical pipeline combining engineered features, traditional Machine Learning and Deep Learning (DL) models, where statistical anomaly scorers such as Isolation Forest operate on aggregated window-level features drawn from Windows System Monitor (Sysmon) and Event Tracing for Windows (ETW) logs and sequence models such as Gated Recurrent Units (GRUs), capture temporal dependencies within process sessions. The second is a Dual Large Language Model (LLM) architecture, where one LLM instance receives raw Sysmon log sequences directly and determines whether the observed activity is anomalous, and a second LLM instance acts as an LLM-as-a-judge, verifying whether the sequences flagged by the first model genuinely correspond to a known attack vector. The central research question is how these two paradigms compare across dimensions of detection performance, explanation quality, and practical </w:t>
-      </w:r>
-      <w:proofErr w:type="spellStart"/>
-      <w:r>
-        <w:t>deployability</w:t>
-      </w:r>
-      <w:proofErr w:type="spellEnd"/>
-      <w:r>
         <w:t>.</w:t>
       </w:r>
     </w:p>
     <w:p>
       <w:pPr>
-        <w:pStyle w:val="BodyText"/>
-        <w:ind w:firstLine="0pt"/>
-      </w:pPr>
-      <w:r>
-        <w:tab/>
-      </w:r>
-      <w:r>
-        <w:t>Windows endpoint logs was chosen due to the prevalence of Windows in enterprise and institutional environments and the tools available for its telemetry infrastructure. At the foundation of this infrastructure sits Event Tracing for Windows (ETW), a high-performance kernel-level logging mechanism built directly into the operating system. ETW exposes a wide range of providers that emit structured events covering system calls, hardware performance counters, network activity, file I/O, and process lifecycle events, among others, making it the most comprehensive source of behavioral data available on a Windows host</w:t>
-      </w:r>
-      <w:r>
-        <w:t xml:space="preserve"> REF AQUI</w:t>
-      </w:r>
-      <w:r>
-        <w:t xml:space="preserve">. Building on top of ETW, Microsoft </w:t>
-      </w:r>
-      <w:proofErr w:type="spellStart"/>
-      <w:r>
-        <w:t>Sysinternals</w:t>
-      </w:r>
-      <w:proofErr w:type="spellEnd"/>
-      <w:r>
-        <w:t xml:space="preserve">' System Monitor (Sysmon) provides a more accessible and security-oriented telemetry layer by instrumenting the Windows kernel to emit detailed structured events covering process creation and termination, network connections, file system operations, registry modifications, driver loads, and inter-process interactions, presenting them in a normalized format well-suited to downstream analysis </w:t>
-      </w:r>
-      <w:r>
-        <w:t>REF AQUI</w:t>
-      </w:r>
-      <w:r>
-        <w:t xml:space="preserve">. Together, these two sources provide a high-fidelity behavioral record of host activity. This richness comes at a cost, however, as a single active workstation may generate several million events per day, the vast majority of which reflect entirely benign operations. The core challenge of host-based anomaly detection is therefore one of signal extraction, where given a high-volume, high-dimensional and largely </w:t>
-      </w:r>
-      <w:proofErr w:type="spellStart"/>
-      <w:r>
-        <w:t>unlabelled</w:t>
-      </w:r>
-      <w:proofErr w:type="spellEnd"/>
-      <w:r>
-        <w:t xml:space="preserve"> event stream, how can an automated system reliably distinguish the small subset of genuinely anomalous behavior from the ambient noise of normal operations?</w:t>
-      </w:r>
-    </w:p>
-    <w:p>
-      <w:pPr>
-        <w:pStyle w:val="BodyText"/>
-      </w:pPr>
-    </w:p>
-    <w:p>
-      <w:pPr>
-        <w:pStyle w:val="BodyText"/>
-      </w:pPr>
-      <w:r>
-        <w:t xml:space="preserve">The application of machine learning and deep learning to log-based intrusion detection has emerged as a principled complement to rule-based approaches. Supervised classifiers can learn behavioral boundaries from labeled training data, offering generalization beyond fixed signatures. One-class and anomaly detection models trained exclusively on normal activity, such as Isolation Forest </w:t>
-      </w:r>
-      <w:r>
-        <w:t>REF AQUI</w:t>
-      </w:r>
-      <w:r>
-        <w:t>, One-Class SVM, and autoencoders, are especially well-suited to the operational reality of endpoint security, where labeled attack samples are scarce and the variety of adversarial behavior is unpredictable by design. Sequence models, including Long Short-Term Memory (LSTM) networks and Transformer architectures, can capture temporal dependencies within event streams, enabling detection of multi-step attack chains that no individual event would flag in isolation.</w:t>
-      </w:r>
-    </w:p>
-    <w:p>
-      <w:pPr>
-        <w:pStyle w:val="BodyText"/>
-      </w:pPr>
-      <w:r>
-        <w:t xml:space="preserve">Despite these advances, several fundamental limitations persist across the classical ML and DL literature. Anomaly scoring is, by construction, agnostic to semantic meaning: a high anomaly score indicates statistical deviation from the training distribution but provides no direct account of what the deviation represents, which ATT&amp;CK technique it may correspond to, or why it should be investigated with urgency. Translating a numerical score into actionable threat intelligence requires substantial analyst effort, creating a bottleneck that reduces much of the efficiency gain from automated detection </w:t>
-      </w:r>
-      <w:r>
-        <w:t>REF AQUI</w:t>
-      </w:r>
-      <w:r>
-        <w:t xml:space="preserve">. Additionally, very few works rigorously evaluate concept drift, where the statistical properties of normal behavior gradually change over time as software, user habits, and configurations evolve, which causes alert fatigue and model degradation in production deployments </w:t>
-      </w:r>
-      <w:r>
-        <w:t>REF AQUI</w:t>
-      </w:r>
-      <w:r>
-        <w:t>.</w:t>
-      </w:r>
-    </w:p>
-    <w:p>
-      <w:pPr>
-        <w:pStyle w:val="BodyText"/>
-      </w:pPr>
-      <w:r>
-        <w:t xml:space="preserve">The emergence of Large Language Models (LLMs) capable of open-ended reasoning over structured text opens a new avenue for addressing the semantic gap that classical approaches leave unresolved. An LLM with sufficient context can examine a window of Sysmon events, relate them to known ATT&amp;CK techniques, identify corroborating or contradictory evidence within the window, and produce a coherent natural-language explanation of its assessment, approximating the reasoning process of a skilled threat analyst at scale. Recent empirical work in adjacent domains has suggested that frontier LLMs exhibit meaningful capability for cybersecurity reasoning tasks, including vulnerability explanation, malware attribution, and procedure-to-technique mapping </w:t>
-      </w:r>
-      <w:r>
-        <w:t>REF AQUI</w:t>
-      </w:r>
-      <w:r>
-        <w:t>. LLMs, however, also exhibit well-documented tendencies toward hallucination, where they generate plausible-sounding but factually unsupported claims. This property is particularly dangerous in a security context, as false attributions can misdirect investigations or create unwarranted confidence. The Dual LLM architecture adopted in this work addresses this risk by introducing a second model as a judge, so that all analyst claims must be grounded in evidence present within the submitted event window.</w:t>
-      </w:r>
-    </w:p>
-    <w:p>
-      <w:pPr>
-        <w:pStyle w:val="BodyText"/>
-      </w:pPr>
-      <w:r>
-        <w:t>The two pipelines are evaluated against a curated set of public Windows endpoint datasets spanning lateral movement (LMD-2023), ransomware (SILRAD), APT simulation (Splunk Attack Data, OTRF Security-Datasets), and kernel-level activity (Kellect4APT), complemented by the author's personal baseline logs collected under normal operating conditions to calibrate anomaly thresholds and reduce false-positive rates. Evaluation spans both classical metrics, including AUC, F1, and false-positive rate, and LLM-specific metrics including technique identification correctness, evidence-grounding score as assessed by the judge model, and hallucination rate under adversarial prompt conditions.</w:t>
-      </w:r>
-    </w:p>
-    <w:p>
-      <w:pPr>
-        <w:pStyle w:val="BodyText"/>
-      </w:pPr>
-      <w:r>
-        <w:t>The remainder of this paper is organized as follows. Section 2 surveys the relevant literature, covering Sysmon- and ETW-based detection approaches, provenance graph methods, and the emerging application of LLMs to cybersecurity tasks. Section 3 describes the threat model and datasets. Section 4 presents the architecture of both the classical and Dual LLM pipelines in detail. Section 5 reports experimental results and a comparative analysis of the two approaches. Section 6 discusses implications, limitations, and directions for future work. Section 7 concludes.</w:t>
-      </w:r>
-      <w:r>
-        <w:t xml:space="preserve"> </w:t>
-      </w:r>
-    </w:p>
-    <w:p>
-      <w:pPr>
-        <w:pStyle w:val="Heading1"/>
-      </w:pPr>
-      <w:r>
-        <w:t>Ease of Use</w:t>
+        <w:pStyle w:val="bulletlist"/>
+      </w:pPr>
+      <w:r>
+        <w:t xml:space="preserve">Use </w:t>
       </w:r>
     </w:p>
     <w:p>
@@ -1441,168 +2020,6 @@
         <w:pStyle w:val="Heading2"/>
       </w:pPr>
       <w:r>
-        <w:t xml:space="preserve">Selecting a </w:t>
-      </w:r>
-      <w:r>
-        <w:t>Template</w:t>
-      </w:r>
-      <w:r>
-        <w:t xml:space="preserve"> (Heading 2)</w:t>
-      </w:r>
-    </w:p>
-    <w:p>
-      <w:pPr>
-        <w:pStyle w:val="BodyText"/>
-      </w:pPr>
-      <w:r>
-        <w:t>First</w:t>
-      </w:r>
-    </w:p>
-    <w:p>
-      <w:pPr>
-        <w:pStyle w:val="Heading2"/>
-      </w:pPr>
-      <w:r>
-        <w:t>Maintaining the Integrity of the Specifications</w:t>
-      </w:r>
-    </w:p>
-    <w:p>
-      <w:pPr>
-        <w:pStyle w:val="BodyText"/>
-      </w:pPr>
-      <w:r>
-        <w:t>The</w:t>
-      </w:r>
-    </w:p>
-    <w:p>
-      <w:pPr>
-        <w:pStyle w:val="Heading1"/>
-      </w:pPr>
-      <w:r>
-        <w:t xml:space="preserve">Prepare Your Paper </w:t>
-      </w:r>
-      <w:r>
-        <w:t>Before</w:t>
-      </w:r>
-      <w:r>
-        <w:t xml:space="preserve"> Styling</w:t>
-      </w:r>
-    </w:p>
-    <w:p>
-      <w:pPr>
-        <w:pStyle w:val="BodyText"/>
-        <w:rPr>
-          <w:lang w:val="en-US"/>
-        </w:rPr>
-      </w:pPr>
-      <w:r>
-        <w:t>Before</w:t>
-      </w:r>
-    </w:p>
-    <w:p>
-      <w:pPr>
-        <w:pStyle w:val="BodyText"/>
-      </w:pPr>
-      <w:r>
-        <w:t>Paragraph</w:t>
-      </w:r>
-    </w:p>
-    <w:p>
-      <w:pPr>
-        <w:pStyle w:val="Heading2"/>
-      </w:pPr>
-      <w:r>
-        <w:t>Abbreviations</w:t>
-      </w:r>
-      <w:r>
-        <w:t xml:space="preserve"> and Acronyms</w:t>
-      </w:r>
-    </w:p>
-    <w:p>
-      <w:pPr>
-        <w:pStyle w:val="BodyText"/>
-      </w:pPr>
-      <w:r>
-        <w:t xml:space="preserve">Define </w:t>
-      </w:r>
-    </w:p>
-    <w:p>
-      <w:pPr>
-        <w:pStyle w:val="Heading2"/>
-      </w:pPr>
-      <w:r>
-        <w:t>Units</w:t>
-      </w:r>
-    </w:p>
-    <w:p>
-      <w:pPr>
-        <w:pStyle w:val="bulletlist"/>
-      </w:pPr>
-      <w:r>
-        <w:t xml:space="preserve">Use </w:t>
-      </w:r>
-    </w:p>
-    <w:p>
-      <w:pPr>
-        <w:pStyle w:val="bulletlist"/>
-      </w:pPr>
-      <w:r>
-        <w:t xml:space="preserve">Avoid </w:t>
-      </w:r>
-    </w:p>
-    <w:p>
-      <w:pPr>
-        <w:pStyle w:val="bulletlist"/>
-      </w:pPr>
-      <w:r>
-        <w:t xml:space="preserve">Do </w:t>
-      </w:r>
-    </w:p>
-    <w:p>
-      <w:pPr>
-        <w:pStyle w:val="sponsors"/>
-        <w:framePr w:wrap="auto" w:vAnchor="page" w:hAnchor="page" w:x="45.90pt" w:y="756.05pt"/>
-        <w:ind w:firstLine="14.45pt"/>
-      </w:pPr>
-      <w:r>
-        <w:t>Identif</w:t>
-      </w:r>
-      <w:r>
-        <w:t xml:space="preserve">y applicable </w:t>
-      </w:r>
-      <w:r>
-        <w:t>funding agency</w:t>
-      </w:r>
-      <w:r>
-        <w:t xml:space="preserve"> here. </w:t>
-      </w:r>
-      <w:r>
-        <w:rPr>
-          <w:iCs/>
-        </w:rPr>
-        <w:t>If none, delete this text box</w:t>
-      </w:r>
-      <w:r>
-        <w:rPr>
-          <w:iCs/>
-        </w:rPr>
-        <w:t>.</w:t>
-      </w:r>
-    </w:p>
-    <w:p>
-      <w:pPr>
-        <w:pStyle w:val="bulletlist"/>
-      </w:pPr>
-      <w:r>
-        <w:t xml:space="preserve">Use </w:t>
-      </w:r>
-    </w:p>
-    <w:p>
-      <w:pPr>
-        <w:pStyle w:val="Heading2"/>
-      </w:pPr>
-      <w:r>
-        <w:lastRenderedPageBreak/>
         <w:t>Equations</w:t>
       </w:r>
     </w:p>
@@ -1959,12 +2376,12 @@
         <w:tblW w:w="0pt" w:type="dxa"/>
         <w:jc w:val="center"/>
         <w:tblBorders>
-          <w:top w:val="single" w:sz="2" w:space="0" w:color="auto"/>
-          <w:start w:val="single" w:sz="2" w:space="0" w:color="auto"/>
-          <w:bottom w:val="single" w:sz="2" w:space="0" w:color="auto"/>
-          <w:end w:val="single" w:sz="2" w:space="0" w:color="auto"/>
-          <w:insideH w:val="single" w:sz="2" w:space="0" w:color="auto"/>
-          <w:insideV w:val="single" w:sz="2" w:space="0" w:color="auto"/>
+          <w:top w:val="single" w:color="auto" w:sz="2" w:space="0"/>
+          <w:start w:val="single" w:color="auto" w:sz="2" w:space="0"/>
+          <w:bottom w:val="single" w:color="auto" w:sz="2" w:space="0"/>
+          <w:end w:val="single" w:color="auto" w:sz="2" w:space="0"/>
+          <w:insideH w:val="single" w:color="auto" w:sz="2" w:space="0"/>
+          <w:insideV w:val="single" w:color="auto" w:sz="2" w:space="0"/>
         </w:tblBorders>
         <w:tblLayout w:type="fixed"/>
         <w:tblLook w:firstRow="0" w:lastRow="0" w:firstColumn="0" w:lastColumn="0" w:noHBand="0" w:noVBand="0"/>
@@ -2272,7 +2689,6 @@
         <w:pStyle w:val="Heading5"/>
       </w:pPr>
       <w:r>
-        <w:lastRenderedPageBreak/>
         <w:t>References</w:t>
       </w:r>
     </w:p>
@@ -2280,18 +2696,1121 @@
     <w:p>
       <w:pPr>
         <w:pStyle w:val="references"/>
-        <w:autoSpaceDE w:val="0"/>
-        <w:autoSpaceDN w:val="0"/>
-        <w:adjustRightInd w:val="0"/>
-        <w:ind w:start="17.70pt" w:hanging="17.70pt"/>
+        <w:ind w:start="17.7pt" w:hanging="0pt"/>
         <w:jc w:val="start"/>
-      </w:pPr>
+        <w:rPr>
+          <w:rFonts w:ascii="Times New Roman" w:hAnsi="Times New Roman" w:eastAsia="MS Mincho" w:cs="Times New Roman"/>
+          <w:sz w:val="16"/>
+          <w:szCs w:val="16"/>
+        </w:rPr>
+      </w:pPr>
+      <w:r>
+        <w:rPr>
+          <w:rFonts w:ascii="Times New Roman" w:hAnsi="Times New Roman" w:eastAsia="MS Mincho" w:cs="Times New Roman"/>
+          <w:noProof/>
+          <w:color w:val="000000" w:themeColor="text1" w:themeTint="FF" w:themeShade="FF"/>
+          <w:sz w:val="16"/>
+          <w:szCs w:val="16"/>
+          <w:lang w:val="en-US"/>
+        </w:rPr>
+        <w:t xml:space="preserve">C. Smiliotopoulos and G. Kambourakis, “Sysmon event logs for machine learning-based malware detection,” </w:t>
+      </w:r>
+      <w:r>
+        <w:rPr>
+          <w:rFonts w:ascii="Times New Roman" w:hAnsi="Times New Roman" w:eastAsia="MS Mincho" w:cs="Times New Roman"/>
+          <w:i w:val="1"/>
+          <w:iCs w:val="1"/>
+          <w:noProof/>
+          <w:color w:val="000000" w:themeColor="text1" w:themeTint="FF" w:themeShade="FF"/>
+          <w:sz w:val="16"/>
+          <w:szCs w:val="16"/>
+          <w:lang w:val="en-US"/>
+        </w:rPr>
+        <w:t>International Journal of Information Security</w:t>
+      </w:r>
+      <w:r>
+        <w:rPr>
+          <w:rFonts w:ascii="Times New Roman" w:hAnsi="Times New Roman" w:eastAsia="MS Mincho" w:cs="Times New Roman"/>
+          <w:noProof/>
+          <w:color w:val="000000" w:themeColor="text1" w:themeTint="FF" w:themeShade="FF"/>
+          <w:sz w:val="16"/>
+          <w:szCs w:val="16"/>
+          <w:lang w:val="en-US"/>
+        </w:rPr>
+        <w:t xml:space="preserve">, vol. 22, no. 7, pp. 1–16, 2023. </w:t>
+      </w:r>
+      <w:hyperlink r:id="Ra605d71a92f44f8a">
+        <w:r>
+          <w:rPr>
+            <w:rStyle w:val="Hyperlink"/>
+            <w:rFonts w:ascii="Times New Roman" w:hAnsi="Times New Roman" w:eastAsia="MS Mincho" w:cs="Times New Roman"/>
+            <w:noProof/>
+            <w:color w:val="000000" w:themeColor="text1" w:themeTint="FF" w:themeShade="FF"/>
+            <w:sz w:val="16"/>
+            <w:szCs w:val="16"/>
+            <w:lang w:val="en-US"/>
+          </w:rPr>
+          <w:t>https://doi.org/10.1007/s10207-023-00725-8</w:t>
+        </w:r>
+      </w:hyperlink>
+    </w:p>
+    <w:p>
+      <w:pPr>
+        <w:pStyle w:val="references"/>
+        <w:jc w:val="start"/>
+        <w:rPr>
+          <w:rFonts w:ascii="Times New Roman" w:hAnsi="Times New Roman" w:eastAsia="MS Mincho" w:cs="Times New Roman"/>
+          <w:sz w:val="16"/>
+          <w:szCs w:val="16"/>
+        </w:rPr>
+      </w:pPr>
+      <w:r>
+        <w:rPr>
+          <w:rFonts w:ascii="Times New Roman" w:hAnsi="Times New Roman" w:eastAsia="MS Mincho" w:cs="Times New Roman"/>
+          <w:noProof/>
+          <w:color w:val="000000" w:themeColor="text1" w:themeTint="FF" w:themeShade="FF"/>
+          <w:sz w:val="16"/>
+          <w:szCs w:val="16"/>
+          <w:lang w:val="en-US"/>
+        </w:rPr>
+        <w:t xml:space="preserve">C. Smiliotopoulos and G. Kambourakis, “Machine Learning for Lateral Movement Detection: Imbalanced vs Resampled Data,” </w:t>
+      </w:r>
+      <w:r>
+        <w:rPr>
+          <w:rFonts w:ascii="Times New Roman" w:hAnsi="Times New Roman" w:eastAsia="MS Mincho" w:cs="Times New Roman"/>
+          <w:i w:val="1"/>
+          <w:iCs w:val="1"/>
+          <w:noProof/>
+          <w:color w:val="000000" w:themeColor="text1" w:themeTint="FF" w:themeShade="FF"/>
+          <w:sz w:val="16"/>
+          <w:szCs w:val="16"/>
+          <w:lang w:val="en-US"/>
+        </w:rPr>
+        <w:t>International Journal of Information Security</w:t>
+      </w:r>
+      <w:r>
+        <w:rPr>
+          <w:rFonts w:ascii="Times New Roman" w:hAnsi="Times New Roman" w:eastAsia="MS Mincho" w:cs="Times New Roman"/>
+          <w:noProof/>
+          <w:color w:val="000000" w:themeColor="text1" w:themeTint="FF" w:themeShade="FF"/>
+          <w:sz w:val="16"/>
+          <w:szCs w:val="16"/>
+          <w:lang w:val="en-US"/>
+        </w:rPr>
+        <w:t xml:space="preserve">, 2026 (preprint). </w:t>
+      </w:r>
+      <w:hyperlink r:id="Rf1b23ebdfef940c8">
+        <w:r>
+          <w:rPr>
+            <w:rStyle w:val="Hyperlink"/>
+            <w:rFonts w:ascii="Times New Roman" w:hAnsi="Times New Roman" w:eastAsia="MS Mincho" w:cs="Times New Roman"/>
+            <w:noProof/>
+            <w:color w:val="000000" w:themeColor="text1" w:themeTint="FF" w:themeShade="FF"/>
+            <w:sz w:val="16"/>
+            <w:szCs w:val="16"/>
+            <w:lang w:val="en-US"/>
+          </w:rPr>
+          <w:t>https://d-nb.info/1272279990/34</w:t>
+        </w:r>
+      </w:hyperlink>
+    </w:p>
+    <w:p>
+      <w:pPr>
+        <w:pStyle w:val="references"/>
+        <w:jc w:val="start"/>
+        <w:rPr>
+          <w:rFonts w:ascii="Times New Roman" w:hAnsi="Times New Roman" w:eastAsia="MS Mincho" w:cs="Times New Roman"/>
+          <w:sz w:val="16"/>
+          <w:szCs w:val="16"/>
+        </w:rPr>
+      </w:pPr>
+      <w:r>
+        <w:rPr>
+          <w:rFonts w:ascii="Times New Roman" w:hAnsi="Times New Roman" w:eastAsia="MS Mincho" w:cs="Times New Roman"/>
+          <w:noProof/>
+          <w:color w:val="000000" w:themeColor="text1" w:themeTint="FF" w:themeShade="FF"/>
+          <w:sz w:val="16"/>
+          <w:szCs w:val="16"/>
+          <w:lang w:val="en-US"/>
+        </w:rPr>
+        <w:t xml:space="preserve">C. Smiliotopoulos et al., “Revisiting the detection of lateral movement through Sysmon,” </w:t>
+      </w:r>
+      <w:r>
+        <w:rPr>
+          <w:rFonts w:ascii="Times New Roman" w:hAnsi="Times New Roman" w:eastAsia="MS Mincho" w:cs="Times New Roman"/>
+          <w:i w:val="1"/>
+          <w:iCs w:val="1"/>
+          <w:noProof/>
+          <w:color w:val="000000" w:themeColor="text1" w:themeTint="FF" w:themeShade="FF"/>
+          <w:sz w:val="16"/>
+          <w:szCs w:val="16"/>
+          <w:lang w:val="en-US"/>
+        </w:rPr>
+        <w:t>Applied Sciences</w:t>
+      </w:r>
+      <w:r>
+        <w:rPr>
+          <w:rFonts w:ascii="Times New Roman" w:hAnsi="Times New Roman" w:eastAsia="MS Mincho" w:cs="Times New Roman"/>
+          <w:noProof/>
+          <w:color w:val="000000" w:themeColor="text1" w:themeTint="FF" w:themeShade="FF"/>
+          <w:sz w:val="16"/>
+          <w:szCs w:val="16"/>
+          <w:lang w:val="en-US"/>
+        </w:rPr>
+        <w:t xml:space="preserve">, vol. 12, no. 15, p. 7746, 2022. </w:t>
+      </w:r>
+      <w:hyperlink r:id="R9eac08a6f9e447cf">
+        <w:r>
+          <w:rPr>
+            <w:rStyle w:val="Hyperlink"/>
+            <w:rFonts w:ascii="Times New Roman" w:hAnsi="Times New Roman" w:eastAsia="MS Mincho" w:cs="Times New Roman"/>
+            <w:noProof/>
+            <w:color w:val="000000" w:themeColor="text1" w:themeTint="FF" w:themeShade="FF"/>
+            <w:sz w:val="16"/>
+            <w:szCs w:val="16"/>
+            <w:lang w:val="en-US"/>
+          </w:rPr>
+          <w:t>https://www.mdpi.com/2076-3417/12/15/7746</w:t>
+        </w:r>
+      </w:hyperlink>
+    </w:p>
+    <w:p>
+      <w:pPr>
+        <w:pStyle w:val="references"/>
+        <w:jc w:val="start"/>
+        <w:rPr>
+          <w:rFonts w:ascii="Times New Roman" w:hAnsi="Times New Roman" w:eastAsia="MS Mincho" w:cs="Times New Roman"/>
+          <w:sz w:val="16"/>
+          <w:szCs w:val="16"/>
+        </w:rPr>
+      </w:pPr>
+      <w:r>
+        <w:rPr>
+          <w:rFonts w:ascii="Times New Roman" w:hAnsi="Times New Roman" w:eastAsia="MS Mincho" w:cs="Times New Roman"/>
+          <w:noProof/>
+          <w:color w:val="000000" w:themeColor="text1" w:themeTint="FF" w:themeShade="FF"/>
+          <w:sz w:val="16"/>
+          <w:szCs w:val="16"/>
+          <w:lang w:val="en-US"/>
+        </w:rPr>
+        <w:t xml:space="preserve">J. Ispahany et al., “Online Batch Incremental Ransomware Detection in Sysmon Data Streams,” </w:t>
+      </w:r>
+      <w:r>
+        <w:rPr>
+          <w:rFonts w:ascii="Times New Roman" w:hAnsi="Times New Roman" w:eastAsia="MS Mincho" w:cs="Times New Roman"/>
+          <w:i w:val="1"/>
+          <w:iCs w:val="1"/>
+          <w:noProof/>
+          <w:color w:val="000000" w:themeColor="text1" w:themeTint="FF" w:themeShade="FF"/>
+          <w:sz w:val="16"/>
+          <w:szCs w:val="16"/>
+          <w:lang w:val="en-US"/>
+        </w:rPr>
+        <w:t>IEEE Access</w:t>
+      </w:r>
+      <w:r>
+        <w:rPr>
+          <w:rFonts w:ascii="Times New Roman" w:hAnsi="Times New Roman" w:eastAsia="MS Mincho" w:cs="Times New Roman"/>
+          <w:noProof/>
+          <w:color w:val="000000" w:themeColor="text1" w:themeTint="FF" w:themeShade="FF"/>
+          <w:sz w:val="16"/>
+          <w:szCs w:val="16"/>
+          <w:lang w:val="en-US"/>
+        </w:rPr>
+        <w:t xml:space="preserve">, vol. 11, pp. 14111–14128, 2023. </w:t>
+      </w:r>
+      <w:hyperlink r:id="Rb23d908260aa4c8e">
+        <w:r>
+          <w:rPr>
+            <w:rStyle w:val="Hyperlink"/>
+            <w:rFonts w:ascii="Times New Roman" w:hAnsi="Times New Roman" w:eastAsia="MS Mincho" w:cs="Times New Roman"/>
+            <w:noProof/>
+            <w:color w:val="000000" w:themeColor="text1" w:themeTint="FF" w:themeShade="FF"/>
+            <w:sz w:val="16"/>
+            <w:szCs w:val="16"/>
+            <w:lang w:val="en-US"/>
+          </w:rPr>
+          <w:t>https://doi.org/10.48550/arXiv.2501.01083</w:t>
+        </w:r>
+      </w:hyperlink>
+    </w:p>
+    <w:p>
+      <w:pPr>
+        <w:pStyle w:val="references"/>
+        <w:jc w:val="start"/>
+        <w:rPr>
+          <w:rFonts w:ascii="Times New Roman" w:hAnsi="Times New Roman" w:eastAsia="MS Mincho" w:cs="Times New Roman"/>
+          <w:sz w:val="16"/>
+          <w:szCs w:val="16"/>
+        </w:rPr>
+      </w:pPr>
+      <w:r>
+        <w:rPr>
+          <w:rFonts w:ascii="Times New Roman" w:hAnsi="Times New Roman" w:eastAsia="MS Mincho" w:cs="Times New Roman"/>
+          <w:noProof/>
+          <w:color w:val="000000" w:themeColor="text1" w:themeTint="FF" w:themeShade="FF"/>
+          <w:sz w:val="16"/>
+          <w:szCs w:val="16"/>
+          <w:lang w:val="en-US"/>
+        </w:rPr>
+        <w:t xml:space="preserve">J. Ispahany et al., “SILRAD: Streaming Machine Learning for Ransomware Detection,” in </w:t>
+      </w:r>
+      <w:r>
+        <w:rPr>
+          <w:rFonts w:ascii="Times New Roman" w:hAnsi="Times New Roman" w:eastAsia="MS Mincho" w:cs="Times New Roman"/>
+          <w:i w:val="1"/>
+          <w:iCs w:val="1"/>
+          <w:noProof/>
+          <w:color w:val="000000" w:themeColor="text1" w:themeTint="FF" w:themeShade="FF"/>
+          <w:sz w:val="16"/>
+          <w:szCs w:val="16"/>
+          <w:lang w:val="en-US"/>
+        </w:rPr>
+        <w:t>Proc. Annual Research Security Conf.</w:t>
+      </w:r>
+      <w:r>
+        <w:rPr>
+          <w:rFonts w:ascii="Times New Roman" w:hAnsi="Times New Roman" w:eastAsia="MS Mincho" w:cs="Times New Roman"/>
+          <w:noProof/>
+          <w:color w:val="000000" w:themeColor="text1" w:themeTint="FF" w:themeShade="FF"/>
+          <w:sz w:val="16"/>
+          <w:szCs w:val="16"/>
+          <w:lang w:val="en-US"/>
+        </w:rPr>
+        <w:t xml:space="preserve">, 2025. </w:t>
+      </w:r>
+      <w:hyperlink r:id="R4e7e5c8b02364809">
+        <w:r>
+          <w:rPr>
+            <w:rStyle w:val="Hyperlink"/>
+            <w:rFonts w:ascii="Times New Roman" w:hAnsi="Times New Roman" w:eastAsia="MS Mincho" w:cs="Times New Roman"/>
+            <w:noProof/>
+            <w:color w:val="000000" w:themeColor="text1" w:themeTint="FF" w:themeShade="FF"/>
+            <w:sz w:val="16"/>
+            <w:szCs w:val="16"/>
+            <w:lang w:val="en-US"/>
+          </w:rPr>
+          <w:t>https://doi.org/10.1109/ICFRS55784.2025.00010</w:t>
+        </w:r>
+      </w:hyperlink>
+    </w:p>
+    <w:p>
+      <w:pPr>
+        <w:pStyle w:val="references"/>
+        <w:jc w:val="start"/>
+        <w:rPr>
+          <w:rFonts w:ascii="Times New Roman" w:hAnsi="Times New Roman" w:eastAsia="MS Mincho" w:cs="Times New Roman"/>
+          <w:sz w:val="16"/>
+          <w:szCs w:val="16"/>
+        </w:rPr>
+      </w:pPr>
+      <w:r>
+        <w:rPr>
+          <w:rFonts w:ascii="Times New Roman" w:hAnsi="Times New Roman" w:eastAsia="MS Mincho" w:cs="Times New Roman"/>
+          <w:noProof/>
+          <w:color w:val="000000" w:themeColor="text1" w:themeTint="FF" w:themeShade="FF"/>
+          <w:sz w:val="16"/>
+          <w:szCs w:val="16"/>
+          <w:lang w:val="en-US"/>
+        </w:rPr>
+        <w:t xml:space="preserve">R. Achmad et al., “Sysmon event logs for machine learning-based malware detection,” </w:t>
+      </w:r>
+      <w:r>
+        <w:rPr>
+          <w:rFonts w:ascii="Times New Roman" w:hAnsi="Times New Roman" w:eastAsia="MS Mincho" w:cs="Times New Roman"/>
+          <w:i w:val="1"/>
+          <w:iCs w:val="1"/>
+          <w:noProof/>
+          <w:color w:val="000000" w:themeColor="text1" w:themeTint="FF" w:themeShade="FF"/>
+          <w:sz w:val="16"/>
+          <w:szCs w:val="16"/>
+          <w:lang w:val="en-US"/>
+        </w:rPr>
+        <w:t>Cyber Security and Applications</w:t>
+      </w:r>
+      <w:r>
+        <w:rPr>
+          <w:rFonts w:ascii="Times New Roman" w:hAnsi="Times New Roman" w:eastAsia="MS Mincho" w:cs="Times New Roman"/>
+          <w:noProof/>
+          <w:color w:val="000000" w:themeColor="text1" w:themeTint="FF" w:themeShade="FF"/>
+          <w:sz w:val="16"/>
+          <w:szCs w:val="16"/>
+          <w:lang w:val="en-US"/>
+        </w:rPr>
+        <w:t xml:space="preserve">, vol. 5, p. 100110, 2025. </w:t>
+      </w:r>
+      <w:hyperlink r:id="R3d8bfd0fe4dd4d8d">
+        <w:r>
+          <w:rPr>
+            <w:rStyle w:val="Hyperlink"/>
+            <w:rFonts w:ascii="Times New Roman" w:hAnsi="Times New Roman" w:eastAsia="MS Mincho" w:cs="Times New Roman"/>
+            <w:noProof/>
+            <w:color w:val="000000" w:themeColor="text1" w:themeTint="FF" w:themeShade="FF"/>
+            <w:sz w:val="16"/>
+            <w:szCs w:val="16"/>
+            <w:lang w:val="en-US"/>
+          </w:rPr>
+          <w:t>https://www.sciencedirect.com/science/article/pii/S277291842500027X</w:t>
+        </w:r>
+      </w:hyperlink>
+    </w:p>
+    <w:p>
+      <w:pPr>
+        <w:pStyle w:val="references"/>
+        <w:jc w:val="start"/>
+        <w:rPr>
+          <w:rFonts w:ascii="Times New Roman" w:hAnsi="Times New Roman" w:eastAsia="MS Mincho" w:cs="Times New Roman"/>
+          <w:sz w:val="16"/>
+          <w:szCs w:val="16"/>
+        </w:rPr>
+      </w:pPr>
+      <w:r>
+        <w:rPr>
+          <w:rFonts w:ascii="Times New Roman" w:hAnsi="Times New Roman" w:eastAsia="MS Mincho" w:cs="Times New Roman"/>
+          <w:noProof/>
+          <w:color w:val="000000" w:themeColor="text1" w:themeTint="FF" w:themeShade="FF"/>
+          <w:sz w:val="16"/>
+          <w:szCs w:val="16"/>
+          <w:lang w:val="en-US"/>
+        </w:rPr>
+        <w:t xml:space="preserve">M. Mahmoud et al., “SYSCADE: Sysmon and ElasticSearch for Automated Malware Analysis,” </w:t>
+      </w:r>
+      <w:r>
+        <w:rPr>
+          <w:rFonts w:ascii="Times New Roman" w:hAnsi="Times New Roman" w:eastAsia="MS Mincho" w:cs="Times New Roman"/>
+          <w:i w:val="1"/>
+          <w:iCs w:val="1"/>
+          <w:noProof/>
+          <w:color w:val="000000" w:themeColor="text1" w:themeTint="FF" w:themeShade="FF"/>
+          <w:sz w:val="16"/>
+          <w:szCs w:val="16"/>
+          <w:lang w:val="en-US"/>
+        </w:rPr>
+        <w:t>IEEE Access</w:t>
+      </w:r>
+      <w:r>
+        <w:rPr>
+          <w:rFonts w:ascii="Times New Roman" w:hAnsi="Times New Roman" w:eastAsia="MS Mincho" w:cs="Times New Roman"/>
+          <w:noProof/>
+          <w:color w:val="000000" w:themeColor="text1" w:themeTint="FF" w:themeShade="FF"/>
+          <w:sz w:val="16"/>
+          <w:szCs w:val="16"/>
+          <w:lang w:val="en-US"/>
+        </w:rPr>
+        <w:t xml:space="preserve">, 2024. </w:t>
+      </w:r>
+      <w:hyperlink r:id="R8066800047674959">
+        <w:r>
+          <w:rPr>
+            <w:rStyle w:val="Hyperlink"/>
+            <w:rFonts w:ascii="Times New Roman" w:hAnsi="Times New Roman" w:eastAsia="MS Mincho" w:cs="Times New Roman"/>
+            <w:noProof/>
+            <w:color w:val="000000" w:themeColor="text1" w:themeTint="FF" w:themeShade="FF"/>
+            <w:sz w:val="16"/>
+            <w:szCs w:val="16"/>
+            <w:lang w:val="en-US"/>
+          </w:rPr>
+          <w:t>https://ieeexplore.ieee.org/document/8892864</w:t>
+        </w:r>
+      </w:hyperlink>
+    </w:p>
+    <w:p>
+      <w:pPr>
+        <w:pStyle w:val="references"/>
+        <w:jc w:val="start"/>
+        <w:rPr>
+          <w:rFonts w:ascii="Times New Roman" w:hAnsi="Times New Roman" w:eastAsia="MS Mincho" w:cs="Times New Roman"/>
+          <w:sz w:val="16"/>
+          <w:szCs w:val="16"/>
+        </w:rPr>
+      </w:pPr>
+      <w:r>
+        <w:rPr>
+          <w:rFonts w:ascii="Times New Roman" w:hAnsi="Times New Roman" w:eastAsia="MS Mincho" w:cs="Times New Roman"/>
+          <w:noProof/>
+          <w:color w:val="000000" w:themeColor="text1" w:themeTint="FF" w:themeShade="FF"/>
+          <w:sz w:val="16"/>
+          <w:szCs w:val="16"/>
+          <w:lang w:val="en-US"/>
+        </w:rPr>
+        <w:t xml:space="preserve">R. Yao et al., “A Dataset of APT Persistence Techniques on Windows Platforms Mapped to ATT&amp;CK,” in </w:t>
+      </w:r>
+      <w:r>
+        <w:rPr>
+          <w:rFonts w:ascii="Times New Roman" w:hAnsi="Times New Roman" w:eastAsia="MS Mincho" w:cs="Times New Roman"/>
+          <w:i w:val="1"/>
+          <w:iCs w:val="1"/>
+          <w:noProof/>
+          <w:color w:val="000000" w:themeColor="text1" w:themeTint="FF" w:themeShade="FF"/>
+          <w:sz w:val="16"/>
+          <w:szCs w:val="16"/>
+          <w:lang w:val="en-US"/>
+        </w:rPr>
+        <w:t>Proc. ARYAC</w:t>
+      </w:r>
+      <w:r>
+        <w:rPr>
+          <w:rFonts w:ascii="Times New Roman" w:hAnsi="Times New Roman" w:eastAsia="MS Mincho" w:cs="Times New Roman"/>
+          <w:noProof/>
+          <w:color w:val="000000" w:themeColor="text1" w:themeTint="FF" w:themeShade="FF"/>
+          <w:sz w:val="16"/>
+          <w:szCs w:val="16"/>
+          <w:lang w:val="en-US"/>
+        </w:rPr>
+        <w:t xml:space="preserve">, 2025. </w:t>
+      </w:r>
+      <w:hyperlink r:id="R4f21488608434de0">
+        <w:r>
+          <w:rPr>
+            <w:rStyle w:val="Hyperlink"/>
+            <w:rFonts w:ascii="Times New Roman" w:hAnsi="Times New Roman" w:eastAsia="MS Mincho" w:cs="Times New Roman"/>
+            <w:noProof/>
+            <w:color w:val="000000" w:themeColor="text1" w:themeTint="FF" w:themeShade="FF"/>
+            <w:sz w:val="16"/>
+            <w:szCs w:val="16"/>
+            <w:lang w:val="en-US"/>
+          </w:rPr>
+          <w:t>https://cylab.cmu.edu/projects/syslog/papers/dataset-APT-Persistence.pdf</w:t>
+        </w:r>
+      </w:hyperlink>
+    </w:p>
+    <w:p>
+      <w:pPr>
+        <w:pStyle w:val="references"/>
+        <w:jc w:val="start"/>
+        <w:rPr>
+          <w:rFonts w:ascii="Times New Roman" w:hAnsi="Times New Roman" w:eastAsia="MS Mincho" w:cs="Times New Roman"/>
+          <w:noProof/>
+          <w:color w:val="000000" w:themeColor="text1" w:themeTint="FF" w:themeShade="FF"/>
+          <w:sz w:val="16"/>
+          <w:szCs w:val="16"/>
+          <w:lang w:val="en-US"/>
+        </w:rPr>
+      </w:pPr>
+      <w:r>
+        <w:rPr>
+          <w:rFonts w:ascii="Times New Roman" w:hAnsi="Times New Roman" w:eastAsia="MS Mincho" w:cs="Times New Roman"/>
+          <w:noProof/>
+          <w:color w:val="000000" w:themeColor="text1" w:themeTint="FF" w:themeShade="FF"/>
+          <w:sz w:val="16"/>
+          <w:szCs w:val="16"/>
+          <w:lang w:val="en-US"/>
+        </w:rPr>
+        <w:t xml:space="preserve">S. Chen et al., “Kellect: Kernel-Based Lossless Event Log Collector,” </w:t>
+      </w:r>
+      <w:r>
+        <w:rPr>
+          <w:rFonts w:ascii="Times New Roman" w:hAnsi="Times New Roman" w:eastAsia="MS Mincho" w:cs="Times New Roman"/>
+          <w:i w:val="1"/>
+          <w:iCs w:val="1"/>
+          <w:noProof/>
+          <w:color w:val="000000" w:themeColor="text1" w:themeTint="FF" w:themeShade="FF"/>
+          <w:sz w:val="16"/>
+          <w:szCs w:val="16"/>
+          <w:lang w:val="en-US"/>
+        </w:rPr>
+        <w:t>arXiv preprint arXiv:2207.11530</w:t>
+      </w:r>
+      <w:r>
+        <w:rPr>
+          <w:rFonts w:ascii="Times New Roman" w:hAnsi="Times New Roman" w:eastAsia="MS Mincho" w:cs="Times New Roman"/>
+          <w:noProof/>
+          <w:color w:val="000000" w:themeColor="text1" w:themeTint="FF" w:themeShade="FF"/>
+          <w:sz w:val="16"/>
+          <w:szCs w:val="16"/>
+          <w:lang w:val="en-US"/>
+        </w:rPr>
+        <w:t>, 2022.</w:t>
+      </w:r>
+    </w:p>
+    <w:p>
+      <w:pPr>
+        <w:pStyle w:val="references"/>
+        <w:jc w:val="start"/>
+        <w:rPr>
+          <w:rFonts w:ascii="Times New Roman" w:hAnsi="Times New Roman" w:eastAsia="MS Mincho" w:cs="Times New Roman"/>
+          <w:sz w:val="16"/>
+          <w:szCs w:val="16"/>
+        </w:rPr>
+      </w:pPr>
+      <w:r>
+        <w:rPr>
+          <w:rFonts w:ascii="Times New Roman" w:hAnsi="Times New Roman" w:eastAsia="MS Mincho" w:cs="Times New Roman"/>
+          <w:noProof/>
+          <w:color w:val="000000" w:themeColor="text1" w:themeTint="FF" w:themeShade="FF"/>
+          <w:sz w:val="16"/>
+          <w:szCs w:val="16"/>
+          <w:lang w:val="en-US"/>
+        </w:rPr>
+        <w:t xml:space="preserve">J. Gwak et al., “Explainable Malware Classification based on ETW Logs,” in </w:t>
+      </w:r>
+      <w:r>
+        <w:rPr>
+          <w:rFonts w:ascii="Times New Roman" w:hAnsi="Times New Roman" w:eastAsia="MS Mincho" w:cs="Times New Roman"/>
+          <w:i w:val="1"/>
+          <w:iCs w:val="1"/>
+          <w:noProof/>
+          <w:color w:val="000000" w:themeColor="text1" w:themeTint="FF" w:themeShade="FF"/>
+          <w:sz w:val="16"/>
+          <w:szCs w:val="16"/>
+          <w:lang w:val="en-US"/>
+        </w:rPr>
+        <w:t>Proc. CiSE-CxAI</w:t>
+      </w:r>
+      <w:r>
+        <w:rPr>
+          <w:rFonts w:ascii="Times New Roman" w:hAnsi="Times New Roman" w:eastAsia="MS Mincho" w:cs="Times New Roman"/>
+          <w:noProof/>
+          <w:color w:val="000000" w:themeColor="text1" w:themeTint="FF" w:themeShade="FF"/>
+          <w:sz w:val="16"/>
+          <w:szCs w:val="16"/>
+          <w:lang w:val="en-US"/>
+        </w:rPr>
+        <w:t xml:space="preserve">, 2023. </w:t>
+      </w:r>
+      <w:hyperlink r:id="R7384f239667a48d7">
+        <w:r>
+          <w:rPr>
+            <w:rStyle w:val="Hyperlink"/>
+            <w:rFonts w:ascii="Times New Roman" w:hAnsi="Times New Roman" w:eastAsia="MS Mincho" w:cs="Times New Roman"/>
+            <w:noProof/>
+            <w:color w:val="000000" w:themeColor="text1" w:themeTint="FF" w:themeShade="FF"/>
+            <w:sz w:val="16"/>
+            <w:szCs w:val="16"/>
+            <w:lang w:val="en-US"/>
+          </w:rPr>
+          <w:t>https://cs.binghamton.edu/~pawlik/jankiqi/gwak_etal_cxai_2023.pdf</w:t>
+        </w:r>
+      </w:hyperlink>
+    </w:p>
+    <w:p>
+      <w:pPr>
+        <w:pStyle w:val="references"/>
+        <w:jc w:val="start"/>
+        <w:rPr>
+          <w:rFonts w:ascii="Times New Roman" w:hAnsi="Times New Roman" w:eastAsia="MS Mincho" w:cs="Times New Roman"/>
+          <w:noProof/>
+          <w:color w:val="000000" w:themeColor="text1" w:themeTint="FF" w:themeShade="FF"/>
+          <w:sz w:val="16"/>
+          <w:szCs w:val="16"/>
+          <w:lang w:val="en-US"/>
+        </w:rPr>
+      </w:pPr>
+      <w:r>
+        <w:rPr>
+          <w:rFonts w:ascii="Times New Roman" w:hAnsi="Times New Roman" w:eastAsia="MS Mincho" w:cs="Times New Roman"/>
+          <w:noProof/>
+          <w:color w:val="000000" w:themeColor="text1" w:themeTint="FF" w:themeShade="FF"/>
+          <w:sz w:val="16"/>
+          <w:szCs w:val="16"/>
+          <w:lang w:val="en-US"/>
+        </w:rPr>
+        <w:t xml:space="preserve">A. Kalinkin et al., “Ransomware detection based on ETW and ML models,” </w:t>
+      </w:r>
+      <w:r>
+        <w:rPr>
+          <w:rFonts w:ascii="Times New Roman" w:hAnsi="Times New Roman" w:eastAsia="MS Mincho" w:cs="Times New Roman"/>
+          <w:i w:val="1"/>
+          <w:iCs w:val="1"/>
+          <w:noProof/>
+          <w:color w:val="000000" w:themeColor="text1" w:themeTint="FF" w:themeShade="FF"/>
+          <w:sz w:val="16"/>
+          <w:szCs w:val="16"/>
+          <w:lang w:val="en-US"/>
+        </w:rPr>
+        <w:t>IT Security</w:t>
+      </w:r>
+      <w:r>
+        <w:rPr>
+          <w:rFonts w:ascii="Times New Roman" w:hAnsi="Times New Roman" w:eastAsia="MS Mincho" w:cs="Times New Roman"/>
+          <w:noProof/>
+          <w:color w:val="000000" w:themeColor="text1" w:themeTint="FF" w:themeShade="FF"/>
+          <w:sz w:val="16"/>
+          <w:szCs w:val="16"/>
+          <w:lang w:val="en-US"/>
+        </w:rPr>
+        <w:t>, vol. 15, no. 3, pp. 57–68, 2022.</w:t>
+      </w:r>
+    </w:p>
+    <w:p>
+      <w:pPr>
+        <w:pStyle w:val="references"/>
+        <w:jc w:val="start"/>
+        <w:rPr>
+          <w:rFonts w:ascii="Times New Roman" w:hAnsi="Times New Roman" w:eastAsia="MS Mincho" w:cs="Times New Roman"/>
+          <w:sz w:val="16"/>
+          <w:szCs w:val="16"/>
+        </w:rPr>
+      </w:pPr>
+      <w:r>
+        <w:rPr>
+          <w:rFonts w:ascii="Times New Roman" w:hAnsi="Times New Roman" w:eastAsia="MS Mincho" w:cs="Times New Roman"/>
+          <w:noProof/>
+          <w:color w:val="000000" w:themeColor="text1" w:themeTint="FF" w:themeShade="FF"/>
+          <w:sz w:val="16"/>
+          <w:szCs w:val="16"/>
+          <w:lang w:val="en-US"/>
+        </w:rPr>
+        <w:t xml:space="preserve">M. Alvi and Z. Jalil, “RansomGuard: Ransomware Detection Using File I/O Classification,” in </w:t>
+      </w:r>
+      <w:r>
+        <w:rPr>
+          <w:rFonts w:ascii="Times New Roman" w:hAnsi="Times New Roman" w:eastAsia="MS Mincho" w:cs="Times New Roman"/>
+          <w:i w:val="1"/>
+          <w:iCs w:val="1"/>
+          <w:noProof/>
+          <w:color w:val="000000" w:themeColor="text1" w:themeTint="FF" w:themeShade="FF"/>
+          <w:sz w:val="16"/>
+          <w:szCs w:val="16"/>
+          <w:lang w:val="en-US"/>
+        </w:rPr>
+        <w:t>Proc. Workshop on Digital Forensics</w:t>
+      </w:r>
+      <w:r>
+        <w:rPr>
+          <w:rFonts w:ascii="Times New Roman" w:hAnsi="Times New Roman" w:eastAsia="MS Mincho" w:cs="Times New Roman"/>
+          <w:noProof/>
+          <w:color w:val="000000" w:themeColor="text1" w:themeTint="FF" w:themeShade="FF"/>
+          <w:sz w:val="16"/>
+          <w:szCs w:val="16"/>
+          <w:lang w:val="en-US"/>
+        </w:rPr>
+        <w:t xml:space="preserve">, 2024. </w:t>
+      </w:r>
+      <w:hyperlink r:id="R8673627207d94189">
+        <w:r>
+          <w:rPr>
+            <w:rStyle w:val="Hyperlink"/>
+            <w:rFonts w:ascii="Times New Roman" w:hAnsi="Times New Roman" w:eastAsia="MS Mincho" w:cs="Times New Roman"/>
+            <w:noProof/>
+            <w:color w:val="000000" w:themeColor="text1" w:themeTint="FF" w:themeShade="FF"/>
+            <w:sz w:val="16"/>
+            <w:szCs w:val="16"/>
+            <w:lang w:val="en-US"/>
+          </w:rPr>
+          <w:t>https://ieeexplore.ieee.org/document/10343783</w:t>
+        </w:r>
+      </w:hyperlink>
+    </w:p>
+    <w:p>
+      <w:pPr>
+        <w:pStyle w:val="references"/>
+        <w:jc w:val="start"/>
+        <w:rPr>
+          <w:rFonts w:ascii="Times New Roman" w:hAnsi="Times New Roman" w:eastAsia="MS Mincho" w:cs="Times New Roman"/>
+          <w:sz w:val="16"/>
+          <w:szCs w:val="16"/>
+        </w:rPr>
+      </w:pPr>
+      <w:r>
+        <w:rPr>
+          <w:rFonts w:ascii="Times New Roman" w:hAnsi="Times New Roman" w:eastAsia="MS Mincho" w:cs="Times New Roman"/>
+          <w:noProof/>
+          <w:color w:val="000000" w:themeColor="text1" w:themeTint="FF" w:themeShade="FF"/>
+          <w:sz w:val="16"/>
+          <w:szCs w:val="16"/>
+          <w:lang w:val="en-US"/>
+        </w:rPr>
+        <w:t xml:space="preserve">Y. Guo et al., “Ransomware Detection through Correlated Performance Counters,” in </w:t>
+      </w:r>
+      <w:r>
+        <w:rPr>
+          <w:rFonts w:ascii="Times New Roman" w:hAnsi="Times New Roman" w:eastAsia="MS Mincho" w:cs="Times New Roman"/>
+          <w:i w:val="1"/>
+          <w:iCs w:val="1"/>
+          <w:noProof/>
+          <w:color w:val="000000" w:themeColor="text1" w:themeTint="FF" w:themeShade="FF"/>
+          <w:sz w:val="16"/>
+          <w:szCs w:val="16"/>
+          <w:lang w:val="en-US"/>
+        </w:rPr>
+        <w:t>Proc. ACM FSE</w:t>
+      </w:r>
+      <w:r>
+        <w:rPr>
+          <w:rFonts w:ascii="Times New Roman" w:hAnsi="Times New Roman" w:eastAsia="MS Mincho" w:cs="Times New Roman"/>
+          <w:noProof/>
+          <w:color w:val="000000" w:themeColor="text1" w:themeTint="FF" w:themeShade="FF"/>
+          <w:sz w:val="16"/>
+          <w:szCs w:val="16"/>
+          <w:lang w:val="en-US"/>
+        </w:rPr>
+        <w:t xml:space="preserve">, 2025. </w:t>
+      </w:r>
+      <w:hyperlink r:id="Ref67fee738d444ae">
+        <w:r>
+          <w:rPr>
+            <w:rStyle w:val="Hyperlink"/>
+            <w:rFonts w:ascii="Times New Roman" w:hAnsi="Times New Roman" w:eastAsia="MS Mincho" w:cs="Times New Roman"/>
+            <w:noProof/>
+            <w:color w:val="000000" w:themeColor="text1" w:themeTint="FF" w:themeShade="FF"/>
+            <w:sz w:val="16"/>
+            <w:szCs w:val="16"/>
+            <w:lang w:val="en-US"/>
+          </w:rPr>
+          <w:t>https://yangguo01.github.io/pubs/ransomradar_fse25.pdf</w:t>
+        </w:r>
+      </w:hyperlink>
+    </w:p>
+    <w:p>
+      <w:pPr>
+        <w:pStyle w:val="references"/>
+        <w:jc w:val="start"/>
+        <w:rPr>
+          <w:rFonts w:ascii="Times New Roman" w:hAnsi="Times New Roman" w:eastAsia="MS Mincho" w:cs="Times New Roman"/>
+          <w:sz w:val="16"/>
+          <w:szCs w:val="16"/>
+        </w:rPr>
+      </w:pPr>
+      <w:r>
+        <w:rPr>
+          <w:rFonts w:ascii="Times New Roman" w:hAnsi="Times New Roman" w:eastAsia="MS Mincho" w:cs="Times New Roman"/>
+          <w:noProof/>
+          <w:color w:val="000000" w:themeColor="text1" w:themeTint="FF" w:themeShade="FF"/>
+          <w:sz w:val="16"/>
+          <w:szCs w:val="16"/>
+          <w:lang w:val="en-US"/>
+        </w:rPr>
+        <w:t xml:space="preserve">MITRE, “MITRE ATT&amp;CK® Framework,” 2024. </w:t>
+      </w:r>
+      <w:hyperlink r:id="R0fa678a941034c23">
+        <w:r>
+          <w:rPr>
+            <w:rStyle w:val="Hyperlink"/>
+            <w:rFonts w:ascii="Times New Roman" w:hAnsi="Times New Roman" w:eastAsia="MS Mincho" w:cs="Times New Roman"/>
+            <w:noProof/>
+            <w:color w:val="000000" w:themeColor="text1" w:themeTint="FF" w:themeShade="FF"/>
+            <w:sz w:val="16"/>
+            <w:szCs w:val="16"/>
+            <w:lang w:val="en-US"/>
+          </w:rPr>
+          <w:t>https://attack.mitre.org/</w:t>
+        </w:r>
+      </w:hyperlink>
+    </w:p>
+    <w:p>
+      <w:pPr>
+        <w:pStyle w:val="references"/>
+        <w:jc w:val="start"/>
+        <w:rPr>
+          <w:rFonts w:ascii="Times New Roman" w:hAnsi="Times New Roman" w:eastAsia="MS Mincho" w:cs="Times New Roman"/>
+          <w:noProof/>
+          <w:color w:val="000000" w:themeColor="text1" w:themeTint="FF" w:themeShade="FF"/>
+          <w:sz w:val="16"/>
+          <w:szCs w:val="16"/>
+          <w:lang w:val="en-US"/>
+        </w:rPr>
+      </w:pPr>
+      <w:r>
+        <w:rPr>
+          <w:rFonts w:ascii="Times New Roman" w:hAnsi="Times New Roman" w:eastAsia="MS Mincho" w:cs="Times New Roman"/>
+          <w:noProof/>
+          <w:color w:val="000000" w:themeColor="text1" w:themeTint="FF" w:themeShade="FF"/>
+          <w:sz w:val="16"/>
+          <w:szCs w:val="16"/>
+          <w:lang w:val="en-US"/>
+        </w:rPr>
+        <w:t xml:space="preserve">Y. Yang et al., “ProGrapher: Graph-based Provenance Anomaly Detection,” in </w:t>
+      </w:r>
+      <w:r>
+        <w:rPr>
+          <w:rFonts w:ascii="Times New Roman" w:hAnsi="Times New Roman" w:eastAsia="MS Mincho" w:cs="Times New Roman"/>
+          <w:i w:val="1"/>
+          <w:iCs w:val="1"/>
+          <w:noProof/>
+          <w:color w:val="000000" w:themeColor="text1" w:themeTint="FF" w:themeShade="FF"/>
+          <w:sz w:val="16"/>
+          <w:szCs w:val="16"/>
+          <w:lang w:val="en-US"/>
+        </w:rPr>
+        <w:t>Proc. USENIX Security Symposium</w:t>
+      </w:r>
+      <w:r>
+        <w:rPr>
+          <w:rFonts w:ascii="Times New Roman" w:hAnsi="Times New Roman" w:eastAsia="MS Mincho" w:cs="Times New Roman"/>
+          <w:noProof/>
+          <w:color w:val="000000" w:themeColor="text1" w:themeTint="FF" w:themeShade="FF"/>
+          <w:sz w:val="16"/>
+          <w:szCs w:val="16"/>
+          <w:lang w:val="en-US"/>
+        </w:rPr>
+        <w:t>, 2023.</w:t>
+      </w:r>
+    </w:p>
+    <w:p>
+      <w:pPr>
+        <w:pStyle w:val="references"/>
+        <w:jc w:val="start"/>
+        <w:rPr>
+          <w:rFonts w:ascii="Times New Roman" w:hAnsi="Times New Roman" w:eastAsia="MS Mincho" w:cs="Times New Roman"/>
+          <w:sz w:val="16"/>
+          <w:szCs w:val="16"/>
+        </w:rPr>
+      </w:pPr>
+      <w:r>
+        <w:rPr>
+          <w:rFonts w:ascii="Times New Roman" w:hAnsi="Times New Roman" w:eastAsia="MS Mincho" w:cs="Times New Roman"/>
+          <w:noProof/>
+          <w:color w:val="000000" w:themeColor="text1" w:themeTint="FF" w:themeShade="FF"/>
+          <w:sz w:val="16"/>
+          <w:szCs w:val="16"/>
+          <w:lang w:val="en-US"/>
+        </w:rPr>
+        <w:t xml:space="preserve">B. Bhattarai and J. Huang, “Prov2Vec: Learning Graph Representations for Anomaly Detection,” in </w:t>
+      </w:r>
+      <w:r>
+        <w:rPr>
+          <w:rFonts w:ascii="Times New Roman" w:hAnsi="Times New Roman" w:eastAsia="MS Mincho" w:cs="Times New Roman"/>
+          <w:i w:val="1"/>
+          <w:iCs w:val="1"/>
+          <w:noProof/>
+          <w:color w:val="000000" w:themeColor="text1" w:themeTint="FF" w:themeShade="FF"/>
+          <w:sz w:val="16"/>
+          <w:szCs w:val="16"/>
+          <w:lang w:val="en-US"/>
+        </w:rPr>
+        <w:t>Proc. ARES</w:t>
+      </w:r>
+      <w:r>
+        <w:rPr>
+          <w:rFonts w:ascii="Times New Roman" w:hAnsi="Times New Roman" w:eastAsia="MS Mincho" w:cs="Times New Roman"/>
+          <w:noProof/>
+          <w:color w:val="000000" w:themeColor="text1" w:themeTint="FF" w:themeShade="FF"/>
+          <w:sz w:val="16"/>
+          <w:szCs w:val="16"/>
+          <w:lang w:val="en-US"/>
+        </w:rPr>
+        <w:t xml:space="preserve">, 2024. </w:t>
+      </w:r>
+      <w:hyperlink r:id="R02e1452ded8f4c4a">
+        <w:r>
+          <w:rPr>
+            <w:rStyle w:val="Hyperlink"/>
+            <w:rFonts w:ascii="Times New Roman" w:hAnsi="Times New Roman" w:eastAsia="MS Mincho" w:cs="Times New Roman"/>
+            <w:noProof/>
+            <w:color w:val="000000" w:themeColor="text1" w:themeTint="FF" w:themeShade="FF"/>
+            <w:sz w:val="16"/>
+            <w:szCs w:val="16"/>
+            <w:lang w:val="en-US"/>
+          </w:rPr>
+          <w:t>https://github.com/bhattarai13/prov2vec</w:t>
+        </w:r>
+      </w:hyperlink>
+    </w:p>
+    <w:p>
+      <w:pPr>
+        <w:pStyle w:val="references"/>
+        <w:jc w:val="start"/>
+        <w:rPr>
+          <w:rFonts w:ascii="Times New Roman" w:hAnsi="Times New Roman" w:eastAsia="MS Mincho" w:cs="Times New Roman"/>
+          <w:noProof/>
+          <w:color w:val="000000" w:themeColor="text1" w:themeTint="FF" w:themeShade="FF"/>
+          <w:sz w:val="16"/>
+          <w:szCs w:val="16"/>
+          <w:lang w:val="en-US"/>
+        </w:rPr>
+      </w:pPr>
+      <w:r>
+        <w:rPr>
+          <w:rFonts w:ascii="Times New Roman" w:hAnsi="Times New Roman" w:eastAsia="MS Mincho" w:cs="Times New Roman"/>
+          <w:noProof/>
+          <w:color w:val="000000" w:themeColor="text1" w:themeTint="FF" w:themeShade="FF"/>
+          <w:sz w:val="16"/>
+          <w:szCs w:val="16"/>
+          <w:lang w:val="en-US"/>
+        </w:rPr>
+        <w:t xml:space="preserve">Y. Amaru et al., “RAPID: Real-Time Anomaly Detection using Provenance Graphs,” </w:t>
+      </w:r>
+      <w:r>
+        <w:rPr>
+          <w:rFonts w:ascii="Times New Roman" w:hAnsi="Times New Roman" w:eastAsia="MS Mincho" w:cs="Times New Roman"/>
+          <w:i w:val="1"/>
+          <w:iCs w:val="1"/>
+          <w:noProof/>
+          <w:color w:val="000000" w:themeColor="text1" w:themeTint="FF" w:themeShade="FF"/>
+          <w:sz w:val="16"/>
+          <w:szCs w:val="16"/>
+          <w:lang w:val="en-US"/>
+        </w:rPr>
+        <w:t>arXiv preprint arXiv:2406.05362</w:t>
+      </w:r>
+      <w:r>
+        <w:rPr>
+          <w:rFonts w:ascii="Times New Roman" w:hAnsi="Times New Roman" w:eastAsia="MS Mincho" w:cs="Times New Roman"/>
+          <w:noProof/>
+          <w:color w:val="000000" w:themeColor="text1" w:themeTint="FF" w:themeShade="FF"/>
+          <w:sz w:val="16"/>
+          <w:szCs w:val="16"/>
+          <w:lang w:val="en-US"/>
+        </w:rPr>
+        <w:t>, 2024.</w:t>
+      </w:r>
+    </w:p>
+    <w:p>
+      <w:pPr>
+        <w:pStyle w:val="references"/>
+        <w:jc w:val="start"/>
+        <w:rPr>
+          <w:rFonts w:ascii="Times New Roman" w:hAnsi="Times New Roman" w:eastAsia="MS Mincho" w:cs="Times New Roman"/>
+          <w:noProof/>
+          <w:color w:val="000000" w:themeColor="text1" w:themeTint="FF" w:themeShade="FF"/>
+          <w:sz w:val="16"/>
+          <w:szCs w:val="16"/>
+          <w:lang w:val="en-US"/>
+        </w:rPr>
+      </w:pPr>
+      <w:r>
+        <w:rPr>
+          <w:rFonts w:ascii="Times New Roman" w:hAnsi="Times New Roman" w:eastAsia="MS Mincho" w:cs="Times New Roman"/>
+          <w:noProof/>
+          <w:color w:val="000000" w:themeColor="text1" w:themeTint="FF" w:themeShade="FF"/>
+          <w:sz w:val="16"/>
+          <w:szCs w:val="16"/>
+          <w:lang w:val="en-US"/>
+        </w:rPr>
+        <w:t xml:space="preserve">B. Jiang et al., “ORTHRUS: High-Fidelity Host Anomaly Detection via Temporal Graph Learning,” in </w:t>
+      </w:r>
+      <w:r>
+        <w:rPr>
+          <w:rFonts w:ascii="Times New Roman" w:hAnsi="Times New Roman" w:eastAsia="MS Mincho" w:cs="Times New Roman"/>
+          <w:i w:val="1"/>
+          <w:iCs w:val="1"/>
+          <w:noProof/>
+          <w:color w:val="000000" w:themeColor="text1" w:themeTint="FF" w:themeShade="FF"/>
+          <w:sz w:val="16"/>
+          <w:szCs w:val="16"/>
+          <w:lang w:val="en-US"/>
+        </w:rPr>
+        <w:t>Proc. USENIX Security Symposium</w:t>
+      </w:r>
+      <w:r>
+        <w:rPr>
+          <w:rFonts w:ascii="Times New Roman" w:hAnsi="Times New Roman" w:eastAsia="MS Mincho" w:cs="Times New Roman"/>
+          <w:noProof/>
+          <w:color w:val="000000" w:themeColor="text1" w:themeTint="FF" w:themeShade="FF"/>
+          <w:sz w:val="16"/>
+          <w:szCs w:val="16"/>
+          <w:lang w:val="en-US"/>
+        </w:rPr>
+        <w:t>, 2025.</w:t>
+      </w:r>
+    </w:p>
+    <w:p>
+      <w:pPr>
+        <w:pStyle w:val="references"/>
+        <w:jc w:val="start"/>
+        <w:rPr>
+          <w:rFonts w:ascii="Times New Roman" w:hAnsi="Times New Roman" w:eastAsia="MS Mincho" w:cs="Times New Roman"/>
+          <w:sz w:val="16"/>
+          <w:szCs w:val="16"/>
+        </w:rPr>
+      </w:pPr>
+      <w:r>
+        <w:rPr>
+          <w:rFonts w:ascii="Times New Roman" w:hAnsi="Times New Roman" w:eastAsia="MS Mincho" w:cs="Times New Roman"/>
+          <w:noProof/>
+          <w:color w:val="000000" w:themeColor="text1" w:themeTint="FF" w:themeShade="FF"/>
+          <w:sz w:val="16"/>
+          <w:szCs w:val="16"/>
+          <w:lang w:val="en-US"/>
+        </w:rPr>
+        <w:t xml:space="preserve">M. Abrar et al., “Reproducibility in Provenance-based Intrusion Detection Systems,” </w:t>
+      </w:r>
+      <w:r>
+        <w:rPr>
+          <w:rFonts w:ascii="Times New Roman" w:hAnsi="Times New Roman" w:eastAsia="MS Mincho" w:cs="Times New Roman"/>
+          <w:i w:val="1"/>
+          <w:iCs w:val="1"/>
+          <w:noProof/>
+          <w:color w:val="000000" w:themeColor="text1" w:themeTint="FF" w:themeShade="FF"/>
+          <w:sz w:val="16"/>
+          <w:szCs w:val="16"/>
+          <w:lang w:val="en-US"/>
+        </w:rPr>
+        <w:t>ACM Computing Surveys</w:t>
+      </w:r>
+      <w:r>
+        <w:rPr>
+          <w:rFonts w:ascii="Times New Roman" w:hAnsi="Times New Roman" w:eastAsia="MS Mincho" w:cs="Times New Roman"/>
+          <w:noProof/>
+          <w:color w:val="000000" w:themeColor="text1" w:themeTint="FF" w:themeShade="FF"/>
+          <w:sz w:val="16"/>
+          <w:szCs w:val="16"/>
+          <w:lang w:val="en-US"/>
+        </w:rPr>
+        <w:t xml:space="preserve">, 2025. </w:t>
+      </w:r>
+      <w:hyperlink r:id="Ra6e5e3e0273a4b79">
+        <w:r>
+          <w:rPr>
+            <w:rStyle w:val="Hyperlink"/>
+            <w:rFonts w:ascii="Times New Roman" w:hAnsi="Times New Roman" w:eastAsia="MS Mincho" w:cs="Times New Roman"/>
+            <w:noProof/>
+            <w:color w:val="000000" w:themeColor="text1" w:themeTint="FF" w:themeShade="FF"/>
+            <w:sz w:val="16"/>
+            <w:szCs w:val="16"/>
+            <w:lang w:val="en-US"/>
+          </w:rPr>
+          <w:t>https://doi.org/10.1145/3595764</w:t>
+        </w:r>
+      </w:hyperlink>
+    </w:p>
+    <w:p>
+      <w:pPr>
+        <w:pStyle w:val="references"/>
+        <w:jc w:val="start"/>
+        <w:rPr>
+          <w:rFonts w:ascii="Times New Roman" w:hAnsi="Times New Roman" w:eastAsia="MS Mincho" w:cs="Times New Roman"/>
+          <w:noProof/>
+          <w:color w:val="000000" w:themeColor="text1" w:themeTint="FF" w:themeShade="FF"/>
+          <w:sz w:val="16"/>
+          <w:szCs w:val="16"/>
+          <w:lang w:val="en-US"/>
+        </w:rPr>
+      </w:pPr>
+      <w:r>
+        <w:rPr>
+          <w:rFonts w:ascii="Times New Roman" w:hAnsi="Times New Roman" w:eastAsia="MS Mincho" w:cs="Times New Roman"/>
+          <w:noProof/>
+          <w:color w:val="000000" w:themeColor="text1" w:themeTint="FF" w:themeShade="FF"/>
+          <w:sz w:val="16"/>
+          <w:szCs w:val="16"/>
+          <w:lang w:val="en-US"/>
+        </w:rPr>
+        <w:t xml:space="preserve">K. Brodzik et al., “In-Kernel Machine Learning for Ransomware Detection,” </w:t>
+      </w:r>
+      <w:r>
+        <w:rPr>
+          <w:rFonts w:ascii="Times New Roman" w:hAnsi="Times New Roman" w:eastAsia="MS Mincho" w:cs="Times New Roman"/>
+          <w:i w:val="1"/>
+          <w:iCs w:val="1"/>
+          <w:noProof/>
+          <w:color w:val="000000" w:themeColor="text1" w:themeTint="FF" w:themeShade="FF"/>
+          <w:sz w:val="16"/>
+          <w:szCs w:val="16"/>
+          <w:lang w:val="en-US"/>
+        </w:rPr>
+        <w:t>arXiv preprint</w:t>
+      </w:r>
+      <w:r>
+        <w:rPr>
+          <w:rFonts w:ascii="Times New Roman" w:hAnsi="Times New Roman" w:eastAsia="MS Mincho" w:cs="Times New Roman"/>
+          <w:noProof/>
+          <w:color w:val="000000" w:themeColor="text1" w:themeTint="FF" w:themeShade="FF"/>
+          <w:sz w:val="16"/>
+          <w:szCs w:val="16"/>
+          <w:lang w:val="en-US"/>
+        </w:rPr>
+        <w:t>, 2024.</w:t>
+      </w:r>
     </w:p>
     <w:sectPr>
+      <w:headerReference w:type="default" r:id="rId15"/>
+      <w:footerReference w:type="default" r:id="rId16"/>
       <w:type w:val="continuous"/>
-      <w:pgSz w:w="595.30pt" w:h="841.90pt" w:code="9"/>
+      <w:pgSz w:w="595.3pt" w:h="841.9pt" w:orient="portrait" w:code="9"/>
       <w:pgMar w:top="54pt" w:right="44.65pt" w:bottom="72pt" w:left="44.65pt" w:header="36pt" w:footer="36pt" w:gutter="0pt"/>
-      <w:cols w:space="36pt"/>
+      <w:cols w:space="720"/>
       <w:docGrid w:linePitch="360"/>
     </w:sectPr>
   </w:body>
@@ -2318,6 +3837,66 @@
 </file>
 
 <file path=word/footer1.xml><?xml version="1.0" encoding="utf-8"?>
+<w:ftr xmlns:cx="http://schemas.microsoft.com/office/drawing/2014/chartex" xmlns:cx1="http://schemas.microsoft.com/office/drawing/2015/9/8/chartex" xmlns:cx2="http://schemas.microsoft.com/office/drawing/2015/10/21/chartex" xmlns:cx3="http://schemas.microsoft.com/office/drawing/2016/5/9/chartex" xmlns:cx4="http://schemas.microsoft.com/office/drawing/2016/5/10/chartex" xmlns:cx5="http://schemas.microsoft.com/office/drawing/2016/5/11/chartex" xmlns:cx6="http://schemas.microsoft.com/office/drawing/2016/5/12/chartex" xmlns:cx7="http://schemas.microsoft.com/office/drawing/2016/5/13/chartex" xmlns:cx8="http://schemas.microsoft.com/office/drawing/2016/5/14/chartex" xmlns:mc="http://schemas.openxmlformats.org/markup-compatibility/2006" xmlns:aink="http://schemas.microsoft.com/office/drawing/2016/ink" xmlns:am3d="http://schemas.microsoft.com/office/drawing/2017/model3d" xmlns:o="urn:schemas-microsoft-com:office:office" xmlns:oel="http://schemas.microsoft.com/office/2019/extlst" xmlns:r="http://purl.oclc.org/ooxml/officeDocument/relationships" xmlns:m="http://purl.oclc.org/ooxml/officeDocument/math" xmlns:v="urn:schemas-microsoft-com:vml" xmlns:wp14="http://schemas.microsoft.com/office/word/2010/wordprocessingDrawing" xmlns:wp="http://purl.oclc.org/ooxml/drawingml/wordprocessingDrawing" xmlns:w10="urn:schemas-microsoft-com:office:word" xmlns:w="http://purl.oclc.org/ooxml/wordprocessingml/main" xmlns:w14="http://schemas.microsoft.com/office/word/2010/wordml" xmlns:w15="http://schemas.microsoft.com/office/word/2012/wordml" xmlns:w16cex="http://schemas.microsoft.com/office/word/2018/wordml/cex" xmlns:w16cid="http://schemas.microsoft.com/office/word/2016/wordml/cid" xmlns:w16="http://schemas.microsoft.com/office/word/2018/wordml" xmlns:w16du="http://schemas.microsoft.com/office/word/2023/wordml/word16du" xmlns:w16sdtdh="http://schemas.microsoft.com/office/word/2020/wordml/sdtdatahash" xmlns:w16sdtfl="http://schemas.microsoft.com/office/word/2024/wordml/sdtformatlock" xmlns:w16se="http://schemas.microsoft.com/office/word/2015/wordml/symex" xmlns:wpi="http://schemas.microsoft.com/office/word/2010/wordprocessingInk" xmlns:wne="http://schemas.microsoft.com/office/word/2006/wordml" mc:Ignorable="w14 w15 w16se w16cid w16 w16cex w16sdtdh w16sdtfl w16du wne wp14">
+  <w:tbl>
+    <w:tblPr>
+      <w:tblW w:w="0pt" w:type="dxa"/>
+      <w:tblLook w:firstRow="1" w:lastRow="0" w:firstColumn="1" w:lastColumn="0" w:noHBand="1" w:noVBand="1"/>
+    </w:tblPr>
+    <w:tblGrid>
+      <w:gridCol w:w="3370"/>
+      <w:gridCol w:w="3370"/>
+      <w:gridCol w:w="3370"/>
+    </w:tblGrid>
+    <w:tr>
+      <w:trPr>
+        <w:trHeight w:val="300"/>
+      </w:trPr>
+      <w:tc>
+        <w:tcPr>
+          <w:tcW w:w="168.50pt" w:type="dxa"/>
+        </w:tcPr>
+        <w:p>
+          <w:pPr>
+            <w:pStyle w:val="Header"/>
+            <w:ind w:start="-2.25pt"/>
+            <w:jc w:val="start"/>
+          </w:pPr>
+        </w:p>
+      </w:tc>
+      <w:tc>
+        <w:tcPr>
+          <w:tcW w:w="168.50pt" w:type="dxa"/>
+        </w:tcPr>
+        <w:p>
+          <w:pPr>
+            <w:pStyle w:val="Header"/>
+          </w:pPr>
+        </w:p>
+      </w:tc>
+      <w:tc>
+        <w:tcPr>
+          <w:tcW w:w="168.50pt" w:type="dxa"/>
+        </w:tcPr>
+        <w:p>
+          <w:pPr>
+            <w:pStyle w:val="Header"/>
+            <w:ind w:end="-2.25pt"/>
+            <w:jc w:val="end"/>
+          </w:pPr>
+        </w:p>
+      </w:tc>
+    </w:tr>
+  </w:tbl>
+  <w:p>
+    <w:pPr>
+      <w:pStyle w:val="Footer"/>
+    </w:pPr>
+  </w:p>
+</w:ftr>
+</file>
+
+<file path=word/footer2.xml><?xml version="1.0" encoding="utf-8"?>
 <w:ftr xmlns:cx="http://schemas.microsoft.com/office/drawing/2014/chartex" xmlns:cx1="http://schemas.microsoft.com/office/drawing/2015/9/8/chartex" xmlns:cx2="http://schemas.microsoft.com/office/drawing/2015/10/21/chartex" xmlns:cx3="http://schemas.microsoft.com/office/drawing/2016/5/9/chartex" xmlns:cx4="http://schemas.microsoft.com/office/drawing/2016/5/10/chartex" xmlns:cx5="http://schemas.microsoft.com/office/drawing/2016/5/11/chartex" xmlns:cx6="http://schemas.microsoft.com/office/drawing/2016/5/12/chartex" xmlns:cx7="http://schemas.microsoft.com/office/drawing/2016/5/13/chartex" xmlns:cx8="http://schemas.microsoft.com/office/drawing/2016/5/14/chartex" xmlns:mc="http://schemas.openxmlformats.org/markup-compatibility/2006" xmlns:aink="http://schemas.microsoft.com/office/drawing/2016/ink" xmlns:am3d="http://schemas.microsoft.com/office/drawing/2017/model3d" xmlns:o="urn:schemas-microsoft-com:office:office" xmlns:oel="http://schemas.microsoft.com/office/2019/extlst" xmlns:r="http://purl.oclc.org/ooxml/officeDocument/relationships" xmlns:m="http://purl.oclc.org/ooxml/officeDocument/math" xmlns:v="urn:schemas-microsoft-com:vml" xmlns:wp14="http://schemas.microsoft.com/office/word/2010/wordprocessingDrawing" xmlns:wp="http://purl.oclc.org/ooxml/drawingml/wordprocessingDrawing" xmlns:w10="urn:schemas-microsoft-com:office:word" xmlns:w="http://purl.oclc.org/ooxml/wordprocessingml/main" xmlns:w14="http://schemas.microsoft.com/office/word/2010/wordml" xmlns:w15="http://schemas.microsoft.com/office/word/2012/wordml" xmlns:w16cex="http://schemas.microsoft.com/office/word/2018/wordml/cex" xmlns:w16cid="http://schemas.microsoft.com/office/word/2016/wordml/cid" xmlns:w16="http://schemas.microsoft.com/office/word/2018/wordml" xmlns:w16du="http://schemas.microsoft.com/office/word/2023/wordml/word16du" xmlns:w16sdtdh="http://schemas.microsoft.com/office/word/2020/wordml/sdtdatahash" xmlns:w16sdtfl="http://schemas.microsoft.com/office/word/2024/wordml/sdtformatlock" xmlns:w16se="http://schemas.microsoft.com/office/word/2015/wordml/symex" xmlns:wpi="http://schemas.microsoft.com/office/word/2010/wordprocessingInk" xmlns:wne="http://schemas.microsoft.com/office/word/2006/wordml" mc:Ignorable="w14 w15 w16se w16cid w16 w16cex w16sdtdh w16sdtfl w16du wne wp14">
   <w:p>
     <w:pPr>
@@ -2339,6 +3918,186 @@
 </w:ftr>
 </file>
 
+<file path=word/footer3.xml><?xml version="1.0" encoding="utf-8"?>
+<w:ftr xmlns:cx="http://schemas.microsoft.com/office/drawing/2014/chartex" xmlns:cx1="http://schemas.microsoft.com/office/drawing/2015/9/8/chartex" xmlns:cx2="http://schemas.microsoft.com/office/drawing/2015/10/21/chartex" xmlns:cx3="http://schemas.microsoft.com/office/drawing/2016/5/9/chartex" xmlns:cx4="http://schemas.microsoft.com/office/drawing/2016/5/10/chartex" xmlns:cx5="http://schemas.microsoft.com/office/drawing/2016/5/11/chartex" xmlns:cx6="http://schemas.microsoft.com/office/drawing/2016/5/12/chartex" xmlns:cx7="http://schemas.microsoft.com/office/drawing/2016/5/13/chartex" xmlns:cx8="http://schemas.microsoft.com/office/drawing/2016/5/14/chartex" xmlns:mc="http://schemas.openxmlformats.org/markup-compatibility/2006" xmlns:aink="http://schemas.microsoft.com/office/drawing/2016/ink" xmlns:am3d="http://schemas.microsoft.com/office/drawing/2017/model3d" xmlns:o="urn:schemas-microsoft-com:office:office" xmlns:oel="http://schemas.microsoft.com/office/2019/extlst" xmlns:r="http://purl.oclc.org/ooxml/officeDocument/relationships" xmlns:m="http://purl.oclc.org/ooxml/officeDocument/math" xmlns:v="urn:schemas-microsoft-com:vml" xmlns:wp14="http://schemas.microsoft.com/office/word/2010/wordprocessingDrawing" xmlns:wp="http://purl.oclc.org/ooxml/drawingml/wordprocessingDrawing" xmlns:w10="urn:schemas-microsoft-com:office:word" xmlns:w="http://purl.oclc.org/ooxml/wordprocessingml/main" xmlns:w14="http://schemas.microsoft.com/office/word/2010/wordml" xmlns:w15="http://schemas.microsoft.com/office/word/2012/wordml" xmlns:w16cex="http://schemas.microsoft.com/office/word/2018/wordml/cex" xmlns:w16cid="http://schemas.microsoft.com/office/word/2016/wordml/cid" xmlns:w16="http://schemas.microsoft.com/office/word/2018/wordml" xmlns:w16du="http://schemas.microsoft.com/office/word/2023/wordml/word16du" xmlns:w16sdtdh="http://schemas.microsoft.com/office/word/2020/wordml/sdtdatahash" xmlns:w16sdtfl="http://schemas.microsoft.com/office/word/2024/wordml/sdtformatlock" xmlns:w16se="http://schemas.microsoft.com/office/word/2015/wordml/symex" xmlns:wpi="http://schemas.microsoft.com/office/word/2010/wordprocessingInk" xmlns:wne="http://schemas.microsoft.com/office/word/2006/wordml" mc:Ignorable="w14 w15 w16se w16cid w16 w16cex w16sdtdh w16sdtfl w16du wne wp14">
+  <w:tbl>
+    <w:tblPr>
+      <w:tblW w:w="0pt" w:type="dxa"/>
+      <w:tblLook w:firstRow="1" w:lastRow="0" w:firstColumn="1" w:lastColumn="0" w:noHBand="1" w:noVBand="1"/>
+    </w:tblPr>
+    <w:tblGrid>
+      <w:gridCol w:w="3370"/>
+      <w:gridCol w:w="3370"/>
+      <w:gridCol w:w="3370"/>
+    </w:tblGrid>
+    <w:tr>
+      <w:trPr>
+        <w:trHeight w:val="300"/>
+      </w:trPr>
+      <w:tc>
+        <w:tcPr>
+          <w:tcW w:w="168.50pt" w:type="dxa"/>
+        </w:tcPr>
+        <w:p>
+          <w:pPr>
+            <w:pStyle w:val="Header"/>
+            <w:ind w:start="-2.25pt"/>
+            <w:jc w:val="start"/>
+          </w:pPr>
+        </w:p>
+      </w:tc>
+      <w:tc>
+        <w:tcPr>
+          <w:tcW w:w="168.50pt" w:type="dxa"/>
+        </w:tcPr>
+        <w:p>
+          <w:pPr>
+            <w:pStyle w:val="Header"/>
+          </w:pPr>
+        </w:p>
+      </w:tc>
+      <w:tc>
+        <w:tcPr>
+          <w:tcW w:w="168.50pt" w:type="dxa"/>
+        </w:tcPr>
+        <w:p>
+          <w:pPr>
+            <w:pStyle w:val="Header"/>
+            <w:ind w:end="-2.25pt"/>
+            <w:jc w:val="end"/>
+          </w:pPr>
+        </w:p>
+      </w:tc>
+    </w:tr>
+  </w:tbl>
+  <w:p>
+    <w:pPr>
+      <w:pStyle w:val="Footer"/>
+    </w:pPr>
+  </w:p>
+</w:ftr>
+</file>
+
+<file path=word/footer4.xml><?xml version="1.0" encoding="utf-8"?>
+<w:ftr xmlns:cx="http://schemas.microsoft.com/office/drawing/2014/chartex" xmlns:cx1="http://schemas.microsoft.com/office/drawing/2015/9/8/chartex" xmlns:cx2="http://schemas.microsoft.com/office/drawing/2015/10/21/chartex" xmlns:cx3="http://schemas.microsoft.com/office/drawing/2016/5/9/chartex" xmlns:cx4="http://schemas.microsoft.com/office/drawing/2016/5/10/chartex" xmlns:cx5="http://schemas.microsoft.com/office/drawing/2016/5/11/chartex" xmlns:cx6="http://schemas.microsoft.com/office/drawing/2016/5/12/chartex" xmlns:cx7="http://schemas.microsoft.com/office/drawing/2016/5/13/chartex" xmlns:cx8="http://schemas.microsoft.com/office/drawing/2016/5/14/chartex" xmlns:mc="http://schemas.openxmlformats.org/markup-compatibility/2006" xmlns:aink="http://schemas.microsoft.com/office/drawing/2016/ink" xmlns:am3d="http://schemas.microsoft.com/office/drawing/2017/model3d" xmlns:o="urn:schemas-microsoft-com:office:office" xmlns:oel="http://schemas.microsoft.com/office/2019/extlst" xmlns:r="http://purl.oclc.org/ooxml/officeDocument/relationships" xmlns:m="http://purl.oclc.org/ooxml/officeDocument/math" xmlns:v="urn:schemas-microsoft-com:vml" xmlns:wp14="http://schemas.microsoft.com/office/word/2010/wordprocessingDrawing" xmlns:wp="http://purl.oclc.org/ooxml/drawingml/wordprocessingDrawing" xmlns:w10="urn:schemas-microsoft-com:office:word" xmlns:w="http://purl.oclc.org/ooxml/wordprocessingml/main" xmlns:w14="http://schemas.microsoft.com/office/word/2010/wordml" xmlns:w15="http://schemas.microsoft.com/office/word/2012/wordml" xmlns:w16cex="http://schemas.microsoft.com/office/word/2018/wordml/cex" xmlns:w16cid="http://schemas.microsoft.com/office/word/2016/wordml/cid" xmlns:w16="http://schemas.microsoft.com/office/word/2018/wordml" xmlns:w16du="http://schemas.microsoft.com/office/word/2023/wordml/word16du" xmlns:w16sdtdh="http://schemas.microsoft.com/office/word/2020/wordml/sdtdatahash" xmlns:w16sdtfl="http://schemas.microsoft.com/office/word/2024/wordml/sdtformatlock" xmlns:w16se="http://schemas.microsoft.com/office/word/2015/wordml/symex" xmlns:wpi="http://schemas.microsoft.com/office/word/2010/wordprocessingInk" xmlns:wne="http://schemas.microsoft.com/office/word/2006/wordml" mc:Ignorable="w14 w15 w16se w16cid w16 w16cex w16sdtdh w16sdtfl w16du wne wp14">
+  <w:tbl>
+    <w:tblPr>
+      <w:tblW w:w="0pt" w:type="dxa"/>
+      <w:tblLook w:firstRow="1" w:lastRow="0" w:firstColumn="1" w:lastColumn="0" w:noHBand="1" w:noVBand="1"/>
+    </w:tblPr>
+    <w:tblGrid>
+      <w:gridCol w:w="3370"/>
+      <w:gridCol w:w="3370"/>
+      <w:gridCol w:w="3370"/>
+    </w:tblGrid>
+    <w:tr>
+      <w:trPr>
+        <w:trHeight w:val="300"/>
+      </w:trPr>
+      <w:tc>
+        <w:tcPr>
+          <w:tcW w:w="168.50pt" w:type="dxa"/>
+        </w:tcPr>
+        <w:p>
+          <w:pPr>
+            <w:pStyle w:val="Header"/>
+            <w:ind w:start="-2.25pt"/>
+            <w:jc w:val="start"/>
+          </w:pPr>
+        </w:p>
+      </w:tc>
+      <w:tc>
+        <w:tcPr>
+          <w:tcW w:w="168.50pt" w:type="dxa"/>
+        </w:tcPr>
+        <w:p>
+          <w:pPr>
+            <w:pStyle w:val="Header"/>
+          </w:pPr>
+        </w:p>
+      </w:tc>
+      <w:tc>
+        <w:tcPr>
+          <w:tcW w:w="168.50pt" w:type="dxa"/>
+        </w:tcPr>
+        <w:p>
+          <w:pPr>
+            <w:pStyle w:val="Header"/>
+            <w:ind w:end="-2.25pt"/>
+            <w:jc w:val="end"/>
+          </w:pPr>
+        </w:p>
+      </w:tc>
+    </w:tr>
+  </w:tbl>
+  <w:p>
+    <w:pPr>
+      <w:pStyle w:val="Footer"/>
+    </w:pPr>
+  </w:p>
+</w:ftr>
+</file>
+
+<file path=word/footer5.xml><?xml version="1.0" encoding="utf-8"?>
+<w:ftr xmlns:cx="http://schemas.microsoft.com/office/drawing/2014/chartex" xmlns:cx1="http://schemas.microsoft.com/office/drawing/2015/9/8/chartex" xmlns:cx2="http://schemas.microsoft.com/office/drawing/2015/10/21/chartex" xmlns:cx3="http://schemas.microsoft.com/office/drawing/2016/5/9/chartex" xmlns:cx4="http://schemas.microsoft.com/office/drawing/2016/5/10/chartex" xmlns:cx5="http://schemas.microsoft.com/office/drawing/2016/5/11/chartex" xmlns:cx6="http://schemas.microsoft.com/office/drawing/2016/5/12/chartex" xmlns:cx7="http://schemas.microsoft.com/office/drawing/2016/5/13/chartex" xmlns:cx8="http://schemas.microsoft.com/office/drawing/2016/5/14/chartex" xmlns:mc="http://schemas.openxmlformats.org/markup-compatibility/2006" xmlns:aink="http://schemas.microsoft.com/office/drawing/2016/ink" xmlns:am3d="http://schemas.microsoft.com/office/drawing/2017/model3d" xmlns:o="urn:schemas-microsoft-com:office:office" xmlns:oel="http://schemas.microsoft.com/office/2019/extlst" xmlns:r="http://purl.oclc.org/ooxml/officeDocument/relationships" xmlns:m="http://purl.oclc.org/ooxml/officeDocument/math" xmlns:v="urn:schemas-microsoft-com:vml" xmlns:wp14="http://schemas.microsoft.com/office/word/2010/wordprocessingDrawing" xmlns:wp="http://purl.oclc.org/ooxml/drawingml/wordprocessingDrawing" xmlns:w10="urn:schemas-microsoft-com:office:word" xmlns:w="http://purl.oclc.org/ooxml/wordprocessingml/main" xmlns:w14="http://schemas.microsoft.com/office/word/2010/wordml" xmlns:w15="http://schemas.microsoft.com/office/word/2012/wordml" xmlns:w16cex="http://schemas.microsoft.com/office/word/2018/wordml/cex" xmlns:w16cid="http://schemas.microsoft.com/office/word/2016/wordml/cid" xmlns:w16="http://schemas.microsoft.com/office/word/2018/wordml" xmlns:w16du="http://schemas.microsoft.com/office/word/2023/wordml/word16du" xmlns:w16sdtdh="http://schemas.microsoft.com/office/word/2020/wordml/sdtdatahash" xmlns:w16sdtfl="http://schemas.microsoft.com/office/word/2024/wordml/sdtformatlock" xmlns:w16se="http://schemas.microsoft.com/office/word/2015/wordml/symex" xmlns:wpi="http://schemas.microsoft.com/office/word/2010/wordprocessingInk" xmlns:wne="http://schemas.microsoft.com/office/word/2006/wordml" mc:Ignorable="w14 w15 w16se w16cid w16 w16cex w16sdtdh w16sdtfl w16du wne wp14">
+  <w:tbl>
+    <w:tblPr>
+      <w:tblW w:w="0pt" w:type="dxa"/>
+      <w:tblLook w:firstRow="1" w:lastRow="0" w:firstColumn="1" w:lastColumn="0" w:noHBand="1" w:noVBand="1"/>
+    </w:tblPr>
+    <w:tblGrid>
+      <w:gridCol w:w="3370"/>
+      <w:gridCol w:w="3370"/>
+      <w:gridCol w:w="3370"/>
+    </w:tblGrid>
+    <w:tr>
+      <w:trPr>
+        <w:trHeight w:val="300"/>
+      </w:trPr>
+      <w:tc>
+        <w:tcPr>
+          <w:tcW w:w="168.50pt" w:type="dxa"/>
+        </w:tcPr>
+        <w:p>
+          <w:pPr>
+            <w:pStyle w:val="Header"/>
+            <w:ind w:start="-2.25pt"/>
+            <w:jc w:val="start"/>
+          </w:pPr>
+        </w:p>
+      </w:tc>
+      <w:tc>
+        <w:tcPr>
+          <w:tcW w:w="168.50pt" w:type="dxa"/>
+        </w:tcPr>
+        <w:p>
+          <w:pPr>
+            <w:pStyle w:val="Header"/>
+          </w:pPr>
+        </w:p>
+      </w:tc>
+      <w:tc>
+        <w:tcPr>
+          <w:tcW w:w="168.50pt" w:type="dxa"/>
+        </w:tcPr>
+        <w:p>
+          <w:pPr>
+            <w:pStyle w:val="Header"/>
+            <w:ind w:end="-2.25pt"/>
+            <w:jc w:val="end"/>
+          </w:pPr>
+        </w:p>
+      </w:tc>
+    </w:tr>
+  </w:tbl>
+  <w:p>
+    <w:pPr>
+      <w:pStyle w:val="Footer"/>
+    </w:pPr>
+  </w:p>
+</w:ftr>
+</file>
+
 <file path=word/footnotes.xml><?xml version="1.0" encoding="utf-8"?>
 <w:footnotes xmlns:cx="http://schemas.microsoft.com/office/drawing/2014/chartex" xmlns:cx1="http://schemas.microsoft.com/office/drawing/2015/9/8/chartex" xmlns:cx2="http://schemas.microsoft.com/office/drawing/2015/10/21/chartex" xmlns:cx3="http://schemas.microsoft.com/office/drawing/2016/5/9/chartex" xmlns:cx4="http://schemas.microsoft.com/office/drawing/2016/5/10/chartex" xmlns:cx5="http://schemas.microsoft.com/office/drawing/2016/5/11/chartex" xmlns:cx6="http://schemas.microsoft.com/office/drawing/2016/5/12/chartex" xmlns:cx7="http://schemas.microsoft.com/office/drawing/2016/5/13/chartex" xmlns:cx8="http://schemas.microsoft.com/office/drawing/2016/5/14/chartex" xmlns:mc="http://schemas.openxmlformats.org/markup-compatibility/2006" xmlns:aink="http://schemas.microsoft.com/office/drawing/2016/ink" xmlns:am3d="http://schemas.microsoft.com/office/drawing/2017/model3d" xmlns:o="urn:schemas-microsoft-com:office:office" xmlns:oel="http://schemas.microsoft.com/office/2019/extlst" xmlns:r="http://purl.oclc.org/ooxml/officeDocument/relationships" xmlns:m="http://purl.oclc.org/ooxml/officeDocument/math" xmlns:v="urn:schemas-microsoft-com:vml" xmlns:wp14="http://schemas.microsoft.com/office/word/2010/wordprocessingDrawing" xmlns:wp="http://purl.oclc.org/ooxml/drawingml/wordprocessingDrawing" xmlns:w10="urn:schemas-microsoft-com:office:word" xmlns:w="http://purl.oclc.org/ooxml/wordprocessingml/main" xmlns:w14="http://schemas.microsoft.com/office/word/2010/wordml" xmlns:w15="http://schemas.microsoft.com/office/word/2012/wordml" xmlns:w16cex="http://schemas.microsoft.com/office/word/2018/wordml/cex" xmlns:w16cid="http://schemas.microsoft.com/office/word/2016/wordml/cid" xmlns:w16="http://schemas.microsoft.com/office/word/2018/wordml" xmlns:w16du="http://schemas.microsoft.com/office/word/2023/wordml/word16du" xmlns:w16sdtdh="http://schemas.microsoft.com/office/word/2020/wordml/sdtdatahash" xmlns:w16sdtfl="http://schemas.microsoft.com/office/word/2024/wordml/sdtformatlock" xmlns:w16se="http://schemas.microsoft.com/office/word/2015/wordml/symex" xmlns:wpi="http://schemas.microsoft.com/office/word/2010/wordprocessingInk" xmlns:wne="http://schemas.microsoft.com/office/word/2006/wordml" mc:Ignorable="w14 w15 w16se w16cid w16 w16cex w16sdtdh w16sdtfl w16du wne wp14">
   <w:footnote w:type="separator" w:id="-1">
@@ -2358,8 +4117,344 @@
 </w:footnotes>
 </file>
 
+<file path=word/header1.xml><?xml version="1.0" encoding="utf-8"?>
+<w:hdr xmlns:cx="http://schemas.microsoft.com/office/drawing/2014/chartex" xmlns:cx1="http://schemas.microsoft.com/office/drawing/2015/9/8/chartex" xmlns:cx2="http://schemas.microsoft.com/office/drawing/2015/10/21/chartex" xmlns:cx3="http://schemas.microsoft.com/office/drawing/2016/5/9/chartex" xmlns:cx4="http://schemas.microsoft.com/office/drawing/2016/5/10/chartex" xmlns:cx5="http://schemas.microsoft.com/office/drawing/2016/5/11/chartex" xmlns:cx6="http://schemas.microsoft.com/office/drawing/2016/5/12/chartex" xmlns:cx7="http://schemas.microsoft.com/office/drawing/2016/5/13/chartex" xmlns:cx8="http://schemas.microsoft.com/office/drawing/2016/5/14/chartex" xmlns:mc="http://schemas.openxmlformats.org/markup-compatibility/2006" xmlns:aink="http://schemas.microsoft.com/office/drawing/2016/ink" xmlns:am3d="http://schemas.microsoft.com/office/drawing/2017/model3d" xmlns:o="urn:schemas-microsoft-com:office:office" xmlns:oel="http://schemas.microsoft.com/office/2019/extlst" xmlns:r="http://purl.oclc.org/ooxml/officeDocument/relationships" xmlns:m="http://purl.oclc.org/ooxml/officeDocument/math" xmlns:v="urn:schemas-microsoft-com:vml" xmlns:wp14="http://schemas.microsoft.com/office/word/2010/wordprocessingDrawing" xmlns:wp="http://purl.oclc.org/ooxml/drawingml/wordprocessingDrawing" xmlns:w10="urn:schemas-microsoft-com:office:word" xmlns:w="http://purl.oclc.org/ooxml/wordprocessingml/main" xmlns:w14="http://schemas.microsoft.com/office/word/2010/wordml" xmlns:w15="http://schemas.microsoft.com/office/word/2012/wordml" xmlns:w16cex="http://schemas.microsoft.com/office/word/2018/wordml/cex" xmlns:w16cid="http://schemas.microsoft.com/office/word/2016/wordml/cid" xmlns:w16="http://schemas.microsoft.com/office/word/2018/wordml" xmlns:w16du="http://schemas.microsoft.com/office/word/2023/wordml/word16du" xmlns:w16sdtdh="http://schemas.microsoft.com/office/word/2020/wordml/sdtdatahash" xmlns:w16sdtfl="http://schemas.microsoft.com/office/word/2024/wordml/sdtformatlock" xmlns:w16se="http://schemas.microsoft.com/office/word/2015/wordml/symex" xmlns:wpi="http://schemas.microsoft.com/office/word/2010/wordprocessingInk" xmlns:wne="http://schemas.microsoft.com/office/word/2006/wordml" mc:Ignorable="w14 w15 w16se w16cid w16 w16cex w16sdtdh w16sdtfl w16du wne wp14">
+  <w:tbl>
+    <w:tblPr>
+      <w:tblW w:w="0pt" w:type="dxa"/>
+      <w:tblLook w:firstRow="1" w:lastRow="0" w:firstColumn="1" w:lastColumn="0" w:noHBand="1" w:noVBand="1"/>
+    </w:tblPr>
+    <w:tblGrid>
+      <w:gridCol w:w="3370"/>
+      <w:gridCol w:w="3370"/>
+      <w:gridCol w:w="3370"/>
+    </w:tblGrid>
+    <w:tr>
+      <w:trPr>
+        <w:trHeight w:val="300"/>
+      </w:trPr>
+      <w:tc>
+        <w:tcPr>
+          <w:tcW w:w="168.50pt" w:type="dxa"/>
+        </w:tcPr>
+        <w:p>
+          <w:pPr>
+            <w:pStyle w:val="Header"/>
+            <w:ind w:start="-2.25pt"/>
+            <w:jc w:val="start"/>
+          </w:pPr>
+        </w:p>
+      </w:tc>
+      <w:tc>
+        <w:tcPr>
+          <w:tcW w:w="168.50pt" w:type="dxa"/>
+        </w:tcPr>
+        <w:p>
+          <w:pPr>
+            <w:pStyle w:val="Header"/>
+          </w:pPr>
+        </w:p>
+      </w:tc>
+      <w:tc>
+        <w:tcPr>
+          <w:tcW w:w="168.50pt" w:type="dxa"/>
+        </w:tcPr>
+        <w:p>
+          <w:pPr>
+            <w:pStyle w:val="Header"/>
+            <w:ind w:end="-2.25pt"/>
+            <w:jc w:val="end"/>
+          </w:pPr>
+        </w:p>
+      </w:tc>
+    </w:tr>
+  </w:tbl>
+  <w:p>
+    <w:pPr>
+      <w:pStyle w:val="Header"/>
+    </w:pPr>
+  </w:p>
+</w:hdr>
+</file>
+
+<file path=word/header2.xml><?xml version="1.0" encoding="utf-8"?>
+<w:hdr xmlns:cx="http://schemas.microsoft.com/office/drawing/2014/chartex" xmlns:cx1="http://schemas.microsoft.com/office/drawing/2015/9/8/chartex" xmlns:cx2="http://schemas.microsoft.com/office/drawing/2015/10/21/chartex" xmlns:cx3="http://schemas.microsoft.com/office/drawing/2016/5/9/chartex" xmlns:cx4="http://schemas.microsoft.com/office/drawing/2016/5/10/chartex" xmlns:cx5="http://schemas.microsoft.com/office/drawing/2016/5/11/chartex" xmlns:cx6="http://schemas.microsoft.com/office/drawing/2016/5/12/chartex" xmlns:cx7="http://schemas.microsoft.com/office/drawing/2016/5/13/chartex" xmlns:cx8="http://schemas.microsoft.com/office/drawing/2016/5/14/chartex" xmlns:mc="http://schemas.openxmlformats.org/markup-compatibility/2006" xmlns:aink="http://schemas.microsoft.com/office/drawing/2016/ink" xmlns:am3d="http://schemas.microsoft.com/office/drawing/2017/model3d" xmlns:o="urn:schemas-microsoft-com:office:office" xmlns:oel="http://schemas.microsoft.com/office/2019/extlst" xmlns:r="http://purl.oclc.org/ooxml/officeDocument/relationships" xmlns:m="http://purl.oclc.org/ooxml/officeDocument/math" xmlns:v="urn:schemas-microsoft-com:vml" xmlns:wp14="http://schemas.microsoft.com/office/word/2010/wordprocessingDrawing" xmlns:wp="http://purl.oclc.org/ooxml/drawingml/wordprocessingDrawing" xmlns:w10="urn:schemas-microsoft-com:office:word" xmlns:w="http://purl.oclc.org/ooxml/wordprocessingml/main" xmlns:w14="http://schemas.microsoft.com/office/word/2010/wordml" xmlns:w15="http://schemas.microsoft.com/office/word/2012/wordml" xmlns:w16cex="http://schemas.microsoft.com/office/word/2018/wordml/cex" xmlns:w16cid="http://schemas.microsoft.com/office/word/2016/wordml/cid" xmlns:w16="http://schemas.microsoft.com/office/word/2018/wordml" xmlns:w16du="http://schemas.microsoft.com/office/word/2023/wordml/word16du" xmlns:w16sdtdh="http://schemas.microsoft.com/office/word/2020/wordml/sdtdatahash" xmlns:w16sdtfl="http://schemas.microsoft.com/office/word/2024/wordml/sdtformatlock" xmlns:w16se="http://schemas.microsoft.com/office/word/2015/wordml/symex" xmlns:wpi="http://schemas.microsoft.com/office/word/2010/wordprocessingInk" xmlns:wne="http://schemas.microsoft.com/office/word/2006/wordml" mc:Ignorable="w14 w15 w16se w16cid w16 w16cex w16sdtdh w16sdtfl w16du wne wp14">
+  <w:tbl>
+    <w:tblPr>
+      <w:tblW w:w="0pt" w:type="dxa"/>
+      <w:tblLook w:firstRow="1" w:lastRow="0" w:firstColumn="1" w:lastColumn="0" w:noHBand="1" w:noVBand="1"/>
+    </w:tblPr>
+    <w:tblGrid>
+      <w:gridCol w:w="3370"/>
+      <w:gridCol w:w="3370"/>
+      <w:gridCol w:w="3370"/>
+    </w:tblGrid>
+    <w:tr>
+      <w:trPr>
+        <w:trHeight w:val="300"/>
+      </w:trPr>
+      <w:tc>
+        <w:tcPr>
+          <w:tcW w:w="168.50pt" w:type="dxa"/>
+        </w:tcPr>
+        <w:p>
+          <w:pPr>
+            <w:pStyle w:val="Header"/>
+            <w:ind w:start="-2.25pt"/>
+            <w:jc w:val="start"/>
+          </w:pPr>
+        </w:p>
+      </w:tc>
+      <w:tc>
+        <w:tcPr>
+          <w:tcW w:w="168.50pt" w:type="dxa"/>
+        </w:tcPr>
+        <w:p>
+          <w:pPr>
+            <w:pStyle w:val="Header"/>
+          </w:pPr>
+        </w:p>
+      </w:tc>
+      <w:tc>
+        <w:tcPr>
+          <w:tcW w:w="168.50pt" w:type="dxa"/>
+        </w:tcPr>
+        <w:p>
+          <w:pPr>
+            <w:pStyle w:val="Header"/>
+            <w:ind w:end="-2.25pt"/>
+            <w:jc w:val="end"/>
+          </w:pPr>
+        </w:p>
+      </w:tc>
+    </w:tr>
+  </w:tbl>
+  <w:p>
+    <w:pPr>
+      <w:pStyle w:val="Header"/>
+    </w:pPr>
+  </w:p>
+</w:hdr>
+</file>
+
+<file path=word/header3.xml><?xml version="1.0" encoding="utf-8"?>
+<w:hdr xmlns:cx="http://schemas.microsoft.com/office/drawing/2014/chartex" xmlns:cx1="http://schemas.microsoft.com/office/drawing/2015/9/8/chartex" xmlns:cx2="http://schemas.microsoft.com/office/drawing/2015/10/21/chartex" xmlns:cx3="http://schemas.microsoft.com/office/drawing/2016/5/9/chartex" xmlns:cx4="http://schemas.microsoft.com/office/drawing/2016/5/10/chartex" xmlns:cx5="http://schemas.microsoft.com/office/drawing/2016/5/11/chartex" xmlns:cx6="http://schemas.microsoft.com/office/drawing/2016/5/12/chartex" xmlns:cx7="http://schemas.microsoft.com/office/drawing/2016/5/13/chartex" xmlns:cx8="http://schemas.microsoft.com/office/drawing/2016/5/14/chartex" xmlns:mc="http://schemas.openxmlformats.org/markup-compatibility/2006" xmlns:aink="http://schemas.microsoft.com/office/drawing/2016/ink" xmlns:am3d="http://schemas.microsoft.com/office/drawing/2017/model3d" xmlns:o="urn:schemas-microsoft-com:office:office" xmlns:oel="http://schemas.microsoft.com/office/2019/extlst" xmlns:r="http://purl.oclc.org/ooxml/officeDocument/relationships" xmlns:m="http://purl.oclc.org/ooxml/officeDocument/math" xmlns:v="urn:schemas-microsoft-com:vml" xmlns:wp14="http://schemas.microsoft.com/office/word/2010/wordprocessingDrawing" xmlns:wp="http://purl.oclc.org/ooxml/drawingml/wordprocessingDrawing" xmlns:w10="urn:schemas-microsoft-com:office:word" xmlns:w="http://purl.oclc.org/ooxml/wordprocessingml/main" xmlns:w14="http://schemas.microsoft.com/office/word/2010/wordml" xmlns:w15="http://schemas.microsoft.com/office/word/2012/wordml" xmlns:w16cex="http://schemas.microsoft.com/office/word/2018/wordml/cex" xmlns:w16cid="http://schemas.microsoft.com/office/word/2016/wordml/cid" xmlns:w16="http://schemas.microsoft.com/office/word/2018/wordml" xmlns:w16du="http://schemas.microsoft.com/office/word/2023/wordml/word16du" xmlns:w16sdtdh="http://schemas.microsoft.com/office/word/2020/wordml/sdtdatahash" xmlns:w16sdtfl="http://schemas.microsoft.com/office/word/2024/wordml/sdtformatlock" xmlns:w16se="http://schemas.microsoft.com/office/word/2015/wordml/symex" xmlns:wpi="http://schemas.microsoft.com/office/word/2010/wordprocessingInk" xmlns:wne="http://schemas.microsoft.com/office/word/2006/wordml" mc:Ignorable="w14 w15 w16se w16cid w16 w16cex w16sdtdh w16sdtfl w16du wne wp14">
+  <w:tbl>
+    <w:tblPr>
+      <w:tblW w:w="0pt" w:type="dxa"/>
+      <w:tblLook w:firstRow="1" w:lastRow="0" w:firstColumn="1" w:lastColumn="0" w:noHBand="1" w:noVBand="1"/>
+    </w:tblPr>
+    <w:tblGrid>
+      <w:gridCol w:w="3370"/>
+      <w:gridCol w:w="3370"/>
+      <w:gridCol w:w="3370"/>
+    </w:tblGrid>
+    <w:tr>
+      <w:trPr>
+        <w:trHeight w:val="300"/>
+      </w:trPr>
+      <w:tc>
+        <w:tcPr>
+          <w:tcW w:w="168.50pt" w:type="dxa"/>
+        </w:tcPr>
+        <w:p>
+          <w:pPr>
+            <w:pStyle w:val="Header"/>
+            <w:ind w:start="-2.25pt"/>
+            <w:jc w:val="start"/>
+          </w:pPr>
+        </w:p>
+      </w:tc>
+      <w:tc>
+        <w:tcPr>
+          <w:tcW w:w="168.50pt" w:type="dxa"/>
+        </w:tcPr>
+        <w:p>
+          <w:pPr>
+            <w:pStyle w:val="Header"/>
+          </w:pPr>
+        </w:p>
+      </w:tc>
+      <w:tc>
+        <w:tcPr>
+          <w:tcW w:w="168.50pt" w:type="dxa"/>
+        </w:tcPr>
+        <w:p>
+          <w:pPr>
+            <w:pStyle w:val="Header"/>
+            <w:ind w:end="-2.25pt"/>
+            <w:jc w:val="end"/>
+          </w:pPr>
+        </w:p>
+      </w:tc>
+    </w:tr>
+  </w:tbl>
+  <w:p>
+    <w:pPr>
+      <w:pStyle w:val="Header"/>
+    </w:pPr>
+  </w:p>
+</w:hdr>
+</file>
+
+<file path=word/header4.xml><?xml version="1.0" encoding="utf-8"?>
+<w:hdr xmlns:cx="http://schemas.microsoft.com/office/drawing/2014/chartex" xmlns:cx1="http://schemas.microsoft.com/office/drawing/2015/9/8/chartex" xmlns:cx2="http://schemas.microsoft.com/office/drawing/2015/10/21/chartex" xmlns:cx3="http://schemas.microsoft.com/office/drawing/2016/5/9/chartex" xmlns:cx4="http://schemas.microsoft.com/office/drawing/2016/5/10/chartex" xmlns:cx5="http://schemas.microsoft.com/office/drawing/2016/5/11/chartex" xmlns:cx6="http://schemas.microsoft.com/office/drawing/2016/5/12/chartex" xmlns:cx7="http://schemas.microsoft.com/office/drawing/2016/5/13/chartex" xmlns:cx8="http://schemas.microsoft.com/office/drawing/2016/5/14/chartex" xmlns:mc="http://schemas.openxmlformats.org/markup-compatibility/2006" xmlns:aink="http://schemas.microsoft.com/office/drawing/2016/ink" xmlns:am3d="http://schemas.microsoft.com/office/drawing/2017/model3d" xmlns:o="urn:schemas-microsoft-com:office:office" xmlns:oel="http://schemas.microsoft.com/office/2019/extlst" xmlns:r="http://purl.oclc.org/ooxml/officeDocument/relationships" xmlns:m="http://purl.oclc.org/ooxml/officeDocument/math" xmlns:v="urn:schemas-microsoft-com:vml" xmlns:wp14="http://schemas.microsoft.com/office/word/2010/wordprocessingDrawing" xmlns:wp="http://purl.oclc.org/ooxml/drawingml/wordprocessingDrawing" xmlns:w10="urn:schemas-microsoft-com:office:word" xmlns:w="http://purl.oclc.org/ooxml/wordprocessingml/main" xmlns:w14="http://schemas.microsoft.com/office/word/2010/wordml" xmlns:w15="http://schemas.microsoft.com/office/word/2012/wordml" xmlns:w16cex="http://schemas.microsoft.com/office/word/2018/wordml/cex" xmlns:w16cid="http://schemas.microsoft.com/office/word/2016/wordml/cid" xmlns:w16="http://schemas.microsoft.com/office/word/2018/wordml" xmlns:w16du="http://schemas.microsoft.com/office/word/2023/wordml/word16du" xmlns:w16sdtdh="http://schemas.microsoft.com/office/word/2020/wordml/sdtdatahash" xmlns:w16sdtfl="http://schemas.microsoft.com/office/word/2024/wordml/sdtformatlock" xmlns:w16se="http://schemas.microsoft.com/office/word/2015/wordml/symex" xmlns:wpi="http://schemas.microsoft.com/office/word/2010/wordprocessingInk" xmlns:wne="http://schemas.microsoft.com/office/word/2006/wordml" mc:Ignorable="w14 w15 w16se w16cid w16 w16cex w16sdtdh w16sdtfl w16du wne wp14">
+  <w:tbl>
+    <w:tblPr>
+      <w:tblW w:w="0pt" w:type="dxa"/>
+      <w:tblLook w:firstRow="1" w:lastRow="0" w:firstColumn="1" w:lastColumn="0" w:noHBand="1" w:noVBand="1"/>
+    </w:tblPr>
+    <w:tblGrid>
+      <w:gridCol w:w="3370"/>
+      <w:gridCol w:w="3370"/>
+      <w:gridCol w:w="3370"/>
+    </w:tblGrid>
+    <w:tr>
+      <w:trPr>
+        <w:trHeight w:val="300"/>
+      </w:trPr>
+      <w:tc>
+        <w:tcPr>
+          <w:tcW w:w="168.50pt" w:type="dxa"/>
+        </w:tcPr>
+        <w:p>
+          <w:pPr>
+            <w:pStyle w:val="Header"/>
+            <w:ind w:start="-2.25pt"/>
+            <w:jc w:val="start"/>
+          </w:pPr>
+        </w:p>
+      </w:tc>
+      <w:tc>
+        <w:tcPr>
+          <w:tcW w:w="168.50pt" w:type="dxa"/>
+        </w:tcPr>
+        <w:p>
+          <w:pPr>
+            <w:pStyle w:val="Header"/>
+          </w:pPr>
+        </w:p>
+      </w:tc>
+      <w:tc>
+        <w:tcPr>
+          <w:tcW w:w="168.50pt" w:type="dxa"/>
+        </w:tcPr>
+        <w:p>
+          <w:pPr>
+            <w:pStyle w:val="Header"/>
+            <w:ind w:end="-2.25pt"/>
+            <w:jc w:val="end"/>
+          </w:pPr>
+        </w:p>
+      </w:tc>
+    </w:tr>
+  </w:tbl>
+  <w:p>
+    <w:pPr>
+      <w:pStyle w:val="Header"/>
+    </w:pPr>
+  </w:p>
+</w:hdr>
+</file>
+
+<file path=word/intelligence2.xml><?xml version="1.0" encoding="utf-8"?>
+<int2:intelligence xmlns:int2="http://schemas.microsoft.com/office/intelligence/2020/intelligence">
+  <int2:observations>
+    <int2:bookmark int2:bookmarkName="_Int_FRZdFP4c" int2:invalidationBookmarkName="" int2:hashCode="gPKfWa3Qnu+iNr" int2:id="Y3ZWMPwn">
+      <int2:state int2:type="gram" int2:value="Rejected"/>
+    </int2:bookmark>
+  </int2:observations>
+  <int2:intelligenceSettings/>
+</int2:intelligence>
+</file>
+
 <file path=word/numbering.xml><?xml version="1.0" encoding="utf-8"?>
 <w:numbering xmlns:cx="http://schemas.microsoft.com/office/drawing/2014/chartex" xmlns:cx1="http://schemas.microsoft.com/office/drawing/2015/9/8/chartex" xmlns:cx2="http://schemas.microsoft.com/office/drawing/2015/10/21/chartex" xmlns:cx3="http://schemas.microsoft.com/office/drawing/2016/5/9/chartex" xmlns:cx4="http://schemas.microsoft.com/office/drawing/2016/5/10/chartex" xmlns:cx5="http://schemas.microsoft.com/office/drawing/2016/5/11/chartex" xmlns:cx6="http://schemas.microsoft.com/office/drawing/2016/5/12/chartex" xmlns:cx7="http://schemas.microsoft.com/office/drawing/2016/5/13/chartex" xmlns:cx8="http://schemas.microsoft.com/office/drawing/2016/5/14/chartex" xmlns:mc="http://schemas.openxmlformats.org/markup-compatibility/2006" xmlns:aink="http://schemas.microsoft.com/office/drawing/2016/ink" xmlns:am3d="http://schemas.microsoft.com/office/drawing/2017/model3d" xmlns:o="urn:schemas-microsoft-com:office:office" xmlns:oel="http://schemas.microsoft.com/office/2019/extlst" xmlns:r="http://purl.oclc.org/ooxml/officeDocument/relationships" xmlns:m="http://purl.oclc.org/ooxml/officeDocument/math" xmlns:v="urn:schemas-microsoft-com:vml" xmlns:wp14="http://schemas.microsoft.com/office/word/2010/wordprocessingDrawing" xmlns:wp="http://purl.oclc.org/ooxml/drawingml/wordprocessingDrawing" xmlns:w10="urn:schemas-microsoft-com:office:word" xmlns:w="http://purl.oclc.org/ooxml/wordprocessingml/main" xmlns:w14="http://schemas.microsoft.com/office/word/2010/wordml" xmlns:w15="http://schemas.microsoft.com/office/word/2012/wordml" xmlns:w16cex="http://schemas.microsoft.com/office/word/2018/wordml/cex" xmlns:w16cid="http://schemas.microsoft.com/office/word/2016/wordml/cid" xmlns:w16="http://schemas.microsoft.com/office/word/2018/wordml" xmlns:w16du="http://schemas.microsoft.com/office/word/2023/wordml/word16du" xmlns:w16sdtdh="http://schemas.microsoft.com/office/word/2020/wordml/sdtdatahash" xmlns:w16sdtfl="http://schemas.microsoft.com/office/word/2024/wordml/sdtformatlock" xmlns:w16se="http://schemas.microsoft.com/office/word/2015/wordml/symex" xmlns:wpi="http://schemas.microsoft.com/office/word/2010/wordprocessingInk" xmlns:wne="http://schemas.microsoft.com/office/word/2006/wordml" mc:Ignorable="w14 w15 w16se w16cid w16 w16cex w16sdtdh w16sdtfl w16du wne wp14">
+  <w:abstractNum xmlns:w="http://purl.oclc.org/ooxml/wordprocessingml/main" w:abstractNumId="21">
+    <w:nsid w:val="5010e7be"/>
+    <w:multiLevelType xmlns:w="http://purl.oclc.org/ooxml/wordprocessingml/main" w:val="hybridMultilevel"/>
+    <w:lvl xmlns:w="http://purl.oclc.org/ooxml/wordprocessingml/main" w:ilvl="0">
+      <w:start w:val="1"/>
+      <w:numFmt w:val="decimal"/>
+      <w:lvlText w:val="[%1]"/>
+      <w:lvlJc w:val="start"/>
+      <w:pPr>
+        <w:ind w:start="36pt" w:hanging="18pt"/>
+      </w:pPr>
+    </w:lvl>
+    <w:lvl xmlns:w="http://purl.oclc.org/ooxml/wordprocessingml/main" w:ilvl="1">
+      <w:start w:val="1"/>
+      <w:numFmt w:val="lowerLetter"/>
+      <w:lvlText w:val="%2."/>
+      <w:lvlJc w:val="start"/>
+      <w:pPr>
+        <w:ind w:start="72pt" w:hanging="18pt"/>
+      </w:pPr>
+    </w:lvl>
+    <w:lvl xmlns:w="http://purl.oclc.org/ooxml/wordprocessingml/main" w:ilvl="2">
+      <w:start w:val="1"/>
+      <w:numFmt w:val="lowerRoman"/>
+      <w:lvlText w:val="%3."/>
+      <w:lvlJc w:val="end"/>
+      <w:pPr>
+        <w:ind w:start="108pt" w:hanging="9pt"/>
+      </w:pPr>
+    </w:lvl>
+    <w:lvl xmlns:w="http://purl.oclc.org/ooxml/wordprocessingml/main" w:ilvl="3">
+      <w:start w:val="1"/>
+      <w:numFmt w:val="decimal"/>
+      <w:lvlText w:val="%4."/>
+      <w:lvlJc w:val="start"/>
+      <w:pPr>
+        <w:ind w:start="144pt" w:hanging="18pt"/>
+      </w:pPr>
+    </w:lvl>
+    <w:lvl xmlns:w="http://purl.oclc.org/ooxml/wordprocessingml/main" w:ilvl="4">
+      <w:start w:val="1"/>
+      <w:numFmt w:val="lowerLetter"/>
+      <w:lvlText w:val="%5."/>
+      <w:lvlJc w:val="start"/>
+      <w:pPr>
+        <w:ind w:start="180pt" w:hanging="18pt"/>
+      </w:pPr>
+    </w:lvl>
+    <w:lvl xmlns:w="http://purl.oclc.org/ooxml/wordprocessingml/main" w:ilvl="5">
+      <w:start w:val="1"/>
+      <w:numFmt w:val="lowerRoman"/>
+      <w:lvlText w:val="%6."/>
+      <w:lvlJc w:val="end"/>
+      <w:pPr>
+        <w:ind w:start="216pt" w:hanging="9pt"/>
+      </w:pPr>
+    </w:lvl>
+    <w:lvl xmlns:w="http://purl.oclc.org/ooxml/wordprocessingml/main" w:ilvl="6">
+      <w:start w:val="1"/>
+      <w:numFmt w:val="decimal"/>
+      <w:lvlText w:val="%7."/>
+      <w:lvlJc w:val="start"/>
+      <w:pPr>
+        <w:ind w:start="252pt" w:hanging="18pt"/>
+      </w:pPr>
+    </w:lvl>
+    <w:lvl xmlns:w="http://purl.oclc.org/ooxml/wordprocessingml/main" w:ilvl="7">
+      <w:start w:val="1"/>
+      <w:numFmt w:val="lowerLetter"/>
+      <w:lvlText w:val="%8."/>
+      <w:lvlJc w:val="start"/>
+      <w:pPr>
+        <w:ind w:start="288pt" w:hanging="18pt"/>
+      </w:pPr>
+    </w:lvl>
+    <w:lvl xmlns:w="http://purl.oclc.org/ooxml/wordprocessingml/main" w:ilvl="8">
+      <w:start w:val="1"/>
+      <w:numFmt w:val="lowerRoman"/>
+      <w:lvlText w:val="%9."/>
+      <w:lvlJc w:val="end"/>
+      <w:pPr>
+        <w:ind w:start="324pt" w:hanging="9pt"/>
+      </w:pPr>
+    </w:lvl>
+  </w:abstractNum>
   <w:abstractNum w:abstractNumId="0" w15:restartNumberingAfterBreak="0">
     <w:nsid w:val="FFFFFF1D"/>
     <w:multiLevelType w:val="multilevel"/>
@@ -2376,7 +4471,7 @@
         <w:ind w:start="0pt" w:firstLine="0pt"/>
       </w:pPr>
       <w:rPr>
-        <w:rFonts w:ascii="Symbol" w:hAnsi="Symbol" w:hint="default"/>
+        <w:rFonts w:hint="default" w:ascii="Symbol" w:hAnsi="Symbol"/>
       </w:rPr>
     </w:lvl>
     <w:lvl w:ilvl="1">
@@ -2391,7 +4486,7 @@
         <w:ind w:start="54pt" w:hanging="18pt"/>
       </w:pPr>
       <w:rPr>
-        <w:rFonts w:ascii="Symbol" w:hAnsi="Symbol" w:hint="default"/>
+        <w:rFonts w:hint="default" w:ascii="Symbol" w:hAnsi="Symbol"/>
       </w:rPr>
     </w:lvl>
     <w:lvl w:ilvl="2">
@@ -2406,7 +4501,7 @@
         <w:ind w:start="90pt" w:hanging="18pt"/>
       </w:pPr>
       <w:rPr>
-        <w:rFonts w:ascii="Courier New" w:hAnsi="Courier New" w:cs="Courier New" w:hint="default"/>
+        <w:rFonts w:hint="default" w:ascii="Courier New" w:hAnsi="Courier New" w:cs="Courier New"/>
       </w:rPr>
     </w:lvl>
     <w:lvl w:ilvl="3">
@@ -2421,7 +4516,7 @@
         <w:ind w:start="126pt" w:hanging="18pt"/>
       </w:pPr>
       <w:rPr>
-        <w:rFonts w:ascii="Wingdings" w:hAnsi="Wingdings" w:hint="default"/>
+        <w:rFonts w:hint="default" w:ascii="Wingdings" w:hAnsi="Wingdings"/>
       </w:rPr>
     </w:lvl>
     <w:lvl w:ilvl="4">
@@ -2436,7 +4531,7 @@
         <w:ind w:start="162pt" w:hanging="18pt"/>
       </w:pPr>
       <w:rPr>
-        <w:rFonts w:ascii="Wingdings" w:hAnsi="Wingdings" w:hint="default"/>
+        <w:rFonts w:hint="default" w:ascii="Wingdings" w:hAnsi="Wingdings"/>
       </w:rPr>
     </w:lvl>
     <w:lvl w:ilvl="5">
@@ -2451,7 +4546,7 @@
         <w:ind w:start="198pt" w:hanging="18pt"/>
       </w:pPr>
       <w:rPr>
-        <w:rFonts w:ascii="Symbol" w:hAnsi="Symbol" w:hint="default"/>
+        <w:rFonts w:hint="default" w:ascii="Symbol" w:hAnsi="Symbol"/>
       </w:rPr>
     </w:lvl>
     <w:lvl w:ilvl="6">
@@ -2466,7 +4561,7 @@
         <w:ind w:start="234pt" w:hanging="18pt"/>
       </w:pPr>
       <w:rPr>
-        <w:rFonts w:ascii="Courier New" w:hAnsi="Courier New" w:cs="Courier New" w:hint="default"/>
+        <w:rFonts w:hint="default" w:ascii="Courier New" w:hAnsi="Courier New" w:cs="Courier New"/>
       </w:rPr>
     </w:lvl>
     <w:lvl w:ilvl="7">
@@ -2481,7 +4576,7 @@
         <w:ind w:start="270pt" w:hanging="18pt"/>
       </w:pPr>
       <w:rPr>
-        <w:rFonts w:ascii="Wingdings" w:hAnsi="Wingdings" w:hint="default"/>
+        <w:rFonts w:hint="default" w:ascii="Wingdings" w:hAnsi="Wingdings"/>
       </w:rPr>
     </w:lvl>
     <w:lvl w:ilvl="8">
@@ -2496,7 +4591,7 @@
         <w:ind w:start="306pt" w:hanging="18pt"/>
       </w:pPr>
       <w:rPr>
-        <w:rFonts w:ascii="Wingdings" w:hAnsi="Wingdings" w:hint="default"/>
+        <w:rFonts w:hint="default" w:ascii="Wingdings" w:hAnsi="Wingdings"/>
       </w:rPr>
     </w:lvl>
   </w:abstractNum>
@@ -2584,7 +4679,7 @@
         <w:ind w:start="74.60pt" w:hanging="18pt"/>
       </w:pPr>
       <w:rPr>
-        <w:rFonts w:ascii="Symbol" w:hAnsi="Symbol" w:hint="default"/>
+        <w:rFonts w:hint="default" w:ascii="Symbol" w:hAnsi="Symbol"/>
       </w:rPr>
     </w:lvl>
   </w:abstractNum>
@@ -2604,7 +4699,7 @@
         <w:ind w:start="60.45pt" w:hanging="18pt"/>
       </w:pPr>
       <w:rPr>
-        <w:rFonts w:ascii="Symbol" w:hAnsi="Symbol" w:hint="default"/>
+        <w:rFonts w:hint="default" w:ascii="Symbol" w:hAnsi="Symbol"/>
       </w:rPr>
     </w:lvl>
   </w:abstractNum>
@@ -2624,7 +4719,7 @@
         <w:ind w:start="46.30pt" w:hanging="18pt"/>
       </w:pPr>
       <w:rPr>
-        <w:rFonts w:ascii="Symbol" w:hAnsi="Symbol" w:hint="default"/>
+        <w:rFonts w:hint="default" w:ascii="Symbol" w:hAnsi="Symbol"/>
       </w:rPr>
     </w:lvl>
   </w:abstractNum>
@@ -2644,7 +4739,7 @@
         <w:ind w:start="32.15pt" w:hanging="18pt"/>
       </w:pPr>
       <w:rPr>
-        <w:rFonts w:ascii="Symbol" w:hAnsi="Symbol" w:hint="default"/>
+        <w:rFonts w:hint="default" w:ascii="Symbol" w:hAnsi="Symbol"/>
       </w:rPr>
     </w:lvl>
   </w:abstractNum>
@@ -2681,7 +4776,7 @@
         <w:ind w:start="18pt" w:hanging="18pt"/>
       </w:pPr>
       <w:rPr>
-        <w:rFonts w:ascii="Symbol" w:hAnsi="Symbol" w:hint="default"/>
+        <w:rFonts w:hint="default" w:ascii="Symbol" w:hAnsi="Symbol"/>
       </w:rPr>
     </w:lvl>
   </w:abstractNum>
@@ -2787,7 +4882,7 @@
         <w:ind w:start="36pt" w:hanging="18pt"/>
       </w:pPr>
       <w:rPr>
-        <w:rFonts w:cs="Times New Roman" w:hint="default"/>
+        <w:rFonts w:hint="default" w:cs="Times New Roman"/>
         <w:i w:val="0"/>
         <w:iCs w:val="0"/>
       </w:rPr>
@@ -2930,7 +5025,7 @@
         <w:ind w:firstLine="14.40pt"/>
       </w:pPr>
       <w:rPr>
-        <w:rFonts w:ascii="Times New Roman" w:hAnsi="Times New Roman" w:cs="Times New Roman" w:hint="default"/>
+        <w:rFonts w:hint="default" w:ascii="Times New Roman" w:hAnsi="Times New Roman" w:cs="Times New Roman"/>
         <w:b w:val="0"/>
         <w:bCs w:val="0"/>
         <w:i w:val="0"/>
@@ -3091,7 +5186,7 @@
         <w:ind w:start="32.40pt" w:hanging="18pt"/>
       </w:pPr>
       <w:rPr>
-        <w:rFonts w:ascii="Symbol" w:hAnsi="Symbol" w:hint="default"/>
+        <w:rFonts w:hint="default" w:ascii="Symbol" w:hAnsi="Symbol"/>
       </w:rPr>
     </w:lvl>
     <w:lvl w:ilvl="1" w:tplc="04090003">
@@ -3106,7 +5201,7 @@
         <w:ind w:start="72pt" w:hanging="18pt"/>
       </w:pPr>
       <w:rPr>
-        <w:rFonts w:ascii="Courier New" w:hAnsi="Courier New" w:hint="default"/>
+        <w:rFonts w:hint="default" w:ascii="Courier New" w:hAnsi="Courier New"/>
       </w:rPr>
     </w:lvl>
     <w:lvl w:ilvl="2" w:tplc="04090005">
@@ -3121,7 +5216,7 @@
         <w:ind w:start="108pt" w:hanging="18pt"/>
       </w:pPr>
       <w:rPr>
-        <w:rFonts w:ascii="Wingdings" w:hAnsi="Wingdings" w:hint="default"/>
+        <w:rFonts w:hint="default" w:ascii="Wingdings" w:hAnsi="Wingdings"/>
       </w:rPr>
     </w:lvl>
     <w:lvl w:ilvl="3" w:tplc="04090001">
@@ -3136,7 +5231,7 @@
         <w:ind w:start="144pt" w:hanging="18pt"/>
       </w:pPr>
       <w:rPr>
-        <w:rFonts w:ascii="Symbol" w:hAnsi="Symbol" w:hint="default"/>
+        <w:rFonts w:hint="default" w:ascii="Symbol" w:hAnsi="Symbol"/>
       </w:rPr>
     </w:lvl>
     <w:lvl w:ilvl="4" w:tplc="04090003">
@@ -3151,7 +5246,7 @@
         <w:ind w:start="180pt" w:hanging="18pt"/>
       </w:pPr>
       <w:rPr>
-        <w:rFonts w:ascii="Courier New" w:hAnsi="Courier New" w:hint="default"/>
+        <w:rFonts w:hint="default" w:ascii="Courier New" w:hAnsi="Courier New"/>
       </w:rPr>
     </w:lvl>
     <w:lvl w:ilvl="5" w:tplc="04090005">
@@ -3166,7 +5261,7 @@
         <w:ind w:start="216pt" w:hanging="18pt"/>
       </w:pPr>
       <w:rPr>
-        <w:rFonts w:ascii="Wingdings" w:hAnsi="Wingdings" w:hint="default"/>
+        <w:rFonts w:hint="default" w:ascii="Wingdings" w:hAnsi="Wingdings"/>
       </w:rPr>
     </w:lvl>
     <w:lvl w:ilvl="6" w:tplc="04090001">
@@ -3181,7 +5276,7 @@
         <w:ind w:start="252pt" w:hanging="18pt"/>
       </w:pPr>
       <w:rPr>
-        <w:rFonts w:ascii="Symbol" w:hAnsi="Symbol" w:hint="default"/>
+        <w:rFonts w:hint="default" w:ascii="Symbol" w:hAnsi="Symbol"/>
       </w:rPr>
     </w:lvl>
     <w:lvl w:ilvl="7" w:tplc="04090003">
@@ -3196,7 +5291,7 @@
         <w:ind w:start="288pt" w:hanging="18pt"/>
       </w:pPr>
       <w:rPr>
-        <w:rFonts w:ascii="Courier New" w:hAnsi="Courier New" w:hint="default"/>
+        <w:rFonts w:hint="default" w:ascii="Courier New" w:hAnsi="Courier New"/>
       </w:rPr>
     </w:lvl>
     <w:lvl w:ilvl="8" w:tplc="04090005">
@@ -3211,7 +5306,7 @@
         <w:ind w:start="324pt" w:hanging="18pt"/>
       </w:pPr>
       <w:rPr>
-        <w:rFonts w:ascii="Wingdings" w:hAnsi="Wingdings" w:hint="default"/>
+        <w:rFonts w:hint="default" w:ascii="Wingdings" w:hAnsi="Wingdings"/>
       </w:rPr>
     </w:lvl>
   </w:abstractNum>
@@ -3231,7 +5326,7 @@
         <w:ind w:start="36pt" w:hanging="18pt"/>
       </w:pPr>
       <w:rPr>
-        <w:rFonts w:cs="Times New Roman" w:hint="default"/>
+        <w:rFonts w:hint="default" w:cs="Times New Roman"/>
       </w:rPr>
     </w:lvl>
   </w:abstractNum>
@@ -3252,7 +5347,7 @@
         <w:ind w:firstLine="10.80pt"/>
       </w:pPr>
       <w:rPr>
-        <w:rFonts w:ascii="Times New Roman" w:hAnsi="Times New Roman" w:cs="Times New Roman" w:hint="default"/>
+        <w:rFonts w:hint="default" w:ascii="Times New Roman" w:hAnsi="Times New Roman" w:cs="Times New Roman"/>
         <w:caps w:val="0"/>
         <w:strike w:val="0"/>
         <w:dstrike w:val="0"/>
@@ -3284,7 +5379,7 @@
         <w:ind w:start="14.40pt" w:hanging="14.40pt"/>
       </w:pPr>
       <w:rPr>
-        <w:rFonts w:ascii="Times New Roman" w:hAnsi="Times New Roman" w:cs="Times New Roman" w:hint="default"/>
+        <w:rFonts w:hint="default" w:ascii="Times New Roman" w:hAnsi="Times New Roman" w:cs="Times New Roman"/>
         <w:b w:val="0"/>
         <w:bCs w:val="0"/>
         <w:i/>
@@ -3320,7 +5415,7 @@
         <w:ind w:firstLine="9pt"/>
       </w:pPr>
       <w:rPr>
-        <w:rFonts w:ascii="Times New Roman" w:hAnsi="Times New Roman" w:cs="Times New Roman" w:hint="default"/>
+        <w:rFonts w:hint="default" w:ascii="Times New Roman" w:hAnsi="Times New Roman" w:cs="Times New Roman"/>
         <w:b w:val="0"/>
         <w:bCs w:val="0"/>
         <w:i/>
@@ -3356,7 +5451,7 @@
         <w:ind w:firstLine="18pt"/>
       </w:pPr>
       <w:rPr>
-        <w:rFonts w:ascii="Times New Roman" w:hAnsi="Times New Roman" w:cs="Times New Roman" w:hint="default"/>
+        <w:rFonts w:hint="default" w:ascii="Times New Roman" w:hAnsi="Times New Roman" w:cs="Times New Roman"/>
         <w:b w:val="0"/>
         <w:bCs w:val="0"/>
         <w:i/>
@@ -3378,7 +5473,7 @@
         <w:ind w:start="144pt"/>
       </w:pPr>
       <w:rPr>
-        <w:rFonts w:cs="Times New Roman" w:hint="default"/>
+        <w:rFonts w:hint="default" w:cs="Times New Roman"/>
       </w:rPr>
     </w:lvl>
     <w:lvl w:ilvl="5">
@@ -3393,7 +5488,7 @@
         <w:ind w:start="180pt"/>
       </w:pPr>
       <w:rPr>
-        <w:rFonts w:cs="Times New Roman" w:hint="default"/>
+        <w:rFonts w:hint="default" w:cs="Times New Roman"/>
       </w:rPr>
     </w:lvl>
     <w:lvl w:ilvl="6">
@@ -3408,7 +5503,7 @@
         <w:ind w:start="216pt"/>
       </w:pPr>
       <w:rPr>
-        <w:rFonts w:cs="Times New Roman" w:hint="default"/>
+        <w:rFonts w:hint="default" w:cs="Times New Roman"/>
       </w:rPr>
     </w:lvl>
     <w:lvl w:ilvl="7">
@@ -3423,7 +5518,7 @@
         <w:ind w:start="252pt"/>
       </w:pPr>
       <w:rPr>
-        <w:rFonts w:cs="Times New Roman" w:hint="default"/>
+        <w:rFonts w:hint="default" w:cs="Times New Roman"/>
       </w:rPr>
     </w:lvl>
     <w:lvl w:ilvl="8">
@@ -3438,7 +5533,7 @@
         <w:ind w:start="288pt"/>
       </w:pPr>
       <w:rPr>
-        <w:rFonts w:cs="Times New Roman" w:hint="default"/>
+        <w:rFonts w:hint="default" w:cs="Times New Roman"/>
       </w:rPr>
     </w:lvl>
   </w:abstractNum>
@@ -3456,7 +5551,7 @@
         <w:ind w:start="20.90pt" w:hanging="18pt"/>
       </w:pPr>
       <w:rPr>
-        <w:rFonts w:ascii="Times New Roman" w:hAnsi="Times New Roman" w:hint="default"/>
+        <w:rFonts w:hint="default" w:ascii="Times New Roman" w:hAnsi="Times New Roman"/>
         <w:b w:val="0"/>
         <w:i w:val="0"/>
         <w:caps w:val="0"/>
@@ -3570,7 +5665,7 @@
         <w:ind w:start="18pt" w:hanging="18pt"/>
       </w:pPr>
       <w:rPr>
-        <w:rFonts w:ascii="Times New Roman" w:hAnsi="Times New Roman" w:cs="Times New Roman" w:hint="default"/>
+        <w:rFonts w:hint="default" w:ascii="Times New Roman" w:hAnsi="Times New Roman" w:cs="Times New Roman"/>
         <w:b w:val="0"/>
         <w:bCs w:val="0"/>
         <w:i w:val="0"/>
@@ -3594,7 +5689,7 @@
         <w:ind w:start="18pt" w:hanging="18pt"/>
       </w:pPr>
       <w:rPr>
-        <w:rFonts w:ascii="Times New Roman" w:hAnsi="Times New Roman" w:cs="Times New Roman" w:hint="default"/>
+        <w:rFonts w:hint="default" w:ascii="Times New Roman" w:hAnsi="Times New Roman" w:cs="Times New Roman"/>
         <w:b w:val="0"/>
         <w:bCs w:val="0"/>
         <w:i w:val="0"/>
@@ -3741,7 +5836,7 @@
         </w:tabs>
       </w:pPr>
       <w:rPr>
-        <w:rFonts w:ascii="Times New Roman" w:hAnsi="Times New Roman" w:cs="Times New Roman" w:hint="default"/>
+        <w:rFonts w:hint="default" w:ascii="Times New Roman" w:hAnsi="Times New Roman" w:cs="Times New Roman"/>
         <w:b w:val="0"/>
         <w:bCs w:val="0"/>
         <w:i w:val="0"/>
@@ -3751,6 +5846,9 @@
       </w:rPr>
     </w:lvl>
   </w:abstractNum>
+  <w:num w:numId="25">
+    <w:abstractNumId w:val="21"/>
+  </w:num>
   <w:num w:numId="1" w16cid:durableId="1369909383">
     <w:abstractNumId w:val="14"/>
   </w:num>
@@ -3827,11 +5925,11 @@
 </file>
 
 <file path=word/styles.xml><?xml version="1.0" encoding="utf-8"?>
-<w:styles xmlns:mc="http://schemas.openxmlformats.org/markup-compatibility/2006" xmlns:r="http://purl.oclc.org/ooxml/officeDocument/relationships" xmlns:w="http://purl.oclc.org/ooxml/wordprocessingml/main" xmlns:w14="http://schemas.microsoft.com/office/word/2010/wordml" xmlns:w15="http://schemas.microsoft.com/office/word/2012/wordml" xmlns:w16cex="http://schemas.microsoft.com/office/word/2018/wordml/cex" xmlns:w16cid="http://schemas.microsoft.com/office/word/2016/wordml/cid" xmlns:w16="http://schemas.microsoft.com/office/word/2018/wordml" xmlns:w16du="http://schemas.microsoft.com/office/word/2023/wordml/word16du" xmlns:w16sdtdh="http://schemas.microsoft.com/office/word/2020/wordml/sdtdatahash" xmlns:w16sdtfl="http://schemas.microsoft.com/office/word/2024/wordml/sdtformatlock" xmlns:w16se="http://schemas.microsoft.com/office/word/2015/wordml/symex" mc:Ignorable="w14 w15 w16se w16cid w16 w16cex w16sdtdh w16sdtfl w16du">
+<w:styles xmlns:wp14="http://schemas.microsoft.com/office/word/2010/wordprocessingDrawing" xmlns:mc="http://schemas.openxmlformats.org/markup-compatibility/2006" xmlns:r="http://purl.oclc.org/ooxml/officeDocument/relationships" xmlns:w="http://purl.oclc.org/ooxml/wordprocessingml/main" xmlns:w14="http://schemas.microsoft.com/office/word/2010/wordml" xmlns:w15="http://schemas.microsoft.com/office/word/2012/wordml" xmlns:w16cex="http://schemas.microsoft.com/office/word/2018/wordml/cex" xmlns:w16cid="http://schemas.microsoft.com/office/word/2016/wordml/cid" xmlns:w16="http://schemas.microsoft.com/office/word/2018/wordml" xmlns:w16du="http://schemas.microsoft.com/office/word/2023/wordml/word16du" xmlns:w16sdtdh="http://schemas.microsoft.com/office/word/2020/wordml/sdtdatahash" xmlns:w16sdtfl="http://schemas.microsoft.com/office/word/2024/wordml/sdtformatlock" xmlns:w16se="http://schemas.microsoft.com/office/word/2015/wordml/symex" mc:Ignorable="w14 w15 w16se w16cid w16 w16cex w16sdtdh w16sdtfl w16du wp14">
   <w:docDefaults>
     <w:rPrDefault>
       <w:rPr>
-        <w:rFonts w:ascii="Times New Roman" w:eastAsia="SimSun" w:hAnsi="Times New Roman" w:cs="Times New Roman"/>
+        <w:rFonts w:ascii="Times New Roman" w:hAnsi="Times New Roman" w:eastAsia="SimSun" w:cs="Times New Roman"/>
         <w:lang w:val="en-US" w:eastAsia="en-US" w:bidi="ar-SA"/>
       </w:rPr>
     </w:rPrDefault>
@@ -3897,7 +5995,7 @@
     <w:lsdException w:name="Table Web 2" w:semiHidden="1" w:unhideWhenUsed="1"/>
     <w:lsdException w:name="Table Web 3" w:semiHidden="1" w:unhideWhenUsed="1"/>
     <w:lsdException w:name="Table Theme" w:semiHidden="1" w:unhideWhenUsed="1"/>
-    <w:lsdException w:name="Placeholder Text" w:semiHidden="1" w:uiPriority="99"/>
+    <w:lsdException w:name="Placeholder Text" w:uiPriority="99" w:semiHidden="1"/>
     <w:lsdException w:name="No Spacing" w:uiPriority="1" w:qFormat="1"/>
     <w:lsdException w:name="Light Shading" w:uiPriority="60"/>
     <w:lsdException w:name="Light List" w:uiPriority="61"/>
@@ -3919,7 +6017,7 @@
     <w:lsdException w:name="Medium Shading 1 Accent 1" w:uiPriority="63"/>
     <w:lsdException w:name="Medium Shading 2 Accent 1" w:uiPriority="64"/>
     <w:lsdException w:name="Medium List 1 Accent 1" w:uiPriority="65"/>
-    <w:lsdException w:name="Revision" w:semiHidden="1" w:uiPriority="99"/>
+    <w:lsdException w:name="Revision" w:uiPriority="99" w:semiHidden="1"/>
     <w:lsdException w:name="List Paragraph" w:uiPriority="34" w:qFormat="1"/>
     <w:lsdException w:name="Quote" w:uiPriority="29" w:qFormat="1"/>
     <w:lsdException w:name="Intense Quote" w:uiPriority="30" w:qFormat="1"/>
@@ -4006,8 +6104,8 @@
     <w:lsdException w:name="Subtle Reference" w:uiPriority="31" w:qFormat="1"/>
     <w:lsdException w:name="Intense Reference" w:uiPriority="32" w:qFormat="1"/>
     <w:lsdException w:name="Book Title" w:uiPriority="33" w:qFormat="1"/>
-    <w:lsdException w:name="Bibliography" w:semiHidden="1" w:uiPriority="37" w:unhideWhenUsed="1"/>
-    <w:lsdException w:name="TOC Heading" w:semiHidden="1" w:uiPriority="39" w:unhideWhenUsed="1" w:qFormat="1"/>
+    <w:lsdException w:name="Bibliography" w:uiPriority="37" w:semiHidden="1" w:unhideWhenUsed="1"/>
+    <w:lsdException w:name="TOC Heading" w:uiPriority="39" w:semiHidden="1" w:unhideWhenUsed="1" w:qFormat="1"/>
     <w:lsdException w:name="Plain Table 1" w:uiPriority="41"/>
     <w:lsdException w:name="Plain Table 2" w:uiPriority="42"/>
     <w:lsdException w:name="Plain Table 3" w:uiPriority="43"/>
@@ -4112,13 +6210,13 @@
     <w:lsdException w:name="List Table 5 Dark Accent 6" w:uiPriority="50"/>
     <w:lsdException w:name="List Table 6 Colorful Accent 6" w:uiPriority="51"/>
     <w:lsdException w:name="List Table 7 Colorful Accent 6" w:uiPriority="52"/>
-    <w:lsdException w:name="Mention" w:semiHidden="1" w:uiPriority="99" w:unhideWhenUsed="1"/>
-    <w:lsdException w:name="Smart Hyperlink" w:semiHidden="1" w:uiPriority="99" w:unhideWhenUsed="1"/>
-    <w:lsdException w:name="Hashtag" w:semiHidden="1" w:uiPriority="99" w:unhideWhenUsed="1"/>
-    <w:lsdException w:name="Unresolved Mention" w:semiHidden="1" w:uiPriority="99" w:unhideWhenUsed="1"/>
-    <w:lsdException w:name="Smart Link" w:semiHidden="1" w:uiPriority="99" w:unhideWhenUsed="1"/>
+    <w:lsdException w:name="Mention" w:uiPriority="99" w:semiHidden="1" w:unhideWhenUsed="1"/>
+    <w:lsdException w:name="Smart Hyperlink" w:uiPriority="99" w:semiHidden="1" w:unhideWhenUsed="1"/>
+    <w:lsdException w:name="Hashtag" w:uiPriority="99" w:semiHidden="1" w:unhideWhenUsed="1"/>
+    <w:lsdException w:name="Unresolved Mention" w:uiPriority="99" w:semiHidden="1" w:unhideWhenUsed="1"/>
+    <w:lsdException w:name="Smart Link" w:uiPriority="99" w:semiHidden="1" w:unhideWhenUsed="1"/>
   </w:latentStyles>
-  <w:style w:type="paragraph" w:default="1" w:styleId="Normal">
+  <w:style w:type="paragraph" w:styleId="Normal" w:default="1">
     <w:name w:val="Normal"/>
     <w:qFormat/>
     <w:pPr>
@@ -4241,13 +6339,13 @@
       <w:noProof/>
     </w:rPr>
   </w:style>
-  <w:style w:type="character" w:default="1" w:styleId="DefaultParagraphFont">
+  <w:style w:type="character" w:styleId="DefaultParagraphFont" w:default="1">
     <w:name w:val="Default Paragraph Font"/>
     <w:uiPriority w:val="1"/>
     <w:semiHidden/>
     <w:unhideWhenUsed/>
   </w:style>
-  <w:style w:type="table" w:default="1" w:styleId="TableNormal">
+  <w:style w:type="table" w:styleId="TableNormal" w:default="1">
     <w:name w:val="Normal Table"/>
     <w:uiPriority w:val="99"/>
     <w:semiHidden/>
@@ -4262,13 +6360,13 @@
       </w:tblCellMar>
     </w:tblPr>
   </w:style>
-  <w:style w:type="numbering" w:default="1" w:styleId="NoList">
+  <w:style w:type="numbering" w:styleId="NoList" w:default="1">
     <w:name w:val="No List"/>
     <w:uiPriority w:val="99"/>
     <w:semiHidden/>
     <w:unhideWhenUsed/>
   </w:style>
-  <w:style w:type="paragraph" w:customStyle="1" w:styleId="Abstract">
+  <w:style w:type="paragraph" w:styleId="Abstract" w:customStyle="1">
     <w:name w:val="Abstract"/>
     <w:rsid w:val="00972203"/>
     <w:pPr>
@@ -4283,13 +6381,13 @@
       <w:szCs w:val="18"/>
     </w:rPr>
   </w:style>
-  <w:style w:type="paragraph" w:customStyle="1" w:styleId="Affiliation">
+  <w:style w:type="paragraph" w:styleId="Affiliation" w:customStyle="1">
     <w:name w:val="Affiliation"/>
     <w:pPr>
       <w:jc w:val="center"/>
     </w:pPr>
   </w:style>
-  <w:style w:type="paragraph" w:customStyle="1" w:styleId="Author">
+  <w:style w:type="paragraph" w:styleId="Author" w:customStyle="1">
     <w:name w:val="Author"/>
     <w:pPr>
       <w:spacing w:before="18pt" w:after="2pt"/>
@@ -4319,7 +6417,7 @@
       <w:lang w:val="x-none" w:eastAsia="x-none"/>
     </w:rPr>
   </w:style>
-  <w:style w:type="character" w:customStyle="1" w:styleId="BodyTextChar">
+  <w:style w:type="character" w:styleId="BodyTextChar" w:customStyle="1">
     <w:name w:val="Body Text Char"/>
     <w:link w:val="BodyText"/>
     <w:rsid w:val="00E7596C"/>
@@ -4328,7 +6426,7 @@
       <w:lang w:val="x-none" w:eastAsia="x-none"/>
     </w:rPr>
   </w:style>
-  <w:style w:type="paragraph" w:customStyle="1" w:styleId="bulletlist">
+  <w:style w:type="paragraph" w:styleId="bulletlist" w:customStyle="1">
     <w:name w:val="bullet list"/>
     <w:basedOn w:val="BodyText"/>
     <w:rsid w:val="001B67DC"/>
@@ -4342,7 +6440,7 @@
       <w:ind w:start="28.80pt" w:hanging="14.40pt"/>
     </w:pPr>
   </w:style>
-  <w:style w:type="paragraph" w:customStyle="1" w:styleId="equation">
+  <w:style w:type="paragraph" w:styleId="equation" w:customStyle="1">
     <w:name w:val="equation"/>
     <w:basedOn w:val="Normal"/>
     <w:rsid w:val="008A2C7D"/>
@@ -4357,7 +6455,7 @@
       <w:rFonts w:ascii="Symbol" w:hAnsi="Symbol" w:cs="Symbol"/>
     </w:rPr>
   </w:style>
-  <w:style w:type="paragraph" w:customStyle="1" w:styleId="figurecaption">
+  <w:style w:type="paragraph" w:styleId="figurecaption" w:customStyle="1">
     <w:name w:val="figure caption"/>
     <w:rsid w:val="005B0344"/>
     <w:pPr>
@@ -4377,10 +6475,10 @@
       <w:szCs w:val="16"/>
     </w:rPr>
   </w:style>
-  <w:style w:type="paragraph" w:customStyle="1" w:styleId="footnote">
+  <w:style w:type="paragraph" w:styleId="footnote" w:customStyle="1">
     <w:name w:val="footnote"/>
     <w:pPr>
-      <w:framePr w:hSpace="9.35pt" w:vSpace="9.35pt" w:wrap="notBeside" w:vAnchor="text" w:hAnchor="page" w:x="306.05pt" w:y="28.85pt"/>
+      <w:framePr w:vSpace="9.35pt" w:hSpace="9.35pt" w:wrap="notBeside" w:hAnchor="page" w:vAnchor="text" w:x="306.05pt" w:y="28.85pt"/>
       <w:numPr>
         <w:numId w:val="3"/>
       </w:numPr>
@@ -4391,7 +6489,7 @@
       <w:szCs w:val="16"/>
     </w:rPr>
   </w:style>
-  <w:style w:type="paragraph" w:customStyle="1" w:styleId="papersubtitle">
+  <w:style w:type="paragraph" w:styleId="papersubtitle" w:customStyle="1">
     <w:name w:val="paper subtitle"/>
     <w:pPr>
       <w:spacing w:after="6pt"/>
@@ -4404,7 +6502,7 @@
       <w:szCs w:val="28"/>
     </w:rPr>
   </w:style>
-  <w:style w:type="paragraph" w:customStyle="1" w:styleId="papertitle">
+  <w:style w:type="paragraph" w:styleId="papertitle" w:customStyle="1">
     <w:name w:val="paper title"/>
     <w:pPr>
       <w:spacing w:after="6pt"/>
@@ -4417,7 +6515,7 @@
       <w:szCs w:val="48"/>
     </w:rPr>
   </w:style>
-  <w:style w:type="paragraph" w:customStyle="1" w:styleId="references">
+  <w:style w:type="paragraph" w:styleId="references" w:customStyle="1">
     <w:name w:val="references"/>
     <w:pPr>
       <w:numPr>
@@ -4433,12 +6531,12 @@
       <w:szCs w:val="16"/>
     </w:rPr>
   </w:style>
-  <w:style w:type="paragraph" w:customStyle="1" w:styleId="sponsors">
+  <w:style w:type="paragraph" w:styleId="sponsors" w:customStyle="1">
     <w:name w:val="sponsors"/>
     <w:pPr>
       <w:framePr w:wrap="auto" w:hAnchor="text" w:x="30.75pt" w:y="111.95pt"/>
       <w:pBdr>
-        <w:top w:val="single" w:sz="4" w:space="2" w:color="auto"/>
+        <w:top w:val="single" w:color="auto" w:sz="4" w:space="2"/>
       </w:pBdr>
       <w:ind w:firstLine="14.40pt"/>
     </w:pPr>
@@ -4447,7 +6545,7 @@
       <w:szCs w:val="16"/>
     </w:rPr>
   </w:style>
-  <w:style w:type="paragraph" w:customStyle="1" w:styleId="tablecolhead">
+  <w:style w:type="paragraph" w:styleId="tablecolhead" w:customStyle="1">
     <w:name w:val="table col head"/>
     <w:basedOn w:val="Normal"/>
     <w:rPr>
@@ -4457,7 +6555,7 @@
       <w:szCs w:val="16"/>
     </w:rPr>
   </w:style>
-  <w:style w:type="paragraph" w:customStyle="1" w:styleId="tablecolsubhead">
+  <w:style w:type="paragraph" w:styleId="tablecolsubhead" w:customStyle="1">
     <w:name w:val="table col subhead"/>
     <w:basedOn w:val="tablecolhead"/>
     <w:rPr>
@@ -4467,7 +6565,7 @@
       <w:szCs w:val="15"/>
     </w:rPr>
   </w:style>
-  <w:style w:type="paragraph" w:customStyle="1" w:styleId="tablecopy">
+  <w:style w:type="paragraph" w:styleId="tablecopy" w:customStyle="1">
     <w:name w:val="table copy"/>
     <w:pPr>
       <w:jc w:val="both"/>
@@ -4478,7 +6576,7 @@
       <w:szCs w:val="16"/>
     </w:rPr>
   </w:style>
-  <w:style w:type="paragraph" w:customStyle="1" w:styleId="tablefootnote">
+  <w:style w:type="paragraph" w:styleId="tablefootnote" w:customStyle="1">
     <w:name w:val="table footnote"/>
     <w:rsid w:val="005E2800"/>
     <w:pPr>
@@ -4494,7 +6592,7 @@
       <w:szCs w:val="12"/>
     </w:rPr>
   </w:style>
-  <w:style w:type="paragraph" w:customStyle="1" w:styleId="tablehead">
+  <w:style w:type="paragraph" w:styleId="tablehead" w:customStyle="1">
     <w:name w:val="table head"/>
     <w:pPr>
       <w:numPr>
@@ -4510,7 +6608,7 @@
       <w:szCs w:val="16"/>
     </w:rPr>
   </w:style>
-  <w:style w:type="paragraph" w:customStyle="1" w:styleId="Keywords">
+  <w:style w:type="paragraph" w:styleId="Keywords" w:customStyle="1">
     <w:name w:val="Keywords"/>
     <w:basedOn w:val="Abstract"/>
     <w:qFormat/>
@@ -4535,7 +6633,7 @@
       </w:tabs>
     </w:pPr>
   </w:style>
-  <w:style w:type="character" w:customStyle="1" w:styleId="HeaderChar">
+  <w:style w:type="character" w:styleId="HeaderChar" w:customStyle="1">
     <w:name w:val="Header Char"/>
     <w:basedOn w:val="DefaultParagraphFont"/>
     <w:link w:val="Header"/>
@@ -4553,17 +6651,43 @@
       </w:tabs>
     </w:pPr>
   </w:style>
-  <w:style w:type="character" w:customStyle="1" w:styleId="FooterChar">
+  <w:style w:type="character" w:styleId="FooterChar" w:customStyle="1">
     <w:name w:val="Footer Char"/>
     <w:basedOn w:val="DefaultParagraphFont"/>
     <w:link w:val="Footer"/>
     <w:rsid w:val="001A3B3D"/>
   </w:style>
+  <w:style w:type="table" w:styleId="TableGrid">
+    <w:name w:val="Table Grid"/>
+    <w:basedOn w:val="TableNormal"/>
+    <w:uiPriority w:val="59"/>
+    <w:rsid w:val="00FB4123"/>
+    <w:tblPr>
+      <w:tblBorders>
+        <w:top w:val="single" w:color="000000" w:themeColor="text1" w:sz="4" w:space="0"/>
+        <w:start w:val="single" w:color="000000" w:themeColor="text1" w:sz="4" w:space="0"/>
+        <w:bottom w:val="single" w:color="000000" w:themeColor="text1" w:sz="4" w:space="0"/>
+        <w:end w:val="single" w:color="000000" w:themeColor="text1" w:sz="4" w:space="0"/>
+        <w:insideH w:val="single" w:color="000000" w:themeColor="text1" w:sz="4" w:space="0"/>
+        <w:insideV w:val="single" w:color="000000" w:themeColor="text1" w:sz="4" w:space="0"/>
+      </w:tblBorders>
+    </w:tblPr>
+  </w:style>
+  <w:style xmlns:w14="http://schemas.microsoft.com/office/word/2010/wordml" xmlns:mc="http://schemas.openxmlformats.org/markup-compatibility/2006" xmlns:w="http://purl.oclc.org/ooxml/wordprocessingml/main" w:type="character" w:styleId="Hyperlink" mc:Ignorable="w14">
+    <w:name xmlns:w="http://purl.oclc.org/ooxml/wordprocessingml/main" w:val="Hyperlink"/>
+    <w:basedOn xmlns:w="http://purl.oclc.org/ooxml/wordprocessingml/main" w:val="DefaultParagraphFont"/>
+    <w:uiPriority xmlns:w="http://purl.oclc.org/ooxml/wordprocessingml/main" w:val="99"/>
+    <w:unhideWhenUsed xmlns:w="http://purl.oclc.org/ooxml/wordprocessingml/main"/>
+    <w:rPr xmlns:w="http://purl.oclc.org/ooxml/wordprocessingml/main">
+      <w:color w:val="0563C1" w:themeColor="hyperlink"/>
+      <w:u w:val="single"/>
+    </w:rPr>
+  </w:style>
 </w:styles>
 </file>
 
 <file path=word/theme/theme1.xml><?xml version="1.0" encoding="utf-8"?>
-<a:theme xmlns:a="http://purl.oclc.org/ooxml/drawingml/main" name="Office Theme">
+<a:theme xmlns:a="http://purl.oclc.org/ooxml/drawingml/main" xmlns:thm15="http://schemas.microsoft.com/office/thememl/2012/main" name="Office Theme">
   <a:themeElements>
     <a:clrScheme name="Office">
       <a:dk1>

</xml_diff>